<commit_message>
added a changes in payment receipt
</commit_message>
<xml_diff>
--- a/PaymentReceipt.docx
+++ b/PaymentReceipt.docx
@@ -9,12 +9,12 @@
         <w:tblW w:w="10773" w:type="dxa"/>
         <w:tblInd w:w="-567" w:type="dxa"/>
         <w:tblBorders>
-          <w:top w:val="none" w:color="auto" w:sz="0" w:space="0"/>
-          <w:left w:val="none" w:color="auto" w:sz="0" w:space="0"/>
-          <w:bottom w:val="none" w:color="auto" w:sz="0" w:space="0"/>
-          <w:right w:val="none" w:color="auto" w:sz="0" w:space="0"/>
-          <w:insideH w:val="none" w:color="auto" w:sz="0" w:space="0"/>
-          <w:insideV w:val="none" w:color="auto" w:sz="0" w:space="0"/>
+          <w:top w:val="none" w:sz="0" w:space="0" w:color="auto"/>
+          <w:left w:val="none" w:sz="0" w:space="0" w:color="auto"/>
+          <w:bottom w:val="none" w:sz="0" w:space="0" w:color="auto"/>
+          <w:right w:val="none" w:sz="0" w:space="0" w:color="auto"/>
+          <w:insideH w:val="none" w:sz="0" w:space="0" w:color="auto"/>
+          <w:insideV w:val="none" w:sz="0" w:space="0" w:color="auto"/>
         </w:tblBorders>
         <w:tblLook w:val="04A0" w:firstRow="1" w:lastRow="0" w:firstColumn="1" w:lastColumn="0" w:noHBand="0" w:noVBand="1"/>
       </w:tblPr>
@@ -68,16 +68,7 @@
                 <w:sz w:val="24"/>
                 <w:szCs w:val="24"/>
               </w:rPr>
-              <w:t>Receipt</w:t>
-            </w:r>
-            <w:r>
-              <w:rPr>
-                <w:b/>
-                <w:bCs/>
-                <w:sz w:val="24"/>
-                <w:szCs w:val="24"/>
-              </w:rPr>
-              <w:t xml:space="preserve"> To</w:t>
+              <w:t>Receipt To</w:t>
             </w:r>
             <w:r>
               <w:rPr>
@@ -94,14 +85,14 @@
               <w:sz w:val="24"/>
               <w:szCs w:val="24"/>
             </w:rPr>
+            <w:alias w:val="#Nav: /GenJournalLine/CompanyName"/>
+            <w:tag w:val="#Nav: PaymentReceipt/50112"/>
             <w:id w:val="-410081204"/>
             <w:placeholder>
               <w:docPart w:val="DefaultPlaceholder_-1854013440"/>
             </w:placeholder>
             <w:dataBinding w:prefixMappings="xmlns:ns0='urn:microsoft-dynamics-nav/reports/PaymentReceipt/50112/'" w:xpath="/ns0:NavWordReportXmlPart[1]/ns0:GenJournalLine[1]/ns0:CompanyName[1]" w:storeItemID="{072A5C88-FD1B-4274-ACD9-2C46D19524E4}"/>
             <w:text/>
-            <w:alias w:val="#Nav: /GenJournalLine/CompanyName"/>
-            <w:tag w:val="#Nav: PaymentReceipt/50112"/>
           </w:sdtPr>
           <w:sdtContent>
             <w:tc>
@@ -133,26 +124,38 @@
         </w:sdt>
       </w:tr>
       <w:tr>
-        <w:tc>
-          <w:tcPr>
-            <w:tcW w:w="4815" w:type="dxa"/>
-          </w:tcPr>
-          <w:p>
-            <w:r>
-              <w:t>Customer name</w:t>
-            </w:r>
-          </w:p>
-        </w:tc>
         <w:sdt>
           <w:sdtPr>
+            <w:id w:val="1654803375"/>
+            <w:placeholder>
+              <w:docPart w:val="DefaultPlaceholder_-1854013440"/>
+            </w:placeholder>
+            <w:dataBinding w:prefixMappings="xmlns:ns0='urn:microsoft-dynamics-nav/reports/PaymentReceipt/50112/' " w:xpath="/ns0:NavWordReportXmlPart[1]/ns0:GenJournalLine[1]/ns0:Description[1]" w:storeItemID="{072A5C88-FD1B-4274-ACD9-2C46D19524E4}"/>
+            <w:text/>
+          </w:sdtPr>
+          <w:sdtContent>
+            <w:tc>
+              <w:tcPr>
+                <w:tcW w:w="4815" w:type="dxa"/>
+              </w:tcPr>
+              <w:p>
+                <w:r>
+                  <w:t>Description</w:t>
+                </w:r>
+              </w:p>
+            </w:tc>
+          </w:sdtContent>
+        </w:sdt>
+        <w:sdt>
+          <w:sdtPr>
+            <w:alias w:val="#Nav: /GenJournalLine/CompanyAddress"/>
+            <w:tag w:val="#Nav: PaymentReceipt/50112"/>
             <w:id w:val="363416257"/>
             <w:placeholder>
               <w:docPart w:val="DefaultPlaceholder_-1854013440"/>
             </w:placeholder>
             <w:dataBinding w:prefixMappings="xmlns:ns0='urn:microsoft-dynamics-nav/reports/PaymentReceipt/50112/'" w:xpath="/ns0:NavWordReportXmlPart[1]/ns0:GenJournalLine[1]/ns0:CompanyAddress[1]" w:storeItemID="{072A5C88-FD1B-4274-ACD9-2C46D19524E4}"/>
             <w:text/>
-            <w:alias w:val="#Nav: /GenJournalLine/CompanyAddress"/>
-            <w:tag w:val="#Nav: PaymentReceipt/50112"/>
           </w:sdtPr>
           <w:sdtContent>
             <w:tc>
@@ -174,16 +177,28 @@
         </w:sdt>
       </w:tr>
       <w:tr>
-        <w:tc>
-          <w:tcPr>
-            <w:tcW w:w="4815" w:type="dxa"/>
-          </w:tcPr>
-          <w:p>
-            <w:r>
-              <w:t>Customer Address</w:t>
-            </w:r>
-          </w:p>
-        </w:tc>
+        <w:sdt>
+          <w:sdtPr>
+            <w:id w:val="-996258057"/>
+            <w:placeholder>
+              <w:docPart w:val="DefaultPlaceholder_-1854013440"/>
+            </w:placeholder>
+            <w:dataBinding w:prefixMappings="xmlns:ns0='urn:microsoft-dynamics-nav/reports/PaymentReceipt/50112/' " w:xpath="/ns0:NavWordReportXmlPart[1]/ns0:GenJournalLine[1]/ns0:Customer[1]/ns0:Address[1]" w:storeItemID="{072A5C88-FD1B-4274-ACD9-2C46D19524E4}"/>
+            <w:text/>
+          </w:sdtPr>
+          <w:sdtContent>
+            <w:tc>
+              <w:tcPr>
+                <w:tcW w:w="4815" w:type="dxa"/>
+              </w:tcPr>
+              <w:p>
+                <w:r>
+                  <w:t>Address</w:t>
+                </w:r>
+              </w:p>
+            </w:tc>
+          </w:sdtContent>
+        </w:sdt>
         <w:tc>
           <w:tcPr>
             <w:tcW w:w="5958" w:type="dxa"/>
@@ -197,32 +212,32 @@
             </w:pPr>
             <w:sdt>
               <w:sdtPr>
+                <w:alias w:val="#Nav: /GenJournalLine/CompanyCity"/>
+                <w:tag w:val="#Nav: PaymentReceipt/50112"/>
                 <w:id w:val="1593743662"/>
                 <w:placeholder>
                   <w:docPart w:val="DefaultPlaceholder_-1854013440"/>
                 </w:placeholder>
                 <w:dataBinding w:prefixMappings="xmlns:ns0='urn:microsoft-dynamics-nav/reports/PaymentReceipt/50112/'" w:xpath="/ns0:NavWordReportXmlPart[1]/ns0:GenJournalLine[1]/ns0:CompanyCity[1]" w:storeItemID="{072A5C88-FD1B-4274-ACD9-2C46D19524E4}"/>
                 <w:text/>
-                <w:alias w:val="#Nav: /GenJournalLine/CompanyCity"/>
-                <w:tag w:val="#Nav: PaymentReceipt/50112"/>
               </w:sdtPr>
               <w:sdtContent>
                 <w:proofErr w:type="spellStart"/>
                 <w:r>
-                  <w:t>CompanyCity,</w:t>
+                  <w:t>CompanyCity</w:t>
                 </w:r>
               </w:sdtContent>
             </w:sdt>
             <w:sdt>
               <w:sdtPr>
+                <w:alias w:val="#Nav: /GenJournalLine/CompanyPostcode"/>
+                <w:tag w:val="#Nav: PaymentReceipt/50112"/>
                 <w:id w:val="1065383304"/>
                 <w:placeholder>
                   <w:docPart w:val="DefaultPlaceholder_-1854013440"/>
                 </w:placeholder>
                 <w:dataBinding w:prefixMappings="xmlns:ns0='urn:microsoft-dynamics-nav/reports/PaymentReceipt/50112/'" w:xpath="/ns0:NavWordReportXmlPart[1]/ns0:GenJournalLine[1]/ns0:CompanyPostcode[1]" w:storeItemID="{072A5C88-FD1B-4274-ACD9-2C46D19524E4}"/>
                 <w:text/>
-                <w:alias w:val="#Nav: /GenJournalLine/CompanyPostcode"/>
-                <w:tag w:val="#Nav: PaymentReceipt/50112"/>
               </w:sdtPr>
               <w:sdtContent>
                 <w:r>
@@ -235,14 +250,14 @@
             </w:r>
             <w:sdt>
               <w:sdtPr>
+                <w:alias w:val="#Nav: /GenJournalLine/CompanyCountry"/>
+                <w:tag w:val="#Nav: PaymentReceipt/50112"/>
                 <w:id w:val="973950810"/>
                 <w:placeholder>
                   <w:docPart w:val="DefaultPlaceholder_-1854013440"/>
                 </w:placeholder>
                 <w:dataBinding w:prefixMappings="xmlns:ns0='urn:microsoft-dynamics-nav/reports/PaymentReceipt/50112/'" w:xpath="/ns0:NavWordReportXmlPart[1]/ns0:GenJournalLine[1]/ns0:CompanyCountry[1]" w:storeItemID="{072A5C88-FD1B-4274-ACD9-2C46D19524E4}"/>
                 <w:text/>
-                <w:alias w:val="#Nav: /GenJournalLine/CompanyCountry"/>
-                <w:tag w:val="#Nav: PaymentReceipt/50112"/>
               </w:sdtPr>
               <w:sdtContent>
                 <w:r>
@@ -263,6 +278,26 @@
             <w:r>
               <w:t xml:space="preserve">Tel: </w:t>
             </w:r>
+            <w:sdt>
+              <w:sdtPr>
+                <w:id w:val="1264952277"/>
+                <w:placeholder>
+                  <w:docPart w:val="DefaultPlaceholder_-1854013440"/>
+                </w:placeholder>
+                <w:dataBinding w:prefixMappings="xmlns:ns0='urn:microsoft-dynamics-nav/reports/PaymentReceipt/50112/' " w:xpath="/ns0:NavWordReportXmlPart[1]/ns0:GenJournalLine[1]/ns0:Customer[1]/ns0:Phone_No_[1]" w:storeItemID="{072A5C88-FD1B-4274-ACD9-2C46D19524E4}"/>
+                <w:text/>
+              </w:sdtPr>
+              <w:sdtContent>
+                <w:proofErr w:type="spellStart"/>
+                <w:r>
+                  <w:t>Phone_No</w:t>
+                </w:r>
+                <w:proofErr w:type="spellEnd"/>
+                <w:r>
+                  <w:t>_</w:t>
+                </w:r>
+              </w:sdtContent>
+            </w:sdt>
           </w:p>
         </w:tc>
         <w:tc>
@@ -281,14 +316,14 @@
             </w:r>
             <w:sdt>
               <w:sdtPr>
+                <w:alias w:val="#Nav: /GenJournalLine/CompanyPhone"/>
+                <w:tag w:val="#Nav: PaymentReceipt/50112"/>
                 <w:id w:val="-1275630377"/>
                 <w:placeholder>
                   <w:docPart w:val="DefaultPlaceholder_-1854013440"/>
                 </w:placeholder>
                 <w:dataBinding w:prefixMappings="xmlns:ns0='urn:microsoft-dynamics-nav/reports/PaymentReceipt/50112/'" w:xpath="/ns0:NavWordReportXmlPart[1]/ns0:GenJournalLine[1]/ns0:CompanyPhone[1]" w:storeItemID="{072A5C88-FD1B-4274-ACD9-2C46D19524E4}"/>
                 <w:text/>
-                <w:alias w:val="#Nav: /GenJournalLine/CompanyPhone"/>
-                <w:tag w:val="#Nav: PaymentReceipt/50112"/>
               </w:sdtPr>
               <w:sdtContent>
                 <w:proofErr w:type="spellStart"/>
@@ -310,6 +345,23 @@
             <w:r>
               <w:t xml:space="preserve">E-mail: </w:t>
             </w:r>
+            <w:sdt>
+              <w:sdtPr>
+                <w:id w:val="-102104966"/>
+                <w:placeholder>
+                  <w:docPart w:val="DefaultPlaceholder_-1854013440"/>
+                </w:placeholder>
+                <w:dataBinding w:prefixMappings="xmlns:ns0='urn:microsoft-dynamics-nav/reports/PaymentReceipt/50112/' " w:xpath="/ns0:NavWordReportXmlPart[1]/ns0:GenJournalLine[1]/ns0:Customer[1]/ns0:E_Mail[1]" w:storeItemID="{072A5C88-FD1B-4274-ACD9-2C46D19524E4}"/>
+                <w:text/>
+              </w:sdtPr>
+              <w:sdtContent>
+                <w:proofErr w:type="spellStart"/>
+                <w:r>
+                  <w:t>E_Mail</w:t>
+                </w:r>
+                <w:proofErr w:type="spellEnd"/>
+              </w:sdtContent>
+            </w:sdt>
           </w:p>
         </w:tc>
         <w:tc>
@@ -328,14 +380,14 @@
             </w:r>
             <w:sdt>
               <w:sdtPr>
+                <w:alias w:val="#Nav: /GenJournalLine/CompanyEmail"/>
+                <w:tag w:val="#Nav: PaymentReceipt/50112"/>
                 <w:id w:val="-1465114048"/>
                 <w:placeholder>
                   <w:docPart w:val="DefaultPlaceholder_-1854013440"/>
                 </w:placeholder>
                 <w:dataBinding w:prefixMappings="xmlns:ns0='urn:microsoft-dynamics-nav/reports/PaymentReceipt/50112/'" w:xpath="/ns0:NavWordReportXmlPart[1]/ns0:GenJournalLine[1]/ns0:CompanyEmail[1]" w:storeItemID="{072A5C88-FD1B-4274-ACD9-2C46D19524E4}"/>
                 <w:text/>
-                <w:alias w:val="#Nav: /GenJournalLine/CompanyEmail"/>
-                <w:tag w:val="#Nav: PaymentReceipt/50112"/>
               </w:sdtPr>
               <w:sdtContent>
                 <w:proofErr w:type="spellStart"/>
@@ -395,16 +447,33 @@
         </w:tc>
       </w:tr>
       <w:tr>
-        <w:tc>
-          <w:tcPr>
-            <w:tcW w:w="4815" w:type="dxa"/>
-          </w:tcPr>
-          <w:p>
-            <w:r>
-              <w:t>Receipt No</w:t>
-            </w:r>
-          </w:p>
-        </w:tc>
+        <w:sdt>
+          <w:sdtPr>
+            <w:id w:val="634057254"/>
+            <w:placeholder>
+              <w:docPart w:val="DefaultPlaceholder_-1854013440"/>
+            </w:placeholder>
+            <w:dataBinding w:prefixMappings="xmlns:ns0='urn:microsoft-dynamics-nav/reports/PaymentReceipt/50112/' " w:xpath="/ns0:NavWordReportXmlPart[1]/ns0:GenJournalLine[1]/ns0:Document_No_[1]" w:storeItemID="{072A5C88-FD1B-4274-ACD9-2C46D19524E4}"/>
+            <w:text/>
+          </w:sdtPr>
+          <w:sdtContent>
+            <w:tc>
+              <w:tcPr>
+                <w:tcW w:w="4815" w:type="dxa"/>
+              </w:tcPr>
+              <w:p>
+                <w:proofErr w:type="spellStart"/>
+                <w:r>
+                  <w:t>Document_No</w:t>
+                </w:r>
+                <w:proofErr w:type="spellEnd"/>
+                <w:r>
+                  <w:t>_</w:t>
+                </w:r>
+              </w:p>
+            </w:tc>
+          </w:sdtContent>
+        </w:sdt>
         <w:tc>
           <w:tcPr>
             <w:tcW w:w="5958" w:type="dxa"/>
@@ -429,16 +498,30 @@
         </w:tc>
       </w:tr>
       <w:tr>
-        <w:tc>
-          <w:tcPr>
-            <w:tcW w:w="4815" w:type="dxa"/>
-          </w:tcPr>
-          <w:p>
-            <w:r>
-              <w:t>Invoice No</w:t>
-            </w:r>
-          </w:p>
-        </w:tc>
+        <w:sdt>
+          <w:sdtPr>
+            <w:id w:val="-736398953"/>
+            <w:placeholder>
+              <w:docPart w:val="DefaultPlaceholder_-1854013440"/>
+            </w:placeholder>
+            <w:dataBinding w:prefixMappings="xmlns:ns0='urn:microsoft-dynamics-nav/reports/PaymentReceipt/50112/' " w:xpath="/ns0:NavWordReportXmlPart[1]/ns0:GenJournalLine[1]/ns0:ApptoDocNo[1]" w:storeItemID="{072A5C88-FD1B-4274-ACD9-2C46D19524E4}"/>
+            <w:text/>
+          </w:sdtPr>
+          <w:sdtContent>
+            <w:tc>
+              <w:tcPr>
+                <w:tcW w:w="4815" w:type="dxa"/>
+              </w:tcPr>
+              <w:p>
+                <w:proofErr w:type="spellStart"/>
+                <w:r>
+                  <w:t>ApptoDocNo</w:t>
+                </w:r>
+                <w:proofErr w:type="spellEnd"/>
+              </w:p>
+            </w:tc>
+          </w:sdtContent>
+        </w:sdt>
         <w:tc>
           <w:tcPr>
             <w:tcW w:w="5958" w:type="dxa"/>
@@ -450,23 +533,34 @@
               </w:tabs>
               <w:jc w:val="right"/>
             </w:pPr>
-            <w:r>
-              <w:t>Account Name</w:t>
-            </w:r>
           </w:p>
         </w:tc>
       </w:tr>
       <w:tr>
-        <w:tc>
-          <w:tcPr>
-            <w:tcW w:w="4815" w:type="dxa"/>
-          </w:tcPr>
-          <w:p>
-            <w:r>
-              <w:t>Current date</w:t>
-            </w:r>
-          </w:p>
-        </w:tc>
+        <w:sdt>
+          <w:sdtPr>
+            <w:id w:val="4488037"/>
+            <w:placeholder>
+              <w:docPart w:val="DefaultPlaceholder_-1854013440"/>
+            </w:placeholder>
+            <w:dataBinding w:prefixMappings="xmlns:ns0='urn:microsoft-dynamics-nav/reports/PaymentReceipt/50112/' " w:xpath="/ns0:NavWordReportXmlPart[1]/ns0:GenJournalLine[1]/ns0:CurrentDate[1]" w:storeItemID="{072A5C88-FD1B-4274-ACD9-2C46D19524E4}"/>
+            <w:text/>
+          </w:sdtPr>
+          <w:sdtContent>
+            <w:tc>
+              <w:tcPr>
+                <w:tcW w:w="4815" w:type="dxa"/>
+              </w:tcPr>
+              <w:p>
+                <w:proofErr w:type="spellStart"/>
+                <w:r>
+                  <w:t>CurrentDate</w:t>
+                </w:r>
+                <w:proofErr w:type="spellEnd"/>
+              </w:p>
+            </w:tc>
+          </w:sdtContent>
+        </w:sdt>
         <w:tc>
           <w:tcPr>
             <w:tcW w:w="5958" w:type="dxa"/>
@@ -478,23 +572,34 @@
               </w:tabs>
               <w:jc w:val="right"/>
             </w:pPr>
-            <w:r>
-              <w:t>Account Number</w:t>
-            </w:r>
           </w:p>
         </w:tc>
       </w:tr>
       <w:tr>
-        <w:tc>
-          <w:tcPr>
-            <w:tcW w:w="4815" w:type="dxa"/>
-          </w:tcPr>
-          <w:p>
-            <w:r>
-              <w:t>Invoice Posting Date</w:t>
-            </w:r>
-          </w:p>
-        </w:tc>
+        <w:sdt>
+          <w:sdtPr>
+            <w:id w:val="1446036124"/>
+            <w:placeholder>
+              <w:docPart w:val="DefaultPlaceholder_-1854013440"/>
+            </w:placeholder>
+            <w:dataBinding w:prefixMappings="xmlns:ns0='urn:microsoft-dynamics-nav/reports/PaymentReceipt/50112/' " w:xpath="/ns0:NavWordReportXmlPart[1]/ns0:GenJournalLine[1]/ns0:Sales_Invoice_Header[1]/ns0:Posting_Date_sales[1]" w:storeItemID="{072A5C88-FD1B-4274-ACD9-2C46D19524E4}"/>
+            <w:text/>
+          </w:sdtPr>
+          <w:sdtContent>
+            <w:tc>
+              <w:tcPr>
+                <w:tcW w:w="4815" w:type="dxa"/>
+              </w:tcPr>
+              <w:p>
+                <w:proofErr w:type="spellStart"/>
+                <w:r>
+                  <w:t>Posting_Date_sales</w:t>
+                </w:r>
+                <w:proofErr w:type="spellEnd"/>
+              </w:p>
+            </w:tc>
+          </w:sdtContent>
+        </w:sdt>
         <w:tc>
           <w:tcPr>
             <w:tcW w:w="5958" w:type="dxa"/>
@@ -519,14 +624,14 @@
         <w:tblLook w:val="04A0" w:firstRow="1" w:lastRow="0" w:firstColumn="1" w:lastColumn="0" w:noHBand="0" w:noVBand="1"/>
       </w:tblPr>
       <w:tblGrid>
-        <w:gridCol w:w="1272"/>
-        <w:gridCol w:w="1555"/>
-        <w:gridCol w:w="1340"/>
-        <w:gridCol w:w="2070"/>
-        <w:gridCol w:w="1134"/>
-        <w:gridCol w:w="1134"/>
-        <w:gridCol w:w="1134"/>
-        <w:gridCol w:w="1134"/>
+        <w:gridCol w:w="1289"/>
+        <w:gridCol w:w="1554"/>
+        <w:gridCol w:w="1339"/>
+        <w:gridCol w:w="2064"/>
+        <w:gridCol w:w="1133"/>
+        <w:gridCol w:w="1133"/>
+        <w:gridCol w:w="1131"/>
+        <w:gridCol w:w="1130"/>
       </w:tblGrid>
       <w:tr>
         <w:tc>
@@ -589,7 +694,7 @@
             <w:tcBorders>
               <w:top w:val="nil"/>
               <w:left w:val="nil"/>
-              <w:bottom w:val="single" w:color="auto" w:sz="12" w:space="0"/>
+              <w:bottom w:val="single" w:sz="12" w:space="0" w:color="auto"/>
               <w:right w:val="nil"/>
             </w:tcBorders>
           </w:tcPr>
@@ -615,7 +720,7 @@
             <w:tcBorders>
               <w:top w:val="nil"/>
               <w:left w:val="nil"/>
-              <w:bottom w:val="single" w:color="auto" w:sz="12" w:space="0"/>
+              <w:bottom w:val="single" w:sz="12" w:space="0" w:color="auto"/>
               <w:right w:val="nil"/>
             </w:tcBorders>
           </w:tcPr>
@@ -641,7 +746,7 @@
             <w:tcBorders>
               <w:top w:val="nil"/>
               <w:left w:val="nil"/>
-              <w:bottom w:val="single" w:color="auto" w:sz="12" w:space="0"/>
+              <w:bottom w:val="single" w:sz="12" w:space="0" w:color="auto"/>
               <w:right w:val="nil"/>
             </w:tcBorders>
           </w:tcPr>
@@ -667,7 +772,7 @@
             <w:tcBorders>
               <w:top w:val="nil"/>
               <w:left w:val="nil"/>
-              <w:bottom w:val="single" w:color="auto" w:sz="12" w:space="0"/>
+              <w:bottom w:val="single" w:sz="12" w:space="0" w:color="auto"/>
               <w:right w:val="nil"/>
             </w:tcBorders>
           </w:tcPr>
@@ -694,7 +799,7 @@
             <w:tcBorders>
               <w:top w:val="nil"/>
               <w:left w:val="nil"/>
-              <w:bottom w:val="single" w:color="auto" w:sz="12" w:space="0"/>
+              <w:bottom w:val="single" w:sz="12" w:space="0" w:color="auto"/>
               <w:right w:val="nil"/>
             </w:tcBorders>
           </w:tcPr>
@@ -720,7 +825,7 @@
             <w:tcBorders>
               <w:top w:val="nil"/>
               <w:left w:val="nil"/>
-              <w:bottom w:val="single" w:color="auto" w:sz="12" w:space="0"/>
+              <w:bottom w:val="single" w:sz="12" w:space="0" w:color="auto"/>
               <w:right w:val="nil"/>
             </w:tcBorders>
           </w:tcPr>
@@ -748,7 +853,7 @@
             <w:tcBorders>
               <w:top w:val="nil"/>
               <w:left w:val="nil"/>
-              <w:bottom w:val="single" w:color="auto" w:sz="12" w:space="0"/>
+              <w:bottom w:val="single" w:sz="12" w:space="0" w:color="auto"/>
               <w:right w:val="nil"/>
             </w:tcBorders>
           </w:tcPr>
@@ -775,7 +880,7 @@
             <w:tcBorders>
               <w:top w:val="nil"/>
               <w:left w:val="nil"/>
-              <w:bottom w:val="single" w:color="auto" w:sz="12" w:space="0"/>
+              <w:bottom w:val="single" w:sz="12" w:space="0" w:color="auto"/>
               <w:right w:val="nil"/>
             </w:tcBorders>
           </w:tcPr>
@@ -817,11 +922,146 @@
         <w:trPr>
           <w:trHeight w:val="539"/>
         </w:trPr>
-        <w:tc>
-          <w:tcPr>
-            <w:tcW w:w="1272" w:type="dxa"/>
+        <w:sdt>
+          <w:sdtPr>
+            <w:rPr>
+              <w:sz w:val="20"/>
+              <w:szCs w:val="20"/>
+            </w:rPr>
+            <w:id w:val="1507392582"/>
+            <w:placeholder>
+              <w:docPart w:val="DefaultPlaceholder_-1854013440"/>
+            </w:placeholder>
+            <w:dataBinding w:prefixMappings="xmlns:ns0='urn:microsoft-dynamics-nav/reports/PaymentReceipt/50112/' " w:xpath="/ns0:NavWordReportXmlPart[1]/ns0:GenJournalLine[1]/ns0:Posting_Date[1]" w:storeItemID="{072A5C88-FD1B-4274-ACD9-2C46D19524E4}"/>
+            <w:text/>
+          </w:sdtPr>
+          <w:sdtContent>
+            <w:tc>
+              <w:tcPr>
+                <w:tcW w:w="1272" w:type="dxa"/>
+                <w:tcBorders>
+                  <w:top w:val="single" w:sz="12" w:space="0" w:color="auto"/>
+                  <w:left w:val="nil"/>
+                  <w:bottom w:val="nil"/>
+                  <w:right w:val="nil"/>
+                </w:tcBorders>
+              </w:tcPr>
+              <w:p>
+                <w:pPr>
+                  <w:spacing w:before="120"/>
+                  <w:rPr>
+                    <w:sz w:val="20"/>
+                    <w:szCs w:val="20"/>
+                  </w:rPr>
+                </w:pPr>
+                <w:proofErr w:type="spellStart"/>
+                <w:r>
+                  <w:rPr>
+                    <w:sz w:val="20"/>
+                    <w:szCs w:val="20"/>
+                  </w:rPr>
+                  <w:t>Posting_Date</w:t>
+                </w:r>
+                <w:proofErr w:type="spellEnd"/>
+              </w:p>
+            </w:tc>
+          </w:sdtContent>
+        </w:sdt>
+        <w:sdt>
+          <w:sdtPr>
+            <w:rPr>
+              <w:sz w:val="20"/>
+              <w:szCs w:val="20"/>
+            </w:rPr>
+            <w:id w:val="-271789928"/>
+            <w:placeholder>
+              <w:docPart w:val="DefaultPlaceholder_-1854013440"/>
+            </w:placeholder>
+            <w:dataBinding w:prefixMappings="xmlns:ns0='urn:microsoft-dynamics-nav/reports/PaymentReceipt/50112/' " w:xpath="/ns0:NavWordReportXmlPart[1]/ns0:GenJournalLine[1]/ns0:ApptoDocType[1]" w:storeItemID="{072A5C88-FD1B-4274-ACD9-2C46D19524E4}"/>
+            <w:text/>
+          </w:sdtPr>
+          <w:sdtContent>
+            <w:tc>
+              <w:tcPr>
+                <w:tcW w:w="1555" w:type="dxa"/>
+                <w:tcBorders>
+                  <w:top w:val="single" w:sz="12" w:space="0" w:color="auto"/>
+                  <w:left w:val="nil"/>
+                  <w:bottom w:val="nil"/>
+                  <w:right w:val="nil"/>
+                </w:tcBorders>
+              </w:tcPr>
+              <w:p>
+                <w:pPr>
+                  <w:spacing w:before="120"/>
+                  <w:rPr>
+                    <w:sz w:val="20"/>
+                    <w:szCs w:val="20"/>
+                  </w:rPr>
+                </w:pPr>
+                <w:proofErr w:type="spellStart"/>
+                <w:r>
+                  <w:rPr>
+                    <w:sz w:val="20"/>
+                    <w:szCs w:val="20"/>
+                  </w:rPr>
+                  <w:t>ApptoDocType</w:t>
+                </w:r>
+                <w:proofErr w:type="spellEnd"/>
+              </w:p>
+            </w:tc>
+          </w:sdtContent>
+        </w:sdt>
+        <w:sdt>
+          <w:sdtPr>
+            <w:rPr>
+              <w:sz w:val="20"/>
+              <w:szCs w:val="20"/>
+            </w:rPr>
+            <w:id w:val="-289591888"/>
+            <w:placeholder>
+              <w:docPart w:val="DefaultPlaceholder_-1854013440"/>
+            </w:placeholder>
+            <w:dataBinding w:prefixMappings="xmlns:ns0='urn:microsoft-dynamics-nav/reports/PaymentReceipt/50112/' " w:xpath="/ns0:NavWordReportXmlPart[1]/ns0:GenJournalLine[1]/ns0:ApptoDocNo[1]" w:storeItemID="{072A5C88-FD1B-4274-ACD9-2C46D19524E4}"/>
+            <w:text/>
+          </w:sdtPr>
+          <w:sdtContent>
+            <w:tc>
+              <w:tcPr>
+                <w:tcW w:w="1340" w:type="dxa"/>
+                <w:tcBorders>
+                  <w:top w:val="single" w:sz="12" w:space="0" w:color="auto"/>
+                  <w:left w:val="nil"/>
+                  <w:bottom w:val="nil"/>
+                  <w:right w:val="nil"/>
+                </w:tcBorders>
+              </w:tcPr>
+              <w:p>
+                <w:pPr>
+                  <w:spacing w:before="120"/>
+                  <w:rPr>
+                    <w:sz w:val="20"/>
+                    <w:szCs w:val="20"/>
+                  </w:rPr>
+                </w:pPr>
+                <w:proofErr w:type="spellStart"/>
+                <w:r>
+                  <w:rPr>
+                    <w:sz w:val="20"/>
+                    <w:szCs w:val="20"/>
+                  </w:rPr>
+                  <w:t>ApptoDocNo</w:t>
+                </w:r>
+                <w:proofErr w:type="spellEnd"/>
+              </w:p>
+            </w:tc>
+          </w:sdtContent>
+        </w:sdt>
+        <w:tc>
+          <w:tcPr>
+            <w:tcW w:w="2070" w:type="dxa"/>
             <w:tcBorders>
-              <w:top w:val="single" w:color="auto" w:sz="12" w:space="0"/>
+              <w:top w:val="single" w:sz="12" w:space="0" w:color="auto"/>
               <w:left w:val="nil"/>
               <w:bottom w:val="nil"/>
               <w:right w:val="nil"/>
@@ -835,20 +1075,13 @@
                 <w:szCs w:val="20"/>
               </w:rPr>
             </w:pPr>
-            <w:r>
-              <w:rPr>
-                <w:sz w:val="20"/>
-                <w:szCs w:val="20"/>
-              </w:rPr>
-              <w:t>12/02/25</w:t>
-            </w:r>
           </w:p>
         </w:tc>
         <w:tc>
           <w:tcPr>
-            <w:tcW w:w="1555" w:type="dxa"/>
+            <w:tcW w:w="1134" w:type="dxa"/>
             <w:tcBorders>
-              <w:top w:val="single" w:color="auto" w:sz="12" w:space="0"/>
+              <w:top w:val="single" w:sz="12" w:space="0" w:color="auto"/>
               <w:left w:val="nil"/>
               <w:bottom w:val="nil"/>
               <w:right w:val="nil"/>
@@ -867,15 +1100,59 @@
                 <w:sz w:val="20"/>
                 <w:szCs w:val="20"/>
               </w:rPr>
-              <w:t>Invoice</w:t>
+              <w:t>AED</w:t>
             </w:r>
           </w:p>
         </w:tc>
-        <w:tc>
-          <w:tcPr>
-            <w:tcW w:w="1340" w:type="dxa"/>
+        <w:sdt>
+          <w:sdtPr>
+            <w:rPr>
+              <w:sz w:val="20"/>
+              <w:szCs w:val="20"/>
+            </w:rPr>
+            <w:id w:val="1888225831"/>
+            <w:placeholder>
+              <w:docPart w:val="DefaultPlaceholder_-1854013440"/>
+            </w:placeholder>
+            <w:dataBinding w:prefixMappings="xmlns:ns0='urn:microsoft-dynamics-nav/reports/PaymentReceipt/50112/' " w:xpath="/ns0:NavWordReportXmlPart[1]/ns0:GenJournalLine[1]/ns0:Amount[1]" w:storeItemID="{072A5C88-FD1B-4274-ACD9-2C46D19524E4}"/>
+            <w:text/>
+          </w:sdtPr>
+          <w:sdtContent>
+            <w:tc>
+              <w:tcPr>
+                <w:tcW w:w="1134" w:type="dxa"/>
+                <w:tcBorders>
+                  <w:top w:val="single" w:sz="12" w:space="0" w:color="auto"/>
+                  <w:left w:val="nil"/>
+                  <w:bottom w:val="single" w:sz="12" w:space="0" w:color="auto"/>
+                  <w:right w:val="nil"/>
+                </w:tcBorders>
+              </w:tcPr>
+              <w:p>
+                <w:pPr>
+                  <w:spacing w:before="120"/>
+                  <w:jc w:val="right"/>
+                  <w:rPr>
+                    <w:sz w:val="20"/>
+                    <w:szCs w:val="20"/>
+                  </w:rPr>
+                </w:pPr>
+                <w:r>
+                  <w:rPr>
+                    <w:sz w:val="20"/>
+                    <w:szCs w:val="20"/>
+                  </w:rPr>
+                  <w:t>Amount</w:t>
+                </w:r>
+              </w:p>
+            </w:tc>
+          </w:sdtContent>
+        </w:sdt>
+        <w:tc>
+          <w:tcPr>
+            <w:tcW w:w="1134" w:type="dxa"/>
             <w:tcBorders>
-              <w:top w:val="single" w:color="auto" w:sz="12" w:space="0"/>
+              <w:top w:val="single" w:sz="12" w:space="0" w:color="auto"/>
               <w:left w:val="nil"/>
               <w:bottom w:val="nil"/>
               <w:right w:val="nil"/>
@@ -884,115 +1161,6 @@
           <w:p>
             <w:pPr>
               <w:spacing w:before="120"/>
-              <w:rPr>
-                <w:sz w:val="20"/>
-                <w:szCs w:val="20"/>
-              </w:rPr>
-            </w:pPr>
-            <w:r>
-              <w:rPr>
-                <w:sz w:val="20"/>
-                <w:szCs w:val="20"/>
-              </w:rPr>
-              <w:t>PSINV-0001</w:t>
-            </w:r>
-          </w:p>
-        </w:tc>
-        <w:tc>
-          <w:tcPr>
-            <w:tcW w:w="2070" w:type="dxa"/>
-            <w:tcBorders>
-              <w:top w:val="single" w:color="auto" w:sz="12" w:space="0"/>
-              <w:left w:val="nil"/>
-              <w:bottom w:val="nil"/>
-              <w:right w:val="nil"/>
-            </w:tcBorders>
-          </w:tcPr>
-          <w:p>
-            <w:pPr>
-              <w:spacing w:before="120"/>
-              <w:rPr>
-                <w:sz w:val="20"/>
-                <w:szCs w:val="20"/>
-              </w:rPr>
-            </w:pPr>
-            <w:r>
-              <w:rPr>
-                <w:sz w:val="20"/>
-                <w:szCs w:val="20"/>
-              </w:rPr>
-              <w:t>Invoice SINV-00282</w:t>
-            </w:r>
-          </w:p>
-        </w:tc>
-        <w:tc>
-          <w:tcPr>
-            <w:tcW w:w="1134" w:type="dxa"/>
-            <w:tcBorders>
-              <w:top w:val="single" w:color="auto" w:sz="12" w:space="0"/>
-              <w:left w:val="nil"/>
-              <w:bottom w:val="nil"/>
-              <w:right w:val="nil"/>
-            </w:tcBorders>
-          </w:tcPr>
-          <w:p>
-            <w:pPr>
-              <w:spacing w:before="120"/>
-              <w:rPr>
-                <w:sz w:val="20"/>
-                <w:szCs w:val="20"/>
-              </w:rPr>
-            </w:pPr>
-            <w:r>
-              <w:rPr>
-                <w:sz w:val="20"/>
-                <w:szCs w:val="20"/>
-              </w:rPr>
-              <w:t>AED</w:t>
-            </w:r>
-          </w:p>
-        </w:tc>
-        <w:tc>
-          <w:tcPr>
-            <w:tcW w:w="1134" w:type="dxa"/>
-            <w:tcBorders>
-              <w:top w:val="single" w:color="auto" w:sz="12" w:space="0"/>
-              <w:left w:val="nil"/>
-              <w:bottom w:val="single" w:color="auto" w:sz="12" w:space="0"/>
-              <w:right w:val="nil"/>
-            </w:tcBorders>
-          </w:tcPr>
-          <w:p>
-            <w:pPr>
-              <w:spacing w:before="120"/>
-              <w:jc w:val="right"/>
-              <w:rPr>
-                <w:sz w:val="20"/>
-                <w:szCs w:val="20"/>
-              </w:rPr>
-            </w:pPr>
-            <w:r>
-              <w:rPr>
-                <w:sz w:val="20"/>
-                <w:szCs w:val="20"/>
-              </w:rPr>
-              <w:t>1,250.00</w:t>
-            </w:r>
-          </w:p>
-        </w:tc>
-        <w:tc>
-          <w:tcPr>
-            <w:tcW w:w="1134" w:type="dxa"/>
-            <w:tcBorders>
-              <w:top w:val="single" w:color="auto" w:sz="12" w:space="0"/>
-              <w:left w:val="nil"/>
-              <w:bottom w:val="nil"/>
-              <w:right w:val="nil"/>
-            </w:tcBorders>
-          </w:tcPr>
-          <w:p>
-            <w:pPr>
-              <w:spacing w:before="120"/>
               <w:jc w:val="right"/>
               <w:rPr>
                 <w:sz w:val="20"/>
@@ -1012,7 +1180,7 @@
           <w:tcPr>
             <w:tcW w:w="1134" w:type="dxa"/>
             <w:tcBorders>
-              <w:top w:val="single" w:color="auto" w:sz="12" w:space="0"/>
+              <w:top w:val="single" w:sz="12" w:space="0" w:color="auto"/>
               <w:left w:val="nil"/>
               <w:bottom w:val="nil"/>
               <w:right w:val="nil"/>
@@ -1097,34 +1265,50 @@
             </w:r>
           </w:p>
         </w:tc>
-        <w:tc>
-          <w:tcPr>
-            <w:tcW w:w="1134" w:type="dxa"/>
-            <w:tcBorders>
-              <w:top w:val="single" w:color="auto" w:sz="12" w:space="0"/>
-              <w:left w:val="nil"/>
-              <w:bottom w:val="nil"/>
-              <w:right w:val="nil"/>
-            </w:tcBorders>
-          </w:tcPr>
-          <w:p>
-            <w:pPr>
-              <w:spacing w:before="120"/>
-              <w:jc w:val="right"/>
-              <w:rPr>
-                <w:b/>
-                <w:bCs/>
-              </w:rPr>
-            </w:pPr>
-            <w:r>
-              <w:rPr>
-                <w:b/>
-                <w:bCs/>
-              </w:rPr>
-              <w:t>1,250.00</w:t>
-            </w:r>
-          </w:p>
-        </w:tc>
+        <w:sdt>
+          <w:sdtPr>
+            <w:rPr>
+              <w:b/>
+              <w:bCs/>
+            </w:rPr>
+            <w:id w:val="1702595389"/>
+            <w:placeholder>
+              <w:docPart w:val="DefaultPlaceholder_-1854013440"/>
+            </w:placeholder>
+            <w:dataBinding w:prefixMappings="xmlns:ns0='urn:microsoft-dynamics-nav/reports/PaymentReceipt/50112/' " w:xpath="/ns0:NavWordReportXmlPart[1]/ns0:GenJournalLine[1]/ns0:Amount[1]" w:storeItemID="{072A5C88-FD1B-4274-ACD9-2C46D19524E4}"/>
+            <w:text/>
+          </w:sdtPr>
+          <w:sdtContent>
+            <w:tc>
+              <w:tcPr>
+                <w:tcW w:w="1134" w:type="dxa"/>
+                <w:tcBorders>
+                  <w:top w:val="single" w:sz="12" w:space="0" w:color="auto"/>
+                  <w:left w:val="nil"/>
+                  <w:bottom w:val="nil"/>
+                  <w:right w:val="nil"/>
+                </w:tcBorders>
+              </w:tcPr>
+              <w:p>
+                <w:pPr>
+                  <w:spacing w:before="120"/>
+                  <w:jc w:val="right"/>
+                  <w:rPr>
+                    <w:b/>
+                    <w:bCs/>
+                  </w:rPr>
+                </w:pPr>
+                <w:r>
+                  <w:rPr>
+                    <w:b/>
+                    <w:bCs/>
+                  </w:rPr>
+                  <w:t>Amount</w:t>
+                </w:r>
+              </w:p>
+            </w:tc>
+          </w:sdtContent>
+        </w:sdt>
         <w:tc>
           <w:tcPr>
             <w:tcW w:w="2268" w:type="dxa"/>
@@ -1150,7 +1334,12 @@
     </w:tbl>
     <w:p/>
     <w:sectPr>
-      <w:headerReference w:type="default" r:id="rId8"/>
+      <w:headerReference w:type="even" r:id="rId8"/>
+      <w:headerReference w:type="default" r:id="rId9"/>
+      <w:footerReference w:type="even" r:id="rId10"/>
+      <w:footerReference w:type="default" r:id="rId11"/>
+      <w:headerReference w:type="first" r:id="rId12"/>
+      <w:footerReference w:type="first" r:id="rId13"/>
       <w:pgSz w:w="11906" w:h="16838" w:code="9"/>
       <w:pgMar w:top="1701" w:right="1134" w:bottom="1701" w:left="1134" w:header="708" w:footer="708" w:gutter="0"/>
       <w:cols w:space="708"/>
@@ -1185,6 +1374,36 @@
 </w:endnotes>
 </file>
 
+<file path=word/footer1.xml><?xml version="1.0" encoding="utf-8"?>
+<w:ftr xmlns:wpc="http://schemas.microsoft.com/office/word/2010/wordprocessingCanvas" xmlns:cx="http://schemas.microsoft.com/office/drawing/2014/chartex" xmlns:cx1="http://schemas.microsoft.com/office/drawing/2015/9/8/chartex" xmlns:cx2="http://schemas.microsoft.com/office/drawing/2015/10/21/chartex" xmlns:cx3="http://schemas.microsoft.com/office/drawing/2016/5/9/chartex" xmlns:cx4="http://schemas.microsoft.com/office/drawing/2016/5/10/chartex" xmlns:cx5="http://schemas.microsoft.com/office/drawing/2016/5/11/chartex" xmlns:cx6="http://schemas.microsoft.com/office/drawing/2016/5/12/chartex" xmlns:cx7="http://schemas.microsoft.com/office/drawing/2016/5/13/chartex" xmlns:cx8="http://schemas.microsoft.com/office/drawing/2016/5/14/chartex" xmlns:mc="http://schemas.openxmlformats.org/markup-compatibility/2006" xmlns:aink="http://schemas.microsoft.com/office/drawing/2016/ink" xmlns:am3d="http://schemas.microsoft.com/office/drawing/2017/model3d" xmlns:o="urn:schemas-microsoft-com:office:office" xmlns:oel="http://schemas.microsoft.com/office/2019/extlst" xmlns:r="http://schemas.openxmlformats.org/officeDocument/2006/relationships" xmlns:m="http://schemas.openxmlformats.org/officeDocument/2006/math" xmlns:v="urn:schemas-microsoft-com:vml" xmlns:wp14="http://schemas.microsoft.com/office/word/2010/wordprocessingDrawing" xmlns:wp="http://schemas.openxmlformats.org/drawingml/2006/wordprocessingDrawing" xmlns:w10="urn:schemas-microsoft-com:office:word" xmlns:w="http://schemas.openxmlformats.org/wordprocessingml/2006/main" xmlns:w14="http://schemas.microsoft.com/office/word/2010/wordml" xmlns:w15="http://schemas.microsoft.com/office/word/2012/wordml" xmlns:w16cex="http://schemas.microsoft.com/office/word/2018/wordml/cex" xmlns:w16cid="http://schemas.microsoft.com/office/word/2016/wordml/cid" xmlns:w16="http://schemas.microsoft.com/office/word/2018/wordml" xmlns:w16du="http://schemas.microsoft.com/office/word/2023/wordml/word16du" xmlns:w16sdtdh="http://schemas.microsoft.com/office/word/2020/wordml/sdtdatahash" xmlns:w16se="http://schemas.microsoft.com/office/word/2015/wordml/symex" xmlns:wpg="http://schemas.microsoft.com/office/word/2010/wordprocessingGroup" xmlns:wpi="http://schemas.microsoft.com/office/word/2010/wordprocessingInk" xmlns:wne="http://schemas.microsoft.com/office/word/2006/wordml" xmlns:wps="http://schemas.microsoft.com/office/word/2010/wordprocessingShape" mc:Ignorable="w14 w15 w16se w16cid w16 w16cex w16sdtdh w16du wp14">
+  <w:p>
+    <w:pPr>
+      <w:pStyle w:val="Footer"/>
+    </w:pPr>
+  </w:p>
+</w:ftr>
+</file>
+
+<file path=word/footer2.xml><?xml version="1.0" encoding="utf-8"?>
+<w:ftr xmlns:wpc="http://schemas.microsoft.com/office/word/2010/wordprocessingCanvas" xmlns:cx="http://schemas.microsoft.com/office/drawing/2014/chartex" xmlns:cx1="http://schemas.microsoft.com/office/drawing/2015/9/8/chartex" xmlns:cx2="http://schemas.microsoft.com/office/drawing/2015/10/21/chartex" xmlns:cx3="http://schemas.microsoft.com/office/drawing/2016/5/9/chartex" xmlns:cx4="http://schemas.microsoft.com/office/drawing/2016/5/10/chartex" xmlns:cx5="http://schemas.microsoft.com/office/drawing/2016/5/11/chartex" xmlns:cx6="http://schemas.microsoft.com/office/drawing/2016/5/12/chartex" xmlns:cx7="http://schemas.microsoft.com/office/drawing/2016/5/13/chartex" xmlns:cx8="http://schemas.microsoft.com/office/drawing/2016/5/14/chartex" xmlns:mc="http://schemas.openxmlformats.org/markup-compatibility/2006" xmlns:aink="http://schemas.microsoft.com/office/drawing/2016/ink" xmlns:am3d="http://schemas.microsoft.com/office/drawing/2017/model3d" xmlns:o="urn:schemas-microsoft-com:office:office" xmlns:oel="http://schemas.microsoft.com/office/2019/extlst" xmlns:r="http://schemas.openxmlformats.org/officeDocument/2006/relationships" xmlns:m="http://schemas.openxmlformats.org/officeDocument/2006/math" xmlns:v="urn:schemas-microsoft-com:vml" xmlns:wp14="http://schemas.microsoft.com/office/word/2010/wordprocessingDrawing" xmlns:wp="http://schemas.openxmlformats.org/drawingml/2006/wordprocessingDrawing" xmlns:w10="urn:schemas-microsoft-com:office:word" xmlns:w="http://schemas.openxmlformats.org/wordprocessingml/2006/main" xmlns:w14="http://schemas.microsoft.com/office/word/2010/wordml" xmlns:w15="http://schemas.microsoft.com/office/word/2012/wordml" xmlns:w16cex="http://schemas.microsoft.com/office/word/2018/wordml/cex" xmlns:w16cid="http://schemas.microsoft.com/office/word/2016/wordml/cid" xmlns:w16="http://schemas.microsoft.com/office/word/2018/wordml" xmlns:w16du="http://schemas.microsoft.com/office/word/2023/wordml/word16du" xmlns:w16sdtdh="http://schemas.microsoft.com/office/word/2020/wordml/sdtdatahash" xmlns:w16se="http://schemas.microsoft.com/office/word/2015/wordml/symex" xmlns:wpg="http://schemas.microsoft.com/office/word/2010/wordprocessingGroup" xmlns:wpi="http://schemas.microsoft.com/office/word/2010/wordprocessingInk" xmlns:wne="http://schemas.microsoft.com/office/word/2006/wordml" xmlns:wps="http://schemas.microsoft.com/office/word/2010/wordprocessingShape" mc:Ignorable="w14 w15 w16se w16cid w16 w16cex w16sdtdh w16du wp14">
+  <w:p>
+    <w:pPr>
+      <w:pStyle w:val="Footer"/>
+    </w:pPr>
+  </w:p>
+</w:ftr>
+</file>
+
+<file path=word/footer3.xml><?xml version="1.0" encoding="utf-8"?>
+<w:ftr xmlns:wpc="http://schemas.microsoft.com/office/word/2010/wordprocessingCanvas" xmlns:cx="http://schemas.microsoft.com/office/drawing/2014/chartex" xmlns:cx1="http://schemas.microsoft.com/office/drawing/2015/9/8/chartex" xmlns:cx2="http://schemas.microsoft.com/office/drawing/2015/10/21/chartex" xmlns:cx3="http://schemas.microsoft.com/office/drawing/2016/5/9/chartex" xmlns:cx4="http://schemas.microsoft.com/office/drawing/2016/5/10/chartex" xmlns:cx5="http://schemas.microsoft.com/office/drawing/2016/5/11/chartex" xmlns:cx6="http://schemas.microsoft.com/office/drawing/2016/5/12/chartex" xmlns:cx7="http://schemas.microsoft.com/office/drawing/2016/5/13/chartex" xmlns:cx8="http://schemas.microsoft.com/office/drawing/2016/5/14/chartex" xmlns:mc="http://schemas.openxmlformats.org/markup-compatibility/2006" xmlns:aink="http://schemas.microsoft.com/office/drawing/2016/ink" xmlns:am3d="http://schemas.microsoft.com/office/drawing/2017/model3d" xmlns:o="urn:schemas-microsoft-com:office:office" xmlns:oel="http://schemas.microsoft.com/office/2019/extlst" xmlns:r="http://schemas.openxmlformats.org/officeDocument/2006/relationships" xmlns:m="http://schemas.openxmlformats.org/officeDocument/2006/math" xmlns:v="urn:schemas-microsoft-com:vml" xmlns:wp14="http://schemas.microsoft.com/office/word/2010/wordprocessingDrawing" xmlns:wp="http://schemas.openxmlformats.org/drawingml/2006/wordprocessingDrawing" xmlns:w10="urn:schemas-microsoft-com:office:word" xmlns:w="http://schemas.openxmlformats.org/wordprocessingml/2006/main" xmlns:w14="http://schemas.microsoft.com/office/word/2010/wordml" xmlns:w15="http://schemas.microsoft.com/office/word/2012/wordml" xmlns:w16cex="http://schemas.microsoft.com/office/word/2018/wordml/cex" xmlns:w16cid="http://schemas.microsoft.com/office/word/2016/wordml/cid" xmlns:w16="http://schemas.microsoft.com/office/word/2018/wordml" xmlns:w16du="http://schemas.microsoft.com/office/word/2023/wordml/word16du" xmlns:w16sdtdh="http://schemas.microsoft.com/office/word/2020/wordml/sdtdatahash" xmlns:w16se="http://schemas.microsoft.com/office/word/2015/wordml/symex" xmlns:wpg="http://schemas.microsoft.com/office/word/2010/wordprocessingGroup" xmlns:wpi="http://schemas.microsoft.com/office/word/2010/wordprocessingInk" xmlns:wne="http://schemas.microsoft.com/office/word/2006/wordml" xmlns:wps="http://schemas.microsoft.com/office/word/2010/wordprocessingShape" mc:Ignorable="w14 w15 w16se w16cid w16 w16cex w16sdtdh w16du wp14">
+  <w:p>
+    <w:pPr>
+      <w:pStyle w:val="Footer"/>
+    </w:pPr>
+  </w:p>
+</w:ftr>
+</file>
+
 <file path=word/footnotes.xml><?xml version="1.0" encoding="utf-8"?>
 <w:footnotes xmlns:wpc="http://schemas.microsoft.com/office/word/2010/wordprocessingCanvas" xmlns:cx="http://schemas.microsoft.com/office/drawing/2014/chartex" xmlns:cx1="http://schemas.microsoft.com/office/drawing/2015/9/8/chartex" xmlns:cx2="http://schemas.microsoft.com/office/drawing/2015/10/21/chartex" xmlns:cx3="http://schemas.microsoft.com/office/drawing/2016/5/9/chartex" xmlns:cx4="http://schemas.microsoft.com/office/drawing/2016/5/10/chartex" xmlns:cx5="http://schemas.microsoft.com/office/drawing/2016/5/11/chartex" xmlns:cx6="http://schemas.microsoft.com/office/drawing/2016/5/12/chartex" xmlns:cx7="http://schemas.microsoft.com/office/drawing/2016/5/13/chartex" xmlns:cx8="http://schemas.microsoft.com/office/drawing/2016/5/14/chartex" xmlns:mc="http://schemas.openxmlformats.org/markup-compatibility/2006" xmlns:aink="http://schemas.microsoft.com/office/drawing/2016/ink" xmlns:am3d="http://schemas.microsoft.com/office/drawing/2017/model3d" xmlns:o="urn:schemas-microsoft-com:office:office" xmlns:oel="http://schemas.microsoft.com/office/2019/extlst" xmlns:r="http://schemas.openxmlformats.org/officeDocument/2006/relationships" xmlns:m="http://schemas.openxmlformats.org/officeDocument/2006/math" xmlns:v="urn:schemas-microsoft-com:vml" xmlns:wp14="http://schemas.microsoft.com/office/word/2010/wordprocessingDrawing" xmlns:wp="http://schemas.openxmlformats.org/drawingml/2006/wordprocessingDrawing" xmlns:w10="urn:schemas-microsoft-com:office:word" xmlns:w="http://schemas.openxmlformats.org/wordprocessingml/2006/main" xmlns:w14="http://schemas.microsoft.com/office/word/2010/wordml" xmlns:w15="http://schemas.microsoft.com/office/word/2012/wordml" xmlns:w16cex="http://schemas.microsoft.com/office/word/2018/wordml/cex" xmlns:w16cid="http://schemas.microsoft.com/office/word/2016/wordml/cid" xmlns:w16="http://schemas.microsoft.com/office/word/2018/wordml" xmlns:w16du="http://schemas.microsoft.com/office/word/2023/wordml/word16du" xmlns:w16sdtdh="http://schemas.microsoft.com/office/word/2020/wordml/sdtdatahash" xmlns:w16se="http://schemas.microsoft.com/office/word/2015/wordml/symex" xmlns:wpg="http://schemas.microsoft.com/office/word/2010/wordprocessingGroup" xmlns:wpi="http://schemas.microsoft.com/office/word/2010/wordprocessingInk" xmlns:wne="http://schemas.microsoft.com/office/word/2006/wordml" xmlns:wps="http://schemas.microsoft.com/office/word/2010/wordprocessingShape" mc:Ignorable="w14 w15 w16se w16cid w16 w16cex w16sdtdh w16du wp14">
   <w:footnote w:type="separator" w:id="-1">
@@ -1211,7 +1430,17 @@
 </file>
 
 <file path=word/header1.xml><?xml version="1.0" encoding="utf-8"?>
-<w:hdr xmlns:a="http://schemas.openxmlformats.org/drawingml/2006/main" xmlns:pic="http://schemas.openxmlformats.org/drawingml/2006/picture" xmlns:wpc="http://schemas.microsoft.com/office/word/2010/wordprocessingCanvas" xmlns:cx="http://schemas.microsoft.com/office/drawing/2014/chartex" xmlns:cx1="http://schemas.microsoft.com/office/drawing/2015/9/8/chartex" xmlns:cx2="http://schemas.microsoft.com/office/drawing/2015/10/21/chartex" xmlns:cx3="http://schemas.microsoft.com/office/drawing/2016/5/9/chartex" xmlns:cx4="http://schemas.microsoft.com/office/drawing/2016/5/10/chartex" xmlns:cx5="http://schemas.microsoft.com/office/drawing/2016/5/11/chartex" xmlns:cx6="http://schemas.microsoft.com/office/drawing/2016/5/12/chartex" xmlns:cx7="http://schemas.microsoft.com/office/drawing/2016/5/13/chartex" xmlns:cx8="http://schemas.microsoft.com/office/drawing/2016/5/14/chartex" xmlns:mc="http://schemas.openxmlformats.org/markup-compatibility/2006" xmlns:aink="http://schemas.microsoft.com/office/drawing/2016/ink" xmlns:am3d="http://schemas.microsoft.com/office/drawing/2017/model3d" xmlns:o="urn:schemas-microsoft-com:office:office" xmlns:oel="http://schemas.microsoft.com/office/2019/extlst" xmlns:r="http://schemas.openxmlformats.org/officeDocument/2006/relationships" xmlns:m="http://schemas.openxmlformats.org/officeDocument/2006/math" xmlns:v="urn:schemas-microsoft-com:vml" xmlns:wp14="http://schemas.microsoft.com/office/word/2010/wordprocessingDrawing" xmlns:wp="http://schemas.openxmlformats.org/drawingml/2006/wordprocessingDrawing" xmlns:w10="urn:schemas-microsoft-com:office:word" xmlns:w="http://schemas.openxmlformats.org/wordprocessingml/2006/main" xmlns:w14="http://schemas.microsoft.com/office/word/2010/wordml" xmlns:w15="http://schemas.microsoft.com/office/word/2012/wordml" xmlns:w16cex="http://schemas.microsoft.com/office/word/2018/wordml/cex" xmlns:w16cid="http://schemas.microsoft.com/office/word/2016/wordml/cid" xmlns:w16="http://schemas.microsoft.com/office/word/2018/wordml" xmlns:w16du="http://schemas.microsoft.com/office/word/2023/wordml/word16du" xmlns:w16sdtdh="http://schemas.microsoft.com/office/word/2020/wordml/sdtdatahash" xmlns:w16se="http://schemas.microsoft.com/office/word/2015/wordml/symex" xmlns:wpg="http://schemas.microsoft.com/office/word/2010/wordprocessingGroup" xmlns:wpi="http://schemas.microsoft.com/office/word/2010/wordprocessingInk" xmlns:wne="http://schemas.microsoft.com/office/word/2006/wordml" xmlns:wps="http://schemas.microsoft.com/office/word/2010/wordprocessingShape" mc:Ignorable="w14 w15 w16se w16cid w16 w16cex w16sdtdh w16du wp14">
+<w:hdr xmlns:wpc="http://schemas.microsoft.com/office/word/2010/wordprocessingCanvas" xmlns:cx="http://schemas.microsoft.com/office/drawing/2014/chartex" xmlns:cx1="http://schemas.microsoft.com/office/drawing/2015/9/8/chartex" xmlns:cx2="http://schemas.microsoft.com/office/drawing/2015/10/21/chartex" xmlns:cx3="http://schemas.microsoft.com/office/drawing/2016/5/9/chartex" xmlns:cx4="http://schemas.microsoft.com/office/drawing/2016/5/10/chartex" xmlns:cx5="http://schemas.microsoft.com/office/drawing/2016/5/11/chartex" xmlns:cx6="http://schemas.microsoft.com/office/drawing/2016/5/12/chartex" xmlns:cx7="http://schemas.microsoft.com/office/drawing/2016/5/13/chartex" xmlns:cx8="http://schemas.microsoft.com/office/drawing/2016/5/14/chartex" xmlns:mc="http://schemas.openxmlformats.org/markup-compatibility/2006" xmlns:aink="http://schemas.microsoft.com/office/drawing/2016/ink" xmlns:am3d="http://schemas.microsoft.com/office/drawing/2017/model3d" xmlns:o="urn:schemas-microsoft-com:office:office" xmlns:oel="http://schemas.microsoft.com/office/2019/extlst" xmlns:r="http://schemas.openxmlformats.org/officeDocument/2006/relationships" xmlns:m="http://schemas.openxmlformats.org/officeDocument/2006/math" xmlns:v="urn:schemas-microsoft-com:vml" xmlns:wp14="http://schemas.microsoft.com/office/word/2010/wordprocessingDrawing" xmlns:wp="http://schemas.openxmlformats.org/drawingml/2006/wordprocessingDrawing" xmlns:w10="urn:schemas-microsoft-com:office:word" xmlns:w="http://schemas.openxmlformats.org/wordprocessingml/2006/main" xmlns:w14="http://schemas.microsoft.com/office/word/2010/wordml" xmlns:w15="http://schemas.microsoft.com/office/word/2012/wordml" xmlns:w16cex="http://schemas.microsoft.com/office/word/2018/wordml/cex" xmlns:w16cid="http://schemas.microsoft.com/office/word/2016/wordml/cid" xmlns:w16="http://schemas.microsoft.com/office/word/2018/wordml" xmlns:w16du="http://schemas.microsoft.com/office/word/2023/wordml/word16du" xmlns:w16sdtdh="http://schemas.microsoft.com/office/word/2020/wordml/sdtdatahash" xmlns:w16se="http://schemas.microsoft.com/office/word/2015/wordml/symex" xmlns:wpg="http://schemas.microsoft.com/office/word/2010/wordprocessingGroup" xmlns:wpi="http://schemas.microsoft.com/office/word/2010/wordprocessingInk" xmlns:wne="http://schemas.microsoft.com/office/word/2006/wordml" xmlns:wps="http://schemas.microsoft.com/office/word/2010/wordprocessingShape" mc:Ignorable="w14 w15 w16se w16cid w16 w16cex w16sdtdh w16du wp14">
+  <w:p>
+    <w:pPr>
+      <w:pStyle w:val="Header"/>
+    </w:pPr>
+  </w:p>
+</w:hdr>
+</file>
+
+<file path=word/header2.xml><?xml version="1.0" encoding="utf-8"?>
+<w:hdr xmlns:wpc="http://schemas.microsoft.com/office/word/2010/wordprocessingCanvas" xmlns:cx="http://schemas.microsoft.com/office/drawing/2014/chartex" xmlns:cx1="http://schemas.microsoft.com/office/drawing/2015/9/8/chartex" xmlns:cx2="http://schemas.microsoft.com/office/drawing/2015/10/21/chartex" xmlns:cx3="http://schemas.microsoft.com/office/drawing/2016/5/9/chartex" xmlns:cx4="http://schemas.microsoft.com/office/drawing/2016/5/10/chartex" xmlns:cx5="http://schemas.microsoft.com/office/drawing/2016/5/11/chartex" xmlns:cx6="http://schemas.microsoft.com/office/drawing/2016/5/12/chartex" xmlns:cx7="http://schemas.microsoft.com/office/drawing/2016/5/13/chartex" xmlns:cx8="http://schemas.microsoft.com/office/drawing/2016/5/14/chartex" xmlns:mc="http://schemas.openxmlformats.org/markup-compatibility/2006" xmlns:aink="http://schemas.microsoft.com/office/drawing/2016/ink" xmlns:am3d="http://schemas.microsoft.com/office/drawing/2017/model3d" xmlns:o="urn:schemas-microsoft-com:office:office" xmlns:oel="http://schemas.microsoft.com/office/2019/extlst" xmlns:r="http://schemas.openxmlformats.org/officeDocument/2006/relationships" xmlns:m="http://schemas.openxmlformats.org/officeDocument/2006/math" xmlns:v="urn:schemas-microsoft-com:vml" xmlns:wp14="http://schemas.microsoft.com/office/word/2010/wordprocessingDrawing" xmlns:wp="http://schemas.openxmlformats.org/drawingml/2006/wordprocessingDrawing" xmlns:w10="urn:schemas-microsoft-com:office:word" xmlns:w="http://schemas.openxmlformats.org/wordprocessingml/2006/main" xmlns:w14="http://schemas.microsoft.com/office/word/2010/wordml" xmlns:w15="http://schemas.microsoft.com/office/word/2012/wordml" xmlns:w16cex="http://schemas.microsoft.com/office/word/2018/wordml/cex" xmlns:w16cid="http://schemas.microsoft.com/office/word/2016/wordml/cid" xmlns:w16="http://schemas.microsoft.com/office/word/2018/wordml" xmlns:w16du="http://schemas.microsoft.com/office/word/2023/wordml/word16du" xmlns:w16sdtdh="http://schemas.microsoft.com/office/word/2020/wordml/sdtdatahash" xmlns:w16se="http://schemas.microsoft.com/office/word/2015/wordml/symex" xmlns:wpg="http://schemas.microsoft.com/office/word/2010/wordprocessingGroup" xmlns:wpi="http://schemas.microsoft.com/office/word/2010/wordprocessingInk" xmlns:wne="http://schemas.microsoft.com/office/word/2006/wordml" xmlns:wps="http://schemas.microsoft.com/office/word/2010/wordprocessingShape" mc:Ignorable="w14 w15 w16se w16cid w16 w16cex w16sdtdh w16du wp14">
   <w:p>
     <w:pPr>
       <w:pStyle w:val="Header"/>
@@ -1225,11 +1454,11 @@
     </w:r>
     <w:sdt>
       <w:sdtPr>
+        <w:alias w:val="#Nav: /GenJournalLine/CompanyPicture"/>
+        <w:tag w:val="#Nav: PaymentReceipt/50112"/>
         <w:id w:val="-1915852366"/>
         <w:dataBinding w:prefixMappings="xmlns:ns0='urn:microsoft-dynamics-nav/reports/PaymentReceipt/50112/'" w:xpath="/ns0:NavWordReportXmlPart[1]/ns0:GenJournalLine[1]/ns0:CompanyPicture[1]" w:storeItemID="{072A5C88-FD1B-4274-ACD9-2C46D19524E4}"/>
         <w:picture/>
-        <w:alias w:val="#Nav: /GenJournalLine/CompanyPicture"/>
-        <w:tag w:val="#Nav: PaymentReceipt/50112"/>
       </w:sdtPr>
       <w:sdtContent>
         <w:r>
@@ -1237,8 +1466,8 @@
             <w:noProof/>
           </w:rPr>
           <w:drawing>
-            <wp:inline distT="0" distB="0" distL="0" distR="0" wp14:anchorId="1E680FD2" wp14:editId="3E4A62AE">
-              <wp:extent cx="2781300" cy="830580"/>
+            <wp:inline distT="0" distB="0" distL="0" distR="0" wp14:anchorId="1E680FD2" wp14:editId="6C553F2E">
+              <wp:extent cx="2324100" cy="830580"/>
               <wp:effectExtent l="0" t="0" r="0" b="7620"/>
               <wp:docPr id="2" name="Picture 1"/>
               <wp:cNvGraphicFramePr>
@@ -1262,7 +1491,7 @@
                     <pic:spPr bwMode="auto">
                       <a:xfrm>
                         <a:off x="0" y="0"/>
-                        <a:ext cx="2781300" cy="830580"/>
+                        <a:ext cx="2324100" cy="830580"/>
                       </a:xfrm>
                       <a:prstGeom prst="rect">
                         <a:avLst/>
@@ -1280,6 +1509,16 @@
         </w:r>
       </w:sdtContent>
     </w:sdt>
+  </w:p>
+</w:hdr>
+</file>
+
+<file path=word/header3.xml><?xml version="1.0" encoding="utf-8"?>
+<w:hdr xmlns:wpc="http://schemas.microsoft.com/office/word/2010/wordprocessingCanvas" xmlns:cx="http://schemas.microsoft.com/office/drawing/2014/chartex" xmlns:cx1="http://schemas.microsoft.com/office/drawing/2015/9/8/chartex" xmlns:cx2="http://schemas.microsoft.com/office/drawing/2015/10/21/chartex" xmlns:cx3="http://schemas.microsoft.com/office/drawing/2016/5/9/chartex" xmlns:cx4="http://schemas.microsoft.com/office/drawing/2016/5/10/chartex" xmlns:cx5="http://schemas.microsoft.com/office/drawing/2016/5/11/chartex" xmlns:cx6="http://schemas.microsoft.com/office/drawing/2016/5/12/chartex" xmlns:cx7="http://schemas.microsoft.com/office/drawing/2016/5/13/chartex" xmlns:cx8="http://schemas.microsoft.com/office/drawing/2016/5/14/chartex" xmlns:mc="http://schemas.openxmlformats.org/markup-compatibility/2006" xmlns:aink="http://schemas.microsoft.com/office/drawing/2016/ink" xmlns:am3d="http://schemas.microsoft.com/office/drawing/2017/model3d" xmlns:o="urn:schemas-microsoft-com:office:office" xmlns:oel="http://schemas.microsoft.com/office/2019/extlst" xmlns:r="http://schemas.openxmlformats.org/officeDocument/2006/relationships" xmlns:m="http://schemas.openxmlformats.org/officeDocument/2006/math" xmlns:v="urn:schemas-microsoft-com:vml" xmlns:wp14="http://schemas.microsoft.com/office/word/2010/wordprocessingDrawing" xmlns:wp="http://schemas.openxmlformats.org/drawingml/2006/wordprocessingDrawing" xmlns:w10="urn:schemas-microsoft-com:office:word" xmlns:w="http://schemas.openxmlformats.org/wordprocessingml/2006/main" xmlns:w14="http://schemas.microsoft.com/office/word/2010/wordml" xmlns:w15="http://schemas.microsoft.com/office/word/2012/wordml" xmlns:w16cex="http://schemas.microsoft.com/office/word/2018/wordml/cex" xmlns:w16cid="http://schemas.microsoft.com/office/word/2016/wordml/cid" xmlns:w16="http://schemas.microsoft.com/office/word/2018/wordml" xmlns:w16du="http://schemas.microsoft.com/office/word/2023/wordml/word16du" xmlns:w16sdtdh="http://schemas.microsoft.com/office/word/2020/wordml/sdtdatahash" xmlns:w16se="http://schemas.microsoft.com/office/word/2015/wordml/symex" xmlns:wpg="http://schemas.microsoft.com/office/word/2010/wordprocessingGroup" xmlns:wpi="http://schemas.microsoft.com/office/word/2010/wordprocessingInk" xmlns:wne="http://schemas.microsoft.com/office/word/2006/wordml" xmlns:wps="http://schemas.microsoft.com/office/word/2010/wordprocessingShape" mc:Ignorable="w14 w15 w16se w16cid w16 w16cex w16sdtdh w16du wp14">
+  <w:p>
+    <w:pPr>
+      <w:pStyle w:val="Header"/>
+    </w:pPr>
   </w:p>
 </w:hdr>
 </file>
@@ -1864,8 +2103,11 @@
   <w:rsids>
     <w:rsidRoot w:val="0082134E"/>
     <w:rsid w:val="0001070E"/>
+    <w:rsid w:val="004825E1"/>
     <w:rsid w:val="0082134E"/>
+    <w:rsid w:val="008E558E"/>
     <w:rsid w:val="008E6806"/>
+    <w:rsid w:val="00D42304"/>
   </w:rsids>
   <m:mathPr>
     <m:mathFont m:val="Cambria Math"/>
@@ -2631,51 +2873,91 @@
 </a:theme>
 </file>
 
-<file path=customXml/item1.xml><?xml version="1.0" encoding="utf-8"?>
+<file path=customXml/item1.xml>��< ? x m l   v e r s i o n = " 1 . 0 "   e n c o d i n g = " u t f - 1 6 " ? > < N a v W o r d R e p o r t X m l P a r t   x m l n s = " u r n : m i c r o s o f t - d y n a m i c s - n a v / r e p o r t s / P a y m e n t R e c e i p t / 5 0 1 1 2 / " > + 
+     < G e n J o u r n a l L i n e > + 
+         < A c c o u n t _ N o _ > A c c o u n t _ N o _ < / A c c o u n t _ N o _ > + 
+         < A m o u n t > A m o u n t < / A m o u n t > + 
+         < A p p t o D o c N o > A p p t o D o c N o < / A p p t o D o c N o > + 
+         < A p p t o D o c T y p e > A p p t o D o c T y p e < / A p p t o D o c T y p e > + 
+         < C o m p a n y A d d r e s s > C o m p a n y A d d r e s s < / C o m p a n y A d d r e s s > + 
+         < C o m p a n y C i t y > C o m p a n y C i t y < / C o m p a n y C i t y > + 
+         < C o m p a n y C o u n t r y > C o m p a n y C o u n t r y < / C o m p a n y C o u n t r y > + 
+         < C o m p a n y E m a i l > C o m p a n y E m a i l < / C o m p a n y E m a i l > + 
+         < C o m p a n y N a m e > C o m p a n y N a m e < / C o m p a n y N a m e > + 
+         < C o m p a n y P h o n e > C o m p a n y P h o n e < / C o m p a n y P h o n e > + 
+         < C o m p a n y P i c t u r e > C o m p a n y P i c t u r e < / C o m p a n y P i c t u r e > + 
+         < C o m p a n y P o s t c o d e > C o m p a n y P o s t c o d e < / C o m p a n y P o s t c o d e > + 
+         < C u r r e n t D a t e > C u r r e n t D a t e < / C u r r e n t D a t e > + 
+         < C u s t o m e r _ I d > C u s t o m e r _ I d < / C u s t o m e r _ I d > + 
+         < D e s c r i p t i o n > D e s c r i p t i o n < / D e s c r i p t i o n > + 
+         < D o c u m e n t _ N o _ > D o c u m e n t _ N o _ < / D o c u m e n t _ N o _ > + 
+         < D o c u m e n t _ T y p e > D o c u m e n t _ T y p e < / D o c u m e n t _ T y p e > + 
+         < P o s t i n g _ D a t e > P o s t i n g _ D a t e < / P o s t i n g _ D a t e > + 
+         < C u s t o m e r > + 
+             < A d d r e s s > A d d r e s s < / A d d r e s s > + 
+             < E _ M a i l > E _ M a i l < / E _ M a i l > + 
+             < P h o n e _ N o _ > P h o n e _ N o _ < / P h o n e _ N o _ > + 
+         < / C u s t o m e r > + 
+         < S a l e s _ I n v o i c e _ H e a d e r > + 
+             < P o s t i n g _ D a t e _ s a l e s > P o s t i n g _ D a t e _ s a l e s < / P o s t i n g _ D a t e _ s a l e s > + 
+         < / S a l e s _ I n v o i c e _ H e a d e r > + 
+         < C u s t _ L e d g e r _ E n t r y > + 
+             < A m o u n t e n t r y > A m o u n t e n t r y < / A m o u n t e n t r y > + 
+             < D e s E n t r y > D e s E n t r y < / D e s E n t r y > + 
+         < / C u s t _ L e d g e r _ E n t r y > + 
+     < / G e n J o u r n a l L i n e > + 
+ < / N a v W o r d R e p o r t X m l P a r t > 
+</file>
+
+<file path=customXml/item2.xml><?xml version="1.0" encoding="utf-8"?>
 <b:Sources xmlns:b="http://schemas.openxmlformats.org/officeDocument/2006/bibliography" xmlns="http://schemas.openxmlformats.org/officeDocument/2006/bibliography" SelectedStyle="\APASixthEditionOfficeOnline.xsl" StyleName="APA" Version="6"/>
 </file>
 
-<file path=customXml/item2.xml>��< ? x m l   v e r s i o n = " 1 . 0 "   e n c o d i n g = " u t f - 1 6 " ? > - 
- < N a v W o r d R e p o r t X m l P a r t   x m l n s = " u r n : m i c r o s o f t - d y n a m i c s - n a v / r e p o r t s / P a y m e n t R e c e i p t / 5 0 1 1 2 / " > - 
-     < G e n J o u r n a l L i n e > - 
-         < C o m p a n y A d d r e s s > C o m p a n y A d d r e s s < / C o m p a n y A d d r e s s > - 
-         < C o m p a n y C i t y > C o m p a n y C i t y < / C o m p a n y C i t y > - 
-         < C o m p a n y C o u n t r y > C o m p a n y C o u n t r y < / C o m p a n y C o u n t r y > - 
-         < C o m p a n y E m a i l > C o m p a n y E m a i l < / C o m p a n y E m a i l > - 
-         < C o m p a n y N a m e > C o m p a n y N a m e < / C o m p a n y N a m e > - 
-         < C o m p a n y P h o n e > C o m p a n y P h o n e < / C o m p a n y P h o n e > - 
-         < C o m p a n y P i c t u r e > C o m p a n y P i c t u r e < / C o m p a n y P i c t u r e > - 
-         < C o m p a n y P o s t c o d e > C o m p a n y P o s t c o d e < / C o m p a n y P o s t c o d e > - 
-         < C u s t o m e r _ I d > C u s t o m e r _ I d < / C u s t o m e r _ I d > - 
-     < / G e n J o u r n a l L i n e > - 
- < / N a v W o r d R e p o r t X m l P a r t > 
+<file path=customXml/itemProps1.xml><?xml version="1.0" encoding="utf-8"?>
+<ds:datastoreItem xmlns:ds="http://schemas.openxmlformats.org/officeDocument/2006/customXml" ds:itemID="{072A5C88-FD1B-4274-ACD9-2C46D19524E4}">
+  <ds:schemaRefs>
+    <ds:schemaRef ds:uri="urn:microsoft-dynamics-nav/reports/PaymentReceipt/50112/"/>
+  </ds:schemaRefs>
+</ds:datastoreItem>
 </file>
 
-<file path=customXml/itemProps1.xml><?xml version="1.0" encoding="utf-8"?>
+<file path=customXml/itemProps2.xml><?xml version="1.0" encoding="utf-8"?>
 <ds:datastoreItem xmlns:ds="http://schemas.openxmlformats.org/officeDocument/2006/customXml" ds:itemID="{3B112A52-EB5A-4E31-A5FE-37B72C03D9CF}">
   <ds:schemaRefs>
     <ds:schemaRef ds:uri="http://schemas.openxmlformats.org/officeDocument/2006/bibliography"/>
   </ds:schemaRefs>
 </ds:datastoreItem>
-</file>
-
-<file path=customXml/itemProps2.xml><?xml version="1.0" encoding="utf-8"?>
-<ds:datastoreItem xmlns:ds="http://schemas.openxmlformats.org/officeDocument/2006/customXml" ds:itemID="{072A5C88-FD1B-4274-ACD9-2C46D19524E4}">
-  <ds:schemaRefs>
-    <ds:schemaRef ds:uri="urn:microsoft-dynamics-nav/reports/PaymentReceipt/50112/"/>
-  </ds:schemaRefs>
-</ds:datastoreItem>
 </file>
</xml_diff>

<commit_message>
Added a changes in Payment Receipt Doc
</commit_message>
<xml_diff>
--- a/PaymentReceipt.docx
+++ b/PaymentReceipt.docx
@@ -447,21 +447,31 @@
         </w:tc>
       </w:tr>
       <w:tr>
-        <w:sdt>
-          <w:sdtPr>
-            <w:id w:val="634057254"/>
-            <w:placeholder>
-              <w:docPart w:val="DefaultPlaceholder_-1854013440"/>
-            </w:placeholder>
-            <w:dataBinding w:prefixMappings="xmlns:ns0='urn:microsoft-dynamics-nav/reports/PaymentReceipt/50112/' " w:xpath="/ns0:NavWordReportXmlPart[1]/ns0:GenJournalLine[1]/ns0:Document_No_[1]" w:storeItemID="{072A5C88-FD1B-4274-ACD9-2C46D19524E4}"/>
-            <w:text/>
-          </w:sdtPr>
-          <w:sdtContent>
-            <w:tc>
-              <w:tcPr>
-                <w:tcW w:w="4815" w:type="dxa"/>
-              </w:tcPr>
-              <w:p>
+        <w:tc>
+          <w:tcPr>
+            <w:tcW w:w="4815" w:type="dxa"/>
+          </w:tcPr>
+          <w:p>
+            <w:r>
+              <w:rPr>
+                <w:b/>
+                <w:bCs/>
+              </w:rPr>
+              <w:t>Receipt No:</w:t>
+            </w:r>
+            <w:r>
+              <w:t xml:space="preserve"> </w:t>
+            </w:r>
+            <w:sdt>
+              <w:sdtPr>
+                <w:id w:val="634057254"/>
+                <w:placeholder>
+                  <w:docPart w:val="DefaultPlaceholder_-1854013440"/>
+                </w:placeholder>
+                <w:dataBinding w:prefixMappings="xmlns:ns0='urn:microsoft-dynamics-nav/reports/PaymentReceipt/50112/' " w:xpath="/ns0:NavWordReportXmlPart[1]/ns0:GenJournalLine[1]/ns0:Document_No_[1]" w:storeItemID="{072A5C88-FD1B-4274-ACD9-2C46D19524E4}"/>
+                <w:text/>
+              </w:sdtPr>
+              <w:sdtContent>
                 <w:proofErr w:type="spellStart"/>
                 <w:r>
                   <w:t>Document_No</w:t>
@@ -470,10 +480,10 @@
                 <w:r>
                   <w:t>_</w:t>
                 </w:r>
-              </w:p>
-            </w:tc>
-          </w:sdtContent>
-        </w:sdt>
+              </w:sdtContent>
+            </w:sdt>
+          </w:p>
+        </w:tc>
         <w:tc>
           <w:tcPr>
             <w:tcW w:w="5958" w:type="dxa"/>
@@ -498,30 +508,47 @@
         </w:tc>
       </w:tr>
       <w:tr>
-        <w:sdt>
-          <w:sdtPr>
-            <w:id w:val="-736398953"/>
-            <w:placeholder>
-              <w:docPart w:val="DefaultPlaceholder_-1854013440"/>
-            </w:placeholder>
-            <w:dataBinding w:prefixMappings="xmlns:ns0='urn:microsoft-dynamics-nav/reports/PaymentReceipt/50112/' " w:xpath="/ns0:NavWordReportXmlPart[1]/ns0:GenJournalLine[1]/ns0:ApptoDocNo[1]" w:storeItemID="{072A5C88-FD1B-4274-ACD9-2C46D19524E4}"/>
-            <w:text/>
-          </w:sdtPr>
-          <w:sdtContent>
-            <w:tc>
-              <w:tcPr>
-                <w:tcW w:w="4815" w:type="dxa"/>
-              </w:tcPr>
-              <w:p>
+        <w:tc>
+          <w:tcPr>
+            <w:tcW w:w="4815" w:type="dxa"/>
+          </w:tcPr>
+          <w:p>
+            <w:r>
+              <w:rPr>
+                <w:b/>
+                <w:bCs/>
+              </w:rPr>
+              <w:t>Invoice No</w:t>
+            </w:r>
+            <w:r>
+              <w:rPr>
+                <w:b/>
+                <w:bCs/>
+              </w:rPr>
+              <w:t>:</w:t>
+            </w:r>
+            <w:r>
+              <w:t xml:space="preserve"> </w:t>
+            </w:r>
+            <w:sdt>
+              <w:sdtPr>
+                <w:id w:val="-736398953"/>
+                <w:placeholder>
+                  <w:docPart w:val="DefaultPlaceholder_-1854013440"/>
+                </w:placeholder>
+                <w:dataBinding w:prefixMappings="xmlns:ns0='urn:microsoft-dynamics-nav/reports/PaymentReceipt/50112/' " w:xpath="/ns0:NavWordReportXmlPart[1]/ns0:GenJournalLine[1]/ns0:ApptoDocNo[1]" w:storeItemID="{072A5C88-FD1B-4274-ACD9-2C46D19524E4}"/>
+                <w:text/>
+              </w:sdtPr>
+              <w:sdtContent>
                 <w:proofErr w:type="spellStart"/>
                 <w:r>
                   <w:t>ApptoDocNo</w:t>
                 </w:r>
                 <w:proofErr w:type="spellEnd"/>
-              </w:p>
-            </w:tc>
-          </w:sdtContent>
-        </w:sdt>
+              </w:sdtContent>
+            </w:sdt>
+          </w:p>
+        </w:tc>
         <w:tc>
           <w:tcPr>
             <w:tcW w:w="5958" w:type="dxa"/>
@@ -537,30 +564,47 @@
         </w:tc>
       </w:tr>
       <w:tr>
-        <w:sdt>
-          <w:sdtPr>
-            <w:id w:val="4488037"/>
-            <w:placeholder>
-              <w:docPart w:val="DefaultPlaceholder_-1854013440"/>
-            </w:placeholder>
-            <w:dataBinding w:prefixMappings="xmlns:ns0='urn:microsoft-dynamics-nav/reports/PaymentReceipt/50112/' " w:xpath="/ns0:NavWordReportXmlPart[1]/ns0:GenJournalLine[1]/ns0:CurrentDate[1]" w:storeItemID="{072A5C88-FD1B-4274-ACD9-2C46D19524E4}"/>
-            <w:text/>
-          </w:sdtPr>
-          <w:sdtContent>
-            <w:tc>
-              <w:tcPr>
-                <w:tcW w:w="4815" w:type="dxa"/>
-              </w:tcPr>
-              <w:p>
+        <w:tc>
+          <w:tcPr>
+            <w:tcW w:w="4815" w:type="dxa"/>
+          </w:tcPr>
+          <w:p>
+            <w:r>
+              <w:rPr>
+                <w:b/>
+                <w:bCs/>
+              </w:rPr>
+              <w:t>Current Date</w:t>
+            </w:r>
+            <w:r>
+              <w:rPr>
+                <w:b/>
+                <w:bCs/>
+              </w:rPr>
+              <w:t>:</w:t>
+            </w:r>
+            <w:r>
+              <w:t xml:space="preserve"> </w:t>
+            </w:r>
+            <w:sdt>
+              <w:sdtPr>
+                <w:id w:val="4488037"/>
+                <w:placeholder>
+                  <w:docPart w:val="DefaultPlaceholder_-1854013440"/>
+                </w:placeholder>
+                <w:dataBinding w:prefixMappings="xmlns:ns0='urn:microsoft-dynamics-nav/reports/PaymentReceipt/50112/' " w:xpath="/ns0:NavWordReportXmlPart[1]/ns0:GenJournalLine[1]/ns0:CurrentDate[1]" w:storeItemID="{072A5C88-FD1B-4274-ACD9-2C46D19524E4}"/>
+                <w:text/>
+              </w:sdtPr>
+              <w:sdtContent>
                 <w:proofErr w:type="spellStart"/>
                 <w:r>
                   <w:t>CurrentDate</w:t>
                 </w:r>
                 <w:proofErr w:type="spellEnd"/>
-              </w:p>
-            </w:tc>
-          </w:sdtContent>
-        </w:sdt>
+              </w:sdtContent>
+            </w:sdt>
+          </w:p>
+        </w:tc>
         <w:tc>
           <w:tcPr>
             <w:tcW w:w="5958" w:type="dxa"/>
@@ -576,30 +620,47 @@
         </w:tc>
       </w:tr>
       <w:tr>
-        <w:sdt>
-          <w:sdtPr>
-            <w:id w:val="1446036124"/>
-            <w:placeholder>
-              <w:docPart w:val="DefaultPlaceholder_-1854013440"/>
-            </w:placeholder>
-            <w:dataBinding w:prefixMappings="xmlns:ns0='urn:microsoft-dynamics-nav/reports/PaymentReceipt/50112/' " w:xpath="/ns0:NavWordReportXmlPart[1]/ns0:GenJournalLine[1]/ns0:Sales_Invoice_Header[1]/ns0:Posting_Date_sales[1]" w:storeItemID="{072A5C88-FD1B-4274-ACD9-2C46D19524E4}"/>
-            <w:text/>
-          </w:sdtPr>
-          <w:sdtContent>
-            <w:tc>
-              <w:tcPr>
-                <w:tcW w:w="4815" w:type="dxa"/>
-              </w:tcPr>
-              <w:p>
+        <w:tc>
+          <w:tcPr>
+            <w:tcW w:w="4815" w:type="dxa"/>
+          </w:tcPr>
+          <w:p>
+            <w:r>
+              <w:rPr>
+                <w:b/>
+                <w:bCs/>
+              </w:rPr>
+              <w:t>Invoice Posting Date</w:t>
+            </w:r>
+            <w:r>
+              <w:rPr>
+                <w:b/>
+                <w:bCs/>
+              </w:rPr>
+              <w:t>:</w:t>
+            </w:r>
+            <w:r>
+              <w:t xml:space="preserve"> </w:t>
+            </w:r>
+            <w:sdt>
+              <w:sdtPr>
+                <w:id w:val="1446036124"/>
+                <w:placeholder>
+                  <w:docPart w:val="DefaultPlaceholder_-1854013440"/>
+                </w:placeholder>
+                <w:dataBinding w:prefixMappings="xmlns:ns0='urn:microsoft-dynamics-nav/reports/PaymentReceipt/50112/' " w:xpath="/ns0:NavWordReportXmlPart[1]/ns0:GenJournalLine[1]/ns0:Sales_Invoice_Header[1]/ns0:Posting_Date_sales[1]" w:storeItemID="{072A5C88-FD1B-4274-ACD9-2C46D19524E4}"/>
+                <w:text/>
+              </w:sdtPr>
+              <w:sdtContent>
                 <w:proofErr w:type="spellStart"/>
                 <w:r>
                   <w:t>Posting_Date_sales</w:t>
                 </w:r>
                 <w:proofErr w:type="spellEnd"/>
-              </w:p>
-            </w:tc>
-          </w:sdtContent>
-        </w:sdt>
+              </w:sdtContent>
+            </w:sdt>
+          </w:p>
+        </w:tc>
         <w:tc>
           <w:tcPr>
             <w:tcW w:w="5958" w:type="dxa"/>
@@ -1334,12 +1395,7 @@
     </w:tbl>
     <w:p/>
     <w:sectPr>
-      <w:headerReference w:type="even" r:id="rId8"/>
-      <w:headerReference w:type="default" r:id="rId9"/>
-      <w:footerReference w:type="even" r:id="rId10"/>
-      <w:footerReference w:type="default" r:id="rId11"/>
-      <w:headerReference w:type="first" r:id="rId12"/>
-      <w:footerReference w:type="first" r:id="rId13"/>
+      <w:headerReference w:type="default" r:id="rId8"/>
       <w:pgSz w:w="11906" w:h="16838" w:code="9"/>
       <w:pgMar w:top="1701" w:right="1134" w:bottom="1701" w:left="1134" w:header="708" w:footer="708" w:gutter="0"/>
       <w:cols w:space="708"/>
@@ -1374,36 +1430,6 @@
 </w:endnotes>
 </file>
 
-<file path=word/footer1.xml><?xml version="1.0" encoding="utf-8"?>
-<w:ftr xmlns:wpc="http://schemas.microsoft.com/office/word/2010/wordprocessingCanvas" xmlns:cx="http://schemas.microsoft.com/office/drawing/2014/chartex" xmlns:cx1="http://schemas.microsoft.com/office/drawing/2015/9/8/chartex" xmlns:cx2="http://schemas.microsoft.com/office/drawing/2015/10/21/chartex" xmlns:cx3="http://schemas.microsoft.com/office/drawing/2016/5/9/chartex" xmlns:cx4="http://schemas.microsoft.com/office/drawing/2016/5/10/chartex" xmlns:cx5="http://schemas.microsoft.com/office/drawing/2016/5/11/chartex" xmlns:cx6="http://schemas.microsoft.com/office/drawing/2016/5/12/chartex" xmlns:cx7="http://schemas.microsoft.com/office/drawing/2016/5/13/chartex" xmlns:cx8="http://schemas.microsoft.com/office/drawing/2016/5/14/chartex" xmlns:mc="http://schemas.openxmlformats.org/markup-compatibility/2006" xmlns:aink="http://schemas.microsoft.com/office/drawing/2016/ink" xmlns:am3d="http://schemas.microsoft.com/office/drawing/2017/model3d" xmlns:o="urn:schemas-microsoft-com:office:office" xmlns:oel="http://schemas.microsoft.com/office/2019/extlst" xmlns:r="http://schemas.openxmlformats.org/officeDocument/2006/relationships" xmlns:m="http://schemas.openxmlformats.org/officeDocument/2006/math" xmlns:v="urn:schemas-microsoft-com:vml" xmlns:wp14="http://schemas.microsoft.com/office/word/2010/wordprocessingDrawing" xmlns:wp="http://schemas.openxmlformats.org/drawingml/2006/wordprocessingDrawing" xmlns:w10="urn:schemas-microsoft-com:office:word" xmlns:w="http://schemas.openxmlformats.org/wordprocessingml/2006/main" xmlns:w14="http://schemas.microsoft.com/office/word/2010/wordml" xmlns:w15="http://schemas.microsoft.com/office/word/2012/wordml" xmlns:w16cex="http://schemas.microsoft.com/office/word/2018/wordml/cex" xmlns:w16cid="http://schemas.microsoft.com/office/word/2016/wordml/cid" xmlns:w16="http://schemas.microsoft.com/office/word/2018/wordml" xmlns:w16du="http://schemas.microsoft.com/office/word/2023/wordml/word16du" xmlns:w16sdtdh="http://schemas.microsoft.com/office/word/2020/wordml/sdtdatahash" xmlns:w16se="http://schemas.microsoft.com/office/word/2015/wordml/symex" xmlns:wpg="http://schemas.microsoft.com/office/word/2010/wordprocessingGroup" xmlns:wpi="http://schemas.microsoft.com/office/word/2010/wordprocessingInk" xmlns:wne="http://schemas.microsoft.com/office/word/2006/wordml" xmlns:wps="http://schemas.microsoft.com/office/word/2010/wordprocessingShape" mc:Ignorable="w14 w15 w16se w16cid w16 w16cex w16sdtdh w16du wp14">
-  <w:p>
-    <w:pPr>
-      <w:pStyle w:val="Footer"/>
-    </w:pPr>
-  </w:p>
-</w:ftr>
-</file>
-
-<file path=word/footer2.xml><?xml version="1.0" encoding="utf-8"?>
-<w:ftr xmlns:wpc="http://schemas.microsoft.com/office/word/2010/wordprocessingCanvas" xmlns:cx="http://schemas.microsoft.com/office/drawing/2014/chartex" xmlns:cx1="http://schemas.microsoft.com/office/drawing/2015/9/8/chartex" xmlns:cx2="http://schemas.microsoft.com/office/drawing/2015/10/21/chartex" xmlns:cx3="http://schemas.microsoft.com/office/drawing/2016/5/9/chartex" xmlns:cx4="http://schemas.microsoft.com/office/drawing/2016/5/10/chartex" xmlns:cx5="http://schemas.microsoft.com/office/drawing/2016/5/11/chartex" xmlns:cx6="http://schemas.microsoft.com/office/drawing/2016/5/12/chartex" xmlns:cx7="http://schemas.microsoft.com/office/drawing/2016/5/13/chartex" xmlns:cx8="http://schemas.microsoft.com/office/drawing/2016/5/14/chartex" xmlns:mc="http://schemas.openxmlformats.org/markup-compatibility/2006" xmlns:aink="http://schemas.microsoft.com/office/drawing/2016/ink" xmlns:am3d="http://schemas.microsoft.com/office/drawing/2017/model3d" xmlns:o="urn:schemas-microsoft-com:office:office" xmlns:oel="http://schemas.microsoft.com/office/2019/extlst" xmlns:r="http://schemas.openxmlformats.org/officeDocument/2006/relationships" xmlns:m="http://schemas.openxmlformats.org/officeDocument/2006/math" xmlns:v="urn:schemas-microsoft-com:vml" xmlns:wp14="http://schemas.microsoft.com/office/word/2010/wordprocessingDrawing" xmlns:wp="http://schemas.openxmlformats.org/drawingml/2006/wordprocessingDrawing" xmlns:w10="urn:schemas-microsoft-com:office:word" xmlns:w="http://schemas.openxmlformats.org/wordprocessingml/2006/main" xmlns:w14="http://schemas.microsoft.com/office/word/2010/wordml" xmlns:w15="http://schemas.microsoft.com/office/word/2012/wordml" xmlns:w16cex="http://schemas.microsoft.com/office/word/2018/wordml/cex" xmlns:w16cid="http://schemas.microsoft.com/office/word/2016/wordml/cid" xmlns:w16="http://schemas.microsoft.com/office/word/2018/wordml" xmlns:w16du="http://schemas.microsoft.com/office/word/2023/wordml/word16du" xmlns:w16sdtdh="http://schemas.microsoft.com/office/word/2020/wordml/sdtdatahash" xmlns:w16se="http://schemas.microsoft.com/office/word/2015/wordml/symex" xmlns:wpg="http://schemas.microsoft.com/office/word/2010/wordprocessingGroup" xmlns:wpi="http://schemas.microsoft.com/office/word/2010/wordprocessingInk" xmlns:wne="http://schemas.microsoft.com/office/word/2006/wordml" xmlns:wps="http://schemas.microsoft.com/office/word/2010/wordprocessingShape" mc:Ignorable="w14 w15 w16se w16cid w16 w16cex w16sdtdh w16du wp14">
-  <w:p>
-    <w:pPr>
-      <w:pStyle w:val="Footer"/>
-    </w:pPr>
-  </w:p>
-</w:ftr>
-</file>
-
-<file path=word/footer3.xml><?xml version="1.0" encoding="utf-8"?>
-<w:ftr xmlns:wpc="http://schemas.microsoft.com/office/word/2010/wordprocessingCanvas" xmlns:cx="http://schemas.microsoft.com/office/drawing/2014/chartex" xmlns:cx1="http://schemas.microsoft.com/office/drawing/2015/9/8/chartex" xmlns:cx2="http://schemas.microsoft.com/office/drawing/2015/10/21/chartex" xmlns:cx3="http://schemas.microsoft.com/office/drawing/2016/5/9/chartex" xmlns:cx4="http://schemas.microsoft.com/office/drawing/2016/5/10/chartex" xmlns:cx5="http://schemas.microsoft.com/office/drawing/2016/5/11/chartex" xmlns:cx6="http://schemas.microsoft.com/office/drawing/2016/5/12/chartex" xmlns:cx7="http://schemas.microsoft.com/office/drawing/2016/5/13/chartex" xmlns:cx8="http://schemas.microsoft.com/office/drawing/2016/5/14/chartex" xmlns:mc="http://schemas.openxmlformats.org/markup-compatibility/2006" xmlns:aink="http://schemas.microsoft.com/office/drawing/2016/ink" xmlns:am3d="http://schemas.microsoft.com/office/drawing/2017/model3d" xmlns:o="urn:schemas-microsoft-com:office:office" xmlns:oel="http://schemas.microsoft.com/office/2019/extlst" xmlns:r="http://schemas.openxmlformats.org/officeDocument/2006/relationships" xmlns:m="http://schemas.openxmlformats.org/officeDocument/2006/math" xmlns:v="urn:schemas-microsoft-com:vml" xmlns:wp14="http://schemas.microsoft.com/office/word/2010/wordprocessingDrawing" xmlns:wp="http://schemas.openxmlformats.org/drawingml/2006/wordprocessingDrawing" xmlns:w10="urn:schemas-microsoft-com:office:word" xmlns:w="http://schemas.openxmlformats.org/wordprocessingml/2006/main" xmlns:w14="http://schemas.microsoft.com/office/word/2010/wordml" xmlns:w15="http://schemas.microsoft.com/office/word/2012/wordml" xmlns:w16cex="http://schemas.microsoft.com/office/word/2018/wordml/cex" xmlns:w16cid="http://schemas.microsoft.com/office/word/2016/wordml/cid" xmlns:w16="http://schemas.microsoft.com/office/word/2018/wordml" xmlns:w16du="http://schemas.microsoft.com/office/word/2023/wordml/word16du" xmlns:w16sdtdh="http://schemas.microsoft.com/office/word/2020/wordml/sdtdatahash" xmlns:w16se="http://schemas.microsoft.com/office/word/2015/wordml/symex" xmlns:wpg="http://schemas.microsoft.com/office/word/2010/wordprocessingGroup" xmlns:wpi="http://schemas.microsoft.com/office/word/2010/wordprocessingInk" xmlns:wne="http://schemas.microsoft.com/office/word/2006/wordml" xmlns:wps="http://schemas.microsoft.com/office/word/2010/wordprocessingShape" mc:Ignorable="w14 w15 w16se w16cid w16 w16cex w16sdtdh w16du wp14">
-  <w:p>
-    <w:pPr>
-      <w:pStyle w:val="Footer"/>
-    </w:pPr>
-  </w:p>
-</w:ftr>
-</file>
-
 <file path=word/footnotes.xml><?xml version="1.0" encoding="utf-8"?>
 <w:footnotes xmlns:wpc="http://schemas.microsoft.com/office/word/2010/wordprocessingCanvas" xmlns:cx="http://schemas.microsoft.com/office/drawing/2014/chartex" xmlns:cx1="http://schemas.microsoft.com/office/drawing/2015/9/8/chartex" xmlns:cx2="http://schemas.microsoft.com/office/drawing/2015/10/21/chartex" xmlns:cx3="http://schemas.microsoft.com/office/drawing/2016/5/9/chartex" xmlns:cx4="http://schemas.microsoft.com/office/drawing/2016/5/10/chartex" xmlns:cx5="http://schemas.microsoft.com/office/drawing/2016/5/11/chartex" xmlns:cx6="http://schemas.microsoft.com/office/drawing/2016/5/12/chartex" xmlns:cx7="http://schemas.microsoft.com/office/drawing/2016/5/13/chartex" xmlns:cx8="http://schemas.microsoft.com/office/drawing/2016/5/14/chartex" xmlns:mc="http://schemas.openxmlformats.org/markup-compatibility/2006" xmlns:aink="http://schemas.microsoft.com/office/drawing/2016/ink" xmlns:am3d="http://schemas.microsoft.com/office/drawing/2017/model3d" xmlns:o="urn:schemas-microsoft-com:office:office" xmlns:oel="http://schemas.microsoft.com/office/2019/extlst" xmlns:r="http://schemas.openxmlformats.org/officeDocument/2006/relationships" xmlns:m="http://schemas.openxmlformats.org/officeDocument/2006/math" xmlns:v="urn:schemas-microsoft-com:vml" xmlns:wp14="http://schemas.microsoft.com/office/word/2010/wordprocessingDrawing" xmlns:wp="http://schemas.openxmlformats.org/drawingml/2006/wordprocessingDrawing" xmlns:w10="urn:schemas-microsoft-com:office:word" xmlns:w="http://schemas.openxmlformats.org/wordprocessingml/2006/main" xmlns:w14="http://schemas.microsoft.com/office/word/2010/wordml" xmlns:w15="http://schemas.microsoft.com/office/word/2012/wordml" xmlns:w16cex="http://schemas.microsoft.com/office/word/2018/wordml/cex" xmlns:w16cid="http://schemas.microsoft.com/office/word/2016/wordml/cid" xmlns:w16="http://schemas.microsoft.com/office/word/2018/wordml" xmlns:w16du="http://schemas.microsoft.com/office/word/2023/wordml/word16du" xmlns:w16sdtdh="http://schemas.microsoft.com/office/word/2020/wordml/sdtdatahash" xmlns:w16se="http://schemas.microsoft.com/office/word/2015/wordml/symex" xmlns:wpg="http://schemas.microsoft.com/office/word/2010/wordprocessingGroup" xmlns:wpi="http://schemas.microsoft.com/office/word/2010/wordprocessingInk" xmlns:wne="http://schemas.microsoft.com/office/word/2006/wordml" xmlns:wps="http://schemas.microsoft.com/office/word/2010/wordprocessingShape" mc:Ignorable="w14 w15 w16se w16cid w16 w16cex w16sdtdh w16du wp14">
   <w:footnote w:type="separator" w:id="-1">
@@ -1434,91 +1460,210 @@
   <w:p>
     <w:pPr>
       <w:pStyle w:val="Header"/>
-    </w:pPr>
-  </w:p>
-</w:hdr>
-</file>
-
-<file path=word/header2.xml><?xml version="1.0" encoding="utf-8"?>
-<w:hdr xmlns:wpc="http://schemas.microsoft.com/office/word/2010/wordprocessingCanvas" xmlns:cx="http://schemas.microsoft.com/office/drawing/2014/chartex" xmlns:cx1="http://schemas.microsoft.com/office/drawing/2015/9/8/chartex" xmlns:cx2="http://schemas.microsoft.com/office/drawing/2015/10/21/chartex" xmlns:cx3="http://schemas.microsoft.com/office/drawing/2016/5/9/chartex" xmlns:cx4="http://schemas.microsoft.com/office/drawing/2016/5/10/chartex" xmlns:cx5="http://schemas.microsoft.com/office/drawing/2016/5/11/chartex" xmlns:cx6="http://schemas.microsoft.com/office/drawing/2016/5/12/chartex" xmlns:cx7="http://schemas.microsoft.com/office/drawing/2016/5/13/chartex" xmlns:cx8="http://schemas.microsoft.com/office/drawing/2016/5/14/chartex" xmlns:mc="http://schemas.openxmlformats.org/markup-compatibility/2006" xmlns:aink="http://schemas.microsoft.com/office/drawing/2016/ink" xmlns:am3d="http://schemas.microsoft.com/office/drawing/2017/model3d" xmlns:o="urn:schemas-microsoft-com:office:office" xmlns:oel="http://schemas.microsoft.com/office/2019/extlst" xmlns:r="http://schemas.openxmlformats.org/officeDocument/2006/relationships" xmlns:m="http://schemas.openxmlformats.org/officeDocument/2006/math" xmlns:v="urn:schemas-microsoft-com:vml" xmlns:wp14="http://schemas.microsoft.com/office/word/2010/wordprocessingDrawing" xmlns:wp="http://schemas.openxmlformats.org/drawingml/2006/wordprocessingDrawing" xmlns:w10="urn:schemas-microsoft-com:office:word" xmlns:w="http://schemas.openxmlformats.org/wordprocessingml/2006/main" xmlns:w14="http://schemas.microsoft.com/office/word/2010/wordml" xmlns:w15="http://schemas.microsoft.com/office/word/2012/wordml" xmlns:w16cex="http://schemas.microsoft.com/office/word/2018/wordml/cex" xmlns:w16cid="http://schemas.microsoft.com/office/word/2016/wordml/cid" xmlns:w16="http://schemas.microsoft.com/office/word/2018/wordml" xmlns:w16du="http://schemas.microsoft.com/office/word/2023/wordml/word16du" xmlns:w16sdtdh="http://schemas.microsoft.com/office/word/2020/wordml/sdtdatahash" xmlns:w16se="http://schemas.microsoft.com/office/word/2015/wordml/symex" xmlns:wpg="http://schemas.microsoft.com/office/word/2010/wordprocessingGroup" xmlns:wpi="http://schemas.microsoft.com/office/word/2010/wordprocessingInk" xmlns:wne="http://schemas.microsoft.com/office/word/2006/wordml" xmlns:wps="http://schemas.microsoft.com/office/word/2010/wordprocessingShape" mc:Ignorable="w14 w15 w16se w16cid w16 w16cex w16sdtdh w16du wp14">
-  <w:p>
-    <w:pPr>
-      <w:pStyle w:val="Header"/>
       <w:jc w:val="right"/>
     </w:pPr>
+    <w:r>
+      <w:rPr>
+        <w:noProof/>
+      </w:rPr>
+      <mc:AlternateContent>
+        <mc:Choice Requires="wps">
+          <w:drawing>
+            <wp:anchor distT="45720" distB="45720" distL="114300" distR="114300" simplePos="0" relativeHeight="251659264" behindDoc="0" locked="0" layoutInCell="1" allowOverlap="1" wp14:anchorId="0AC04D7A" wp14:editId="0A6B93C2">
+              <wp:simplePos x="0" y="0"/>
+              <wp:positionH relativeFrom="column">
+                <wp:posOffset>3729990</wp:posOffset>
+              </wp:positionH>
+              <wp:positionV relativeFrom="paragraph">
+                <wp:posOffset>-228600</wp:posOffset>
+              </wp:positionV>
+              <wp:extent cx="3009900" cy="746760"/>
+              <wp:effectExtent l="0" t="0" r="0" b="0"/>
+              <wp:wrapSquare wrapText="bothSides"/>
+              <wp:docPr id="217" name="Text Box 2"/>
+              <wp:cNvGraphicFramePr>
+                <a:graphicFrameLocks xmlns:a="http://schemas.openxmlformats.org/drawingml/2006/main"/>
+              </wp:cNvGraphicFramePr>
+              <a:graphic xmlns:a="http://schemas.openxmlformats.org/drawingml/2006/main">
+                <a:graphicData uri="http://schemas.microsoft.com/office/word/2010/wordprocessingShape">
+                  <wps:wsp>
+                    <wps:cNvSpPr txBox="1">
+                      <a:spLocks noChangeArrowheads="1"/>
+                    </wps:cNvSpPr>
+                    <wps:spPr bwMode="auto">
+                      <a:xfrm>
+                        <a:off x="0" y="0"/>
+                        <a:ext cx="3009900" cy="746760"/>
+                      </a:xfrm>
+                      <a:prstGeom prst="rect">
+                        <a:avLst/>
+                      </a:prstGeom>
+                      <a:solidFill>
+                        <a:srgbClr val="FFFFFF"/>
+                      </a:solidFill>
+                      <a:ln w="9525">
+                        <a:noFill/>
+                        <a:miter lim="800000"/>
+                        <a:headEnd/>
+                        <a:tailEnd/>
+                      </a:ln>
+                    </wps:spPr>
+                    <wps:txbx>
+                      <w:txbxContent>
+                        <w:sdt>
+                          <w:sdtPr>
+                            <w:id w:val="707687641"/>
+                            <w:dataBinding w:prefixMappings="xmlns:ns0='urn:microsoft-dynamics-nav/reports/PaymentReceipt/50112/' " w:xpath="/ns0:NavWordReportXmlPart[1]/ns0:GenJournalLine[1]/ns0:CompanyPicture[1]" w:storeItemID="{072A5C88-FD1B-4274-ACD9-2C46D19524E4}"/>
+                            <w:picture/>
+                          </w:sdtPr>
+                          <w:sdtContent>
+                            <w:p>
+                              <w:r>
+                                <w:rPr>
+                                  <w:noProof/>
+                                </w:rPr>
+                                <w:drawing>
+                                  <wp:inline distT="0" distB="0" distL="0" distR="0" wp14:anchorId="60BB6C3C" wp14:editId="6A9A8AEB">
+                                    <wp:extent cx="2636520" cy="647700"/>
+                                    <wp:effectExtent l="0" t="0" r="0" b="0"/>
+                                    <wp:docPr id="1" name="Picture 1"/>
+                                    <wp:cNvGraphicFramePr>
+                                      <a:graphicFrameLocks xmlns:a="http://schemas.openxmlformats.org/drawingml/2006/main" noChangeAspect="1"/>
+                                    </wp:cNvGraphicFramePr>
+                                    <a:graphic xmlns:a="http://schemas.openxmlformats.org/drawingml/2006/main">
+                                      <a:graphicData uri="http://schemas.openxmlformats.org/drawingml/2006/picture">
+                                        <pic:pic xmlns:pic="http://schemas.openxmlformats.org/drawingml/2006/picture">
+                                          <pic:nvPicPr>
+                                            <pic:cNvPr id="1" name="Picture 1"/>
+                                            <pic:cNvPicPr>
+                                              <a:picLocks noChangeAspect="1" noChangeArrowheads="1"/>
+                                            </pic:cNvPicPr>
+                                          </pic:nvPicPr>
+                                          <pic:blipFill>
+                                            <a:blip r:embed="rId1"/>
+                                            <a:stretch>
+                                              <a:fillRect/>
+                                            </a:stretch>
+                                          </pic:blipFill>
+                                          <pic:spPr bwMode="auto">
+                                            <a:xfrm>
+                                              <a:off x="0" y="0"/>
+                                              <a:ext cx="2636520" cy="647700"/>
+                                            </a:xfrm>
+                                            <a:prstGeom prst="rect">
+                                              <a:avLst/>
+                                            </a:prstGeom>
+                                            <a:noFill/>
+                                            <a:ln>
+                                              <a:noFill/>
+                                            </a:ln>
+                                          </pic:spPr>
+                                        </pic:pic>
+                                      </a:graphicData>
+                                    </a:graphic>
+                                  </wp:inline>
+                                </w:drawing>
+                              </w:r>
+                            </w:p>
+                          </w:sdtContent>
+                        </w:sdt>
+                      </w:txbxContent>
+                    </wps:txbx>
+                    <wps:bodyPr rot="0" vert="horz" wrap="square" lIns="91440" tIns="45720" rIns="91440" bIns="45720" anchor="t" anchorCtr="0">
+                      <a:noAutofit/>
+                    </wps:bodyPr>
+                  </wps:wsp>
+                </a:graphicData>
+              </a:graphic>
+              <wp14:sizeRelH relativeFrom="margin">
+                <wp14:pctWidth>0</wp14:pctWidth>
+              </wp14:sizeRelH>
+              <wp14:sizeRelV relativeFrom="margin">
+                <wp14:pctHeight>0</wp14:pctHeight>
+              </wp14:sizeRelV>
+            </wp:anchor>
+          </w:drawing>
+        </mc:Choice>
+        <mc:Fallback>
+          <w:pict>
+            <v:shapetype w14:anchorId="0AC04D7A" id="_x0000_t202" coordsize="21600,21600" o:spt="202" path="m,l,21600r21600,l21600,xe">
+              <v:stroke joinstyle="miter"/>
+              <v:path gradientshapeok="t" o:connecttype="rect"/>
+            </v:shapetype>
+            <v:shape id="Text Box 2" o:spid="_x0000_s1026" type="#_x0000_t202" style="position:absolute;left:0;text-align:left;margin-left:293.7pt;margin-top:-18pt;width:237pt;height:58.8pt;z-index:251659264;visibility:visible;mso-wrap-style:square;mso-width-percent:0;mso-height-percent:0;mso-wrap-distance-left:9pt;mso-wrap-distance-top:3.6pt;mso-wrap-distance-right:9pt;mso-wrap-distance-bottom:3.6pt;mso-position-horizontal:absolute;mso-position-horizontal-relative:text;mso-position-vertical:absolute;mso-position-vertical-relative:text;mso-width-percent:0;mso-height-percent:0;mso-width-relative:margin;mso-height-relative:margin;v-text-anchor:top" o:gfxdata="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" stroked="f">
+              <v:textbox>
+                <w:txbxContent>
+                  <w:sdt>
+                    <w:sdtPr>
+                      <w:id w:val="707687641"/>
+                      <w:dataBinding w:prefixMappings="xmlns:ns0='urn:microsoft-dynamics-nav/reports/PaymentReceipt/50112/' " w:xpath="/ns0:NavWordReportXmlPart[1]/ns0:GenJournalLine[1]/ns0:CompanyPicture[1]" w:storeItemID="{072A5C88-FD1B-4274-ACD9-2C46D19524E4}"/>
+                      <w:picture/>
+                    </w:sdtPr>
+                    <w:sdtContent>
+                      <w:p>
+                        <w:r>
+                          <w:rPr>
+                            <w:noProof/>
+                          </w:rPr>
+                          <w:drawing>
+                            <wp:inline distT="0" distB="0" distL="0" distR="0" wp14:anchorId="60BB6C3C" wp14:editId="6A9A8AEB">
+                              <wp:extent cx="2636520" cy="647700"/>
+                              <wp:effectExtent l="0" t="0" r="0" b="0"/>
+                              <wp:docPr id="1" name="Picture 1"/>
+                              <wp:cNvGraphicFramePr>
+                                <a:graphicFrameLocks xmlns:a="http://schemas.openxmlformats.org/drawingml/2006/main" noChangeAspect="1"/>
+                              </wp:cNvGraphicFramePr>
+                              <a:graphic xmlns:a="http://schemas.openxmlformats.org/drawingml/2006/main">
+                                <a:graphicData uri="http://schemas.openxmlformats.org/drawingml/2006/picture">
+                                  <pic:pic xmlns:pic="http://schemas.openxmlformats.org/drawingml/2006/picture">
+                                    <pic:nvPicPr>
+                                      <pic:cNvPr id="1" name="Picture 1"/>
+                                      <pic:cNvPicPr>
+                                        <a:picLocks noChangeAspect="1" noChangeArrowheads="1"/>
+                                      </pic:cNvPicPr>
+                                    </pic:nvPicPr>
+                                    <pic:blipFill>
+                                      <a:blip r:embed="rId1"/>
+                                      <a:stretch>
+                                        <a:fillRect/>
+                                      </a:stretch>
+                                    </pic:blipFill>
+                                    <pic:spPr bwMode="auto">
+                                      <a:xfrm>
+                                        <a:off x="0" y="0"/>
+                                        <a:ext cx="2636520" cy="647700"/>
+                                      </a:xfrm>
+                                      <a:prstGeom prst="rect">
+                                        <a:avLst/>
+                                      </a:prstGeom>
+                                      <a:noFill/>
+                                      <a:ln>
+                                        <a:noFill/>
+                                      </a:ln>
+                                    </pic:spPr>
+                                  </pic:pic>
+                                </a:graphicData>
+                              </a:graphic>
+                            </wp:inline>
+                          </w:drawing>
+                        </w:r>
+                      </w:p>
+                    </w:sdtContent>
+                  </w:sdt>
+                </w:txbxContent>
+              </v:textbox>
+              <w10:wrap type="square"/>
+            </v:shape>
+          </w:pict>
+        </mc:Fallback>
+      </mc:AlternateContent>
+    </w:r>
     <w:r>
       <w:tab/>
     </w:r>
     <w:r>
       <w:tab/>
     </w:r>
-    <w:sdt>
-      <w:sdtPr>
-        <w:alias w:val="#Nav: /GenJournalLine/CompanyPicture"/>
-        <w:tag w:val="#Nav: PaymentReceipt/50112"/>
-        <w:id w:val="-1915852366"/>
-        <w:dataBinding w:prefixMappings="xmlns:ns0='urn:microsoft-dynamics-nav/reports/PaymentReceipt/50112/'" w:xpath="/ns0:NavWordReportXmlPart[1]/ns0:GenJournalLine[1]/ns0:CompanyPicture[1]" w:storeItemID="{072A5C88-FD1B-4274-ACD9-2C46D19524E4}"/>
-        <w:picture/>
-      </w:sdtPr>
-      <w:sdtContent>
-        <w:r>
-          <w:rPr>
-            <w:noProof/>
-          </w:rPr>
-          <w:drawing>
-            <wp:inline distT="0" distB="0" distL="0" distR="0" wp14:anchorId="1E680FD2" wp14:editId="6C553F2E">
-              <wp:extent cx="2324100" cy="830580"/>
-              <wp:effectExtent l="0" t="0" r="0" b="7620"/>
-              <wp:docPr id="2" name="Picture 1"/>
-              <wp:cNvGraphicFramePr>
-                <a:graphicFrameLocks xmlns:a="http://schemas.openxmlformats.org/drawingml/2006/main" noChangeAspect="1"/>
-              </wp:cNvGraphicFramePr>
-              <a:graphic xmlns:a="http://schemas.openxmlformats.org/drawingml/2006/main">
-                <a:graphicData uri="http://schemas.openxmlformats.org/drawingml/2006/picture">
-                  <pic:pic xmlns:pic="http://schemas.openxmlformats.org/drawingml/2006/picture">
-                    <pic:nvPicPr>
-                      <pic:cNvPr id="2" name="Picture 1"/>
-                      <pic:cNvPicPr>
-                        <a:picLocks noChangeAspect="1" noChangeArrowheads="1"/>
-                      </pic:cNvPicPr>
-                    </pic:nvPicPr>
-                    <pic:blipFill>
-                      <a:blip r:embed="rId1"/>
-                      <a:stretch>
-                        <a:fillRect/>
-                      </a:stretch>
-                    </pic:blipFill>
-                    <pic:spPr bwMode="auto">
-                      <a:xfrm>
-                        <a:off x="0" y="0"/>
-                        <a:ext cx="2324100" cy="830580"/>
-                      </a:xfrm>
-                      <a:prstGeom prst="rect">
-                        <a:avLst/>
-                      </a:prstGeom>
-                      <a:noFill/>
-                      <a:ln>
-                        <a:noFill/>
-                      </a:ln>
-                    </pic:spPr>
-                  </pic:pic>
-                </a:graphicData>
-              </a:graphic>
-            </wp:inline>
-          </w:drawing>
-        </w:r>
-      </w:sdtContent>
-    </w:sdt>
-  </w:p>
-</w:hdr>
-</file>
-
-<file path=word/header3.xml><?xml version="1.0" encoding="utf-8"?>
-<w:hdr xmlns:wpc="http://schemas.microsoft.com/office/word/2010/wordprocessingCanvas" xmlns:cx="http://schemas.microsoft.com/office/drawing/2014/chartex" xmlns:cx1="http://schemas.microsoft.com/office/drawing/2015/9/8/chartex" xmlns:cx2="http://schemas.microsoft.com/office/drawing/2015/10/21/chartex" xmlns:cx3="http://schemas.microsoft.com/office/drawing/2016/5/9/chartex" xmlns:cx4="http://schemas.microsoft.com/office/drawing/2016/5/10/chartex" xmlns:cx5="http://schemas.microsoft.com/office/drawing/2016/5/11/chartex" xmlns:cx6="http://schemas.microsoft.com/office/drawing/2016/5/12/chartex" xmlns:cx7="http://schemas.microsoft.com/office/drawing/2016/5/13/chartex" xmlns:cx8="http://schemas.microsoft.com/office/drawing/2016/5/14/chartex" xmlns:mc="http://schemas.openxmlformats.org/markup-compatibility/2006" xmlns:aink="http://schemas.microsoft.com/office/drawing/2016/ink" xmlns:am3d="http://schemas.microsoft.com/office/drawing/2017/model3d" xmlns:o="urn:schemas-microsoft-com:office:office" xmlns:oel="http://schemas.microsoft.com/office/2019/extlst" xmlns:r="http://schemas.openxmlformats.org/officeDocument/2006/relationships" xmlns:m="http://schemas.openxmlformats.org/officeDocument/2006/math" xmlns:v="urn:schemas-microsoft-com:vml" xmlns:wp14="http://schemas.microsoft.com/office/word/2010/wordprocessingDrawing" xmlns:wp="http://schemas.openxmlformats.org/drawingml/2006/wordprocessingDrawing" xmlns:w10="urn:schemas-microsoft-com:office:word" xmlns:w="http://schemas.openxmlformats.org/wordprocessingml/2006/main" xmlns:w14="http://schemas.microsoft.com/office/word/2010/wordml" xmlns:w15="http://schemas.microsoft.com/office/word/2012/wordml" xmlns:w16cex="http://schemas.microsoft.com/office/word/2018/wordml/cex" xmlns:w16cid="http://schemas.microsoft.com/office/word/2016/wordml/cid" xmlns:w16="http://schemas.microsoft.com/office/word/2018/wordml" xmlns:w16du="http://schemas.microsoft.com/office/word/2023/wordml/word16du" xmlns:w16sdtdh="http://schemas.microsoft.com/office/word/2020/wordml/sdtdatahash" xmlns:w16se="http://schemas.microsoft.com/office/word/2015/wordml/symex" xmlns:wpg="http://schemas.microsoft.com/office/word/2010/wordprocessingGroup" xmlns:wpi="http://schemas.microsoft.com/office/word/2010/wordprocessingInk" xmlns:wne="http://schemas.microsoft.com/office/word/2006/wordml" xmlns:wps="http://schemas.microsoft.com/office/word/2010/wordprocessingShape" mc:Ignorable="w14 w15 w16se w16cid w16 w16cex w16sdtdh w16du wp14">
-  <w:p>
-    <w:pPr>
-      <w:pStyle w:val="Header"/>
-    </w:pPr>
   </w:p>
 </w:hdr>
 </file>
@@ -2107,7 +2252,9 @@
     <w:rsid w:val="0082134E"/>
     <w:rsid w:val="008E558E"/>
     <w:rsid w:val="008E6806"/>
+    <w:rsid w:val="00D20B7E"/>
     <w:rsid w:val="00D42304"/>
+    <w:rsid w:val="00FC59D2"/>
   </w:rsids>
   <m:mathPr>
     <m:mathFont m:val="Cambria Math"/>
@@ -2873,7 +3020,11 @@
 </a:theme>
 </file>
 
-<file path=customXml/item1.xml>��< ? x m l   v e r s i o n = " 1 . 0 "   e n c o d i n g = " u t f - 1 6 " ? > < N a v W o r d R e p o r t X m l P a r t   x m l n s = " u r n : m i c r o s o f t - d y n a m i c s - n a v / r e p o r t s / P a y m e n t R e c e i p t / 5 0 1 1 2 / " > +<file path=customXml/item1.xml><?xml version="1.0" encoding="utf-8"?>
+<b:Sources xmlns:b="http://schemas.openxmlformats.org/officeDocument/2006/bibliography" xmlns="http://schemas.openxmlformats.org/officeDocument/2006/bibliography" SelectedStyle="\APASixthEditionOfficeOnline.xsl" StyleName="APA" Version="6"/>
+</file>
+
+<file path=customXml/item2.xml>��< ? x m l   v e r s i o n = " 1 . 0 "   e n c o d i n g = " u t f - 1 6 " ? > < N a v W o r d R e p o r t X m l P a r t   x m l n s = " u r n : m i c r o s o f t - d y n a m i c s - n a v / r e p o r t s / P a y m e n t R e c e i p t / 5 0 1 1 2 / " >   
      < G e n J o u r n a l L i n e >   
@@ -2942,22 +3093,18 @@
  < / N a v W o r d R e p o r t X m l P a r t > 
 </file>
 
-<file path=customXml/item2.xml><?xml version="1.0" encoding="utf-8"?>
-<b:Sources xmlns:b="http://schemas.openxmlformats.org/officeDocument/2006/bibliography" xmlns="http://schemas.openxmlformats.org/officeDocument/2006/bibliography" SelectedStyle="\APASixthEditionOfficeOnline.xsl" StyleName="APA" Version="6"/>
+<file path=customXml/itemProps1.xml><?xml version="1.0" encoding="utf-8"?>
+<ds:datastoreItem xmlns:ds="http://schemas.openxmlformats.org/officeDocument/2006/customXml" ds:itemID="{3B112A52-EB5A-4E31-A5FE-37B72C03D9CF}">
+  <ds:schemaRefs>
+    <ds:schemaRef ds:uri="http://schemas.openxmlformats.org/officeDocument/2006/bibliography"/>
+  </ds:schemaRefs>
+</ds:datastoreItem>
 </file>
 
-<file path=customXml/itemProps1.xml><?xml version="1.0" encoding="utf-8"?>
+<file path=customXml/itemProps2.xml><?xml version="1.0" encoding="utf-8"?>
 <ds:datastoreItem xmlns:ds="http://schemas.openxmlformats.org/officeDocument/2006/customXml" ds:itemID="{072A5C88-FD1B-4274-ACD9-2C46D19524E4}">
   <ds:schemaRefs>
     <ds:schemaRef ds:uri="urn:microsoft-dynamics-nav/reports/PaymentReceipt/50112/"/>
   </ds:schemaRefs>
 </ds:datastoreItem>
-</file>
-
-<file path=customXml/itemProps2.xml><?xml version="1.0" encoding="utf-8"?>
-<ds:datastoreItem xmlns:ds="http://schemas.openxmlformats.org/officeDocument/2006/customXml" ds:itemID="{3B112A52-EB5A-4E31-A5FE-37B72C03D9CF}">
-  <ds:schemaRefs>
-    <ds:schemaRef ds:uri="http://schemas.openxmlformats.org/officeDocument/2006/bibliography"/>
-  </ds:schemaRefs>
-</ds:datastoreItem>
 </file>
</xml_diff>

<commit_message>
changes in payment receipt file
</commit_message>
<xml_diff>
--- a/PaymentReceipt.docx
+++ b/PaymentReceipt.docx
@@ -9,12 +9,12 @@
         <w:tblW w:w="10773" w:type="dxa"/>
         <w:tblInd w:w="-567" w:type="dxa"/>
         <w:tblBorders>
-          <w:top w:val="none" w:sz="0" w:space="0" w:color="auto"/>
-          <w:left w:val="none" w:sz="0" w:space="0" w:color="auto"/>
-          <w:bottom w:val="none" w:sz="0" w:space="0" w:color="auto"/>
-          <w:right w:val="none" w:sz="0" w:space="0" w:color="auto"/>
-          <w:insideH w:val="none" w:sz="0" w:space="0" w:color="auto"/>
-          <w:insideV w:val="none" w:sz="0" w:space="0" w:color="auto"/>
+          <w:top w:val="none" w:color="auto" w:sz="0" w:space="0"/>
+          <w:left w:val="none" w:color="auto" w:sz="0" w:space="0"/>
+          <w:bottom w:val="none" w:color="auto" w:sz="0" w:space="0"/>
+          <w:right w:val="none" w:color="auto" w:sz="0" w:space="0"/>
+          <w:insideH w:val="none" w:color="auto" w:sz="0" w:space="0"/>
+          <w:insideV w:val="none" w:color="auto" w:sz="0" w:space="0"/>
         </w:tblBorders>
         <w:tblLook w:val="04A0" w:firstRow="1" w:lastRow="0" w:firstColumn="1" w:lastColumn="0" w:noHBand="0" w:noVBand="1"/>
       </w:tblPr>
@@ -126,11 +126,13 @@
       <w:tr>
         <w:sdt>
           <w:sdtPr>
+            <w:alias w:val="#Nav: /GenJournalLine/Description"/>
+            <w:tag w:val="#Nav: PaymentReceipt/50112"/>
             <w:id w:val="1654803375"/>
             <w:placeholder>
               <w:docPart w:val="DefaultPlaceholder_-1854013440"/>
             </w:placeholder>
-            <w:dataBinding w:prefixMappings="xmlns:ns0='urn:microsoft-dynamics-nav/reports/PaymentReceipt/50112/' " w:xpath="/ns0:NavWordReportXmlPart[1]/ns0:GenJournalLine[1]/ns0:Description[1]" w:storeItemID="{072A5C88-FD1B-4274-ACD9-2C46D19524E4}"/>
+            <w:dataBinding w:prefixMappings="xmlns:ns0='urn:microsoft-dynamics-nav/reports/PaymentReceipt/50112/'" w:xpath="/ns0:NavWordReportXmlPart[1]/ns0:GenJournalLine[1]/ns0:Description[1]" w:storeItemID="{072A5C88-FD1B-4274-ACD9-2C46D19524E4}"/>
             <w:text/>
           </w:sdtPr>
           <w:sdtContent>
@@ -179,11 +181,13 @@
       <w:tr>
         <w:sdt>
           <w:sdtPr>
+            <w:alias w:val="#Nav: /GenJournalLine/Customer/Address"/>
+            <w:tag w:val="#Nav: PaymentReceipt/50112"/>
             <w:id w:val="-996258057"/>
             <w:placeholder>
               <w:docPart w:val="DefaultPlaceholder_-1854013440"/>
             </w:placeholder>
-            <w:dataBinding w:prefixMappings="xmlns:ns0='urn:microsoft-dynamics-nav/reports/PaymentReceipt/50112/' " w:xpath="/ns0:NavWordReportXmlPart[1]/ns0:GenJournalLine[1]/ns0:Customer[1]/ns0:Address[1]" w:storeItemID="{072A5C88-FD1B-4274-ACD9-2C46D19524E4}"/>
+            <w:dataBinding w:prefixMappings="xmlns:ns0='urn:microsoft-dynamics-nav/reports/PaymentReceipt/50112/'" w:xpath="/ns0:NavWordReportXmlPart[1]/ns0:GenJournalLine[1]/ns0:Customer[1]/ns0:Address[1]" w:storeItemID="{072A5C88-FD1B-4274-ACD9-2C46D19524E4}"/>
             <w:text/>
           </w:sdtPr>
           <w:sdtContent>
@@ -280,11 +284,13 @@
             </w:r>
             <w:sdt>
               <w:sdtPr>
+                <w:alias w:val="#Nav: /GenJournalLine/Customer/Phone_No_"/>
+                <w:tag w:val="#Nav: PaymentReceipt/50112"/>
                 <w:id w:val="1264952277"/>
                 <w:placeholder>
                   <w:docPart w:val="DefaultPlaceholder_-1854013440"/>
                 </w:placeholder>
-                <w:dataBinding w:prefixMappings="xmlns:ns0='urn:microsoft-dynamics-nav/reports/PaymentReceipt/50112/' " w:xpath="/ns0:NavWordReportXmlPart[1]/ns0:GenJournalLine[1]/ns0:Customer[1]/ns0:Phone_No_[1]" w:storeItemID="{072A5C88-FD1B-4274-ACD9-2C46D19524E4}"/>
+                <w:dataBinding w:prefixMappings="xmlns:ns0='urn:microsoft-dynamics-nav/reports/PaymentReceipt/50112/'" w:xpath="/ns0:NavWordReportXmlPart[1]/ns0:GenJournalLine[1]/ns0:Customer[1]/ns0:Phone_No_[1]" w:storeItemID="{072A5C88-FD1B-4274-ACD9-2C46D19524E4}"/>
                 <w:text/>
               </w:sdtPr>
               <w:sdtContent>
@@ -347,11 +353,13 @@
             </w:r>
             <w:sdt>
               <w:sdtPr>
+                <w:alias w:val="#Nav: /GenJournalLine/Customer/E_Mail"/>
+                <w:tag w:val="#Nav: PaymentReceipt/50112"/>
                 <w:id w:val="-102104966"/>
                 <w:placeholder>
                   <w:docPart w:val="DefaultPlaceholder_-1854013440"/>
                 </w:placeholder>
-                <w:dataBinding w:prefixMappings="xmlns:ns0='urn:microsoft-dynamics-nav/reports/PaymentReceipt/50112/' " w:xpath="/ns0:NavWordReportXmlPart[1]/ns0:GenJournalLine[1]/ns0:Customer[1]/ns0:E_Mail[1]" w:storeItemID="{072A5C88-FD1B-4274-ACD9-2C46D19524E4}"/>
+                <w:dataBinding w:prefixMappings="xmlns:ns0='urn:microsoft-dynamics-nav/reports/PaymentReceipt/50112/'" w:xpath="/ns0:NavWordReportXmlPart[1]/ns0:GenJournalLine[1]/ns0:Customer[1]/ns0:E_Mail[1]" w:storeItemID="{072A5C88-FD1B-4274-ACD9-2C46D19524E4}"/>
                 <w:text/>
               </w:sdtPr>
               <w:sdtContent>
@@ -464,11 +472,13 @@
             </w:r>
             <w:sdt>
               <w:sdtPr>
+                <w:alias w:val="#Nav: /GenJournalLine/Document_No_"/>
+                <w:tag w:val="#Nav: PaymentReceipt/50112"/>
                 <w:id w:val="634057254"/>
                 <w:placeholder>
                   <w:docPart w:val="DefaultPlaceholder_-1854013440"/>
                 </w:placeholder>
-                <w:dataBinding w:prefixMappings="xmlns:ns0='urn:microsoft-dynamics-nav/reports/PaymentReceipt/50112/' " w:xpath="/ns0:NavWordReportXmlPart[1]/ns0:GenJournalLine[1]/ns0:Document_No_[1]" w:storeItemID="{072A5C88-FD1B-4274-ACD9-2C46D19524E4}"/>
+                <w:dataBinding w:prefixMappings="xmlns:ns0='urn:microsoft-dynamics-nav/reports/PaymentReceipt/50112/'" w:xpath="/ns0:NavWordReportXmlPart[1]/ns0:GenJournalLine[1]/ns0:Document_No_[1]" w:storeItemID="{072A5C88-FD1B-4274-ACD9-2C46D19524E4}"/>
                 <w:text/>
               </w:sdtPr>
               <w:sdtContent>
@@ -532,11 +542,13 @@
             </w:r>
             <w:sdt>
               <w:sdtPr>
+                <w:alias w:val="#Nav: /GenJournalLine/ApptoDocNo"/>
+                <w:tag w:val="#Nav: PaymentReceipt/50112"/>
                 <w:id w:val="-736398953"/>
                 <w:placeholder>
                   <w:docPart w:val="DefaultPlaceholder_-1854013440"/>
                 </w:placeholder>
-                <w:dataBinding w:prefixMappings="xmlns:ns0='urn:microsoft-dynamics-nav/reports/PaymentReceipt/50112/' " w:xpath="/ns0:NavWordReportXmlPart[1]/ns0:GenJournalLine[1]/ns0:ApptoDocNo[1]" w:storeItemID="{072A5C88-FD1B-4274-ACD9-2C46D19524E4}"/>
+                <w:dataBinding w:prefixMappings="xmlns:ns0='urn:microsoft-dynamics-nav/reports/PaymentReceipt/50112/'" w:xpath="/ns0:NavWordReportXmlPart[1]/ns0:GenJournalLine[1]/ns0:ApptoDocNo[1]" w:storeItemID="{072A5C88-FD1B-4274-ACD9-2C46D19524E4}"/>
                 <w:text/>
               </w:sdtPr>
               <w:sdtContent>
@@ -588,11 +600,13 @@
             </w:r>
             <w:sdt>
               <w:sdtPr>
+                <w:alias w:val="#Nav: /GenJournalLine/CurrentDate"/>
+                <w:tag w:val="#Nav: PaymentReceipt/50112"/>
                 <w:id w:val="4488037"/>
                 <w:placeholder>
                   <w:docPart w:val="DefaultPlaceholder_-1854013440"/>
                 </w:placeholder>
-                <w:dataBinding w:prefixMappings="xmlns:ns0='urn:microsoft-dynamics-nav/reports/PaymentReceipt/50112/' " w:xpath="/ns0:NavWordReportXmlPart[1]/ns0:GenJournalLine[1]/ns0:CurrentDate[1]" w:storeItemID="{072A5C88-FD1B-4274-ACD9-2C46D19524E4}"/>
+                <w:dataBinding w:prefixMappings="xmlns:ns0='urn:microsoft-dynamics-nav/reports/PaymentReceipt/50112/'" w:xpath="/ns0:NavWordReportXmlPart[1]/ns0:GenJournalLine[1]/ns0:CurrentDate[1]" w:storeItemID="{072A5C88-FD1B-4274-ACD9-2C46D19524E4}"/>
                 <w:text/>
               </w:sdtPr>
               <w:sdtContent>
@@ -644,11 +658,13 @@
             </w:r>
             <w:sdt>
               <w:sdtPr>
+                <w:alias w:val="#Nav: /GenJournalLine/Sales_Invoice_Header/Posting_Date_sales"/>
+                <w:tag w:val="#Nav: PaymentReceipt/50112"/>
                 <w:id w:val="1446036124"/>
                 <w:placeholder>
                   <w:docPart w:val="DefaultPlaceholder_-1854013440"/>
                 </w:placeholder>
-                <w:dataBinding w:prefixMappings="xmlns:ns0='urn:microsoft-dynamics-nav/reports/PaymentReceipt/50112/' " w:xpath="/ns0:NavWordReportXmlPart[1]/ns0:GenJournalLine[1]/ns0:Sales_Invoice_Header[1]/ns0:Posting_Date_sales[1]" w:storeItemID="{072A5C88-FD1B-4274-ACD9-2C46D19524E4}"/>
+                <w:dataBinding w:prefixMappings="xmlns:ns0='urn:microsoft-dynamics-nav/reports/PaymentReceipt/50112/'" w:xpath="/ns0:NavWordReportXmlPart[1]/ns0:GenJournalLine[1]/ns0:Sales_Invoice_Header[1]/ns0:Posting_Date_sales[1]" w:storeItemID="{072A5C88-FD1B-4274-ACD9-2C46D19524E4}"/>
                 <w:text/>
               </w:sdtPr>
               <w:sdtContent>
@@ -755,7 +771,7 @@
             <w:tcBorders>
               <w:top w:val="nil"/>
               <w:left w:val="nil"/>
-              <w:bottom w:val="single" w:sz="12" w:space="0" w:color="auto"/>
+              <w:bottom w:val="single" w:color="auto" w:sz="12" w:space="0"/>
               <w:right w:val="nil"/>
             </w:tcBorders>
           </w:tcPr>
@@ -781,7 +797,7 @@
             <w:tcBorders>
               <w:top w:val="nil"/>
               <w:left w:val="nil"/>
-              <w:bottom w:val="single" w:sz="12" w:space="0" w:color="auto"/>
+              <w:bottom w:val="single" w:color="auto" w:sz="12" w:space="0"/>
               <w:right w:val="nil"/>
             </w:tcBorders>
           </w:tcPr>
@@ -807,7 +823,7 @@
             <w:tcBorders>
               <w:top w:val="nil"/>
               <w:left w:val="nil"/>
-              <w:bottom w:val="single" w:sz="12" w:space="0" w:color="auto"/>
+              <w:bottom w:val="single" w:color="auto" w:sz="12" w:space="0"/>
               <w:right w:val="nil"/>
             </w:tcBorders>
           </w:tcPr>
@@ -833,7 +849,7 @@
             <w:tcBorders>
               <w:top w:val="nil"/>
               <w:left w:val="nil"/>
-              <w:bottom w:val="single" w:sz="12" w:space="0" w:color="auto"/>
+              <w:bottom w:val="single" w:color="auto" w:sz="12" w:space="0"/>
               <w:right w:val="nil"/>
             </w:tcBorders>
           </w:tcPr>
@@ -860,7 +876,7 @@
             <w:tcBorders>
               <w:top w:val="nil"/>
               <w:left w:val="nil"/>
-              <w:bottom w:val="single" w:sz="12" w:space="0" w:color="auto"/>
+              <w:bottom w:val="single" w:color="auto" w:sz="12" w:space="0"/>
               <w:right w:val="nil"/>
             </w:tcBorders>
           </w:tcPr>
@@ -886,7 +902,7 @@
             <w:tcBorders>
               <w:top w:val="nil"/>
               <w:left w:val="nil"/>
-              <w:bottom w:val="single" w:sz="12" w:space="0" w:color="auto"/>
+              <w:bottom w:val="single" w:color="auto" w:sz="12" w:space="0"/>
               <w:right w:val="nil"/>
             </w:tcBorders>
           </w:tcPr>
@@ -914,7 +930,7 @@
             <w:tcBorders>
               <w:top w:val="nil"/>
               <w:left w:val="nil"/>
-              <w:bottom w:val="single" w:sz="12" w:space="0" w:color="auto"/>
+              <w:bottom w:val="single" w:color="auto" w:sz="12" w:space="0"/>
               <w:right w:val="nil"/>
             </w:tcBorders>
           </w:tcPr>
@@ -941,7 +957,7 @@
             <w:tcBorders>
               <w:top w:val="nil"/>
               <w:left w:val="nil"/>
-              <w:bottom w:val="single" w:sz="12" w:space="0" w:color="auto"/>
+              <w:bottom w:val="single" w:color="auto" w:sz="12" w:space="0"/>
               <w:right w:val="nil"/>
             </w:tcBorders>
           </w:tcPr>
@@ -979,293 +995,331 @@
           </w:p>
         </w:tc>
       </w:tr>
-      <w:tr>
-        <w:trPr>
-          <w:trHeight w:val="539"/>
-        </w:trPr>
-        <w:sdt>
-          <w:sdtPr>
-            <w:rPr>
-              <w:sz w:val="20"/>
-              <w:szCs w:val="20"/>
-            </w:rPr>
-            <w:id w:val="1507392582"/>
-            <w:placeholder>
-              <w:docPart w:val="DefaultPlaceholder_-1854013440"/>
-            </w:placeholder>
-            <w:dataBinding w:prefixMappings="xmlns:ns0='urn:microsoft-dynamics-nav/reports/PaymentReceipt/50112/' " w:xpath="/ns0:NavWordReportXmlPart[1]/ns0:GenJournalLine[1]/ns0:Posting_Date[1]" w:storeItemID="{072A5C88-FD1B-4274-ACD9-2C46D19524E4}"/>
-            <w:text/>
-          </w:sdtPr>
-          <w:sdtContent>
-            <w:tc>
-              <w:tcPr>
-                <w:tcW w:w="1272" w:type="dxa"/>
-                <w:tcBorders>
-                  <w:top w:val="single" w:sz="12" w:space="0" w:color="auto"/>
-                  <w:left w:val="nil"/>
-                  <w:bottom w:val="nil"/>
-                  <w:right w:val="nil"/>
-                </w:tcBorders>
-              </w:tcPr>
-              <w:p>
-                <w:pPr>
-                  <w:spacing w:before="120"/>
-                  <w:rPr>
-                    <w:sz w:val="20"/>
-                    <w:szCs w:val="20"/>
-                  </w:rPr>
-                </w:pPr>
-                <w:proofErr w:type="spellStart"/>
-                <w:r>
-                  <w:rPr>
-                    <w:sz w:val="20"/>
-                    <w:szCs w:val="20"/>
-                  </w:rPr>
-                  <w:t>Posting_Date</w:t>
-                </w:r>
-                <w:proofErr w:type="spellEnd"/>
-              </w:p>
-            </w:tc>
-          </w:sdtContent>
-        </w:sdt>
-        <w:sdt>
-          <w:sdtPr>
-            <w:rPr>
-              <w:sz w:val="20"/>
-              <w:szCs w:val="20"/>
-            </w:rPr>
-            <w:id w:val="-271789928"/>
-            <w:placeholder>
-              <w:docPart w:val="DefaultPlaceholder_-1854013440"/>
-            </w:placeholder>
-            <w:dataBinding w:prefixMappings="xmlns:ns0='urn:microsoft-dynamics-nav/reports/PaymentReceipt/50112/' " w:xpath="/ns0:NavWordReportXmlPart[1]/ns0:GenJournalLine[1]/ns0:ApptoDocType[1]" w:storeItemID="{072A5C88-FD1B-4274-ACD9-2C46D19524E4}"/>
-            <w:text/>
-          </w:sdtPr>
-          <w:sdtContent>
-            <w:tc>
-              <w:tcPr>
-                <w:tcW w:w="1555" w:type="dxa"/>
-                <w:tcBorders>
-                  <w:top w:val="single" w:sz="12" w:space="0" w:color="auto"/>
-                  <w:left w:val="nil"/>
-                  <w:bottom w:val="nil"/>
-                  <w:right w:val="nil"/>
-                </w:tcBorders>
-              </w:tcPr>
-              <w:p>
-                <w:pPr>
-                  <w:spacing w:before="120"/>
-                  <w:rPr>
-                    <w:sz w:val="20"/>
-                    <w:szCs w:val="20"/>
-                  </w:rPr>
-                </w:pPr>
-                <w:proofErr w:type="spellStart"/>
-                <w:r>
-                  <w:rPr>
-                    <w:sz w:val="20"/>
-                    <w:szCs w:val="20"/>
-                  </w:rPr>
-                  <w:t>ApptoDocType</w:t>
-                </w:r>
-                <w:proofErr w:type="spellEnd"/>
-              </w:p>
-            </w:tc>
-          </w:sdtContent>
-        </w:sdt>
-        <w:sdt>
-          <w:sdtPr>
-            <w:rPr>
-              <w:sz w:val="20"/>
-              <w:szCs w:val="20"/>
-            </w:rPr>
-            <w:id w:val="-289591888"/>
-            <w:placeholder>
-              <w:docPart w:val="DefaultPlaceholder_-1854013440"/>
-            </w:placeholder>
-            <w:dataBinding w:prefixMappings="xmlns:ns0='urn:microsoft-dynamics-nav/reports/PaymentReceipt/50112/' " w:xpath="/ns0:NavWordReportXmlPart[1]/ns0:GenJournalLine[1]/ns0:ApptoDocNo[1]" w:storeItemID="{072A5C88-FD1B-4274-ACD9-2C46D19524E4}"/>
-            <w:text/>
-          </w:sdtPr>
-          <w:sdtContent>
-            <w:tc>
-              <w:tcPr>
-                <w:tcW w:w="1340" w:type="dxa"/>
-                <w:tcBorders>
-                  <w:top w:val="single" w:sz="12" w:space="0" w:color="auto"/>
-                  <w:left w:val="nil"/>
-                  <w:bottom w:val="nil"/>
-                  <w:right w:val="nil"/>
-                </w:tcBorders>
-              </w:tcPr>
-              <w:p>
-                <w:pPr>
-                  <w:spacing w:before="120"/>
-                  <w:rPr>
-                    <w:sz w:val="20"/>
-                    <w:szCs w:val="20"/>
-                  </w:rPr>
-                </w:pPr>
-                <w:proofErr w:type="spellStart"/>
-                <w:r>
-                  <w:rPr>
-                    <w:sz w:val="20"/>
-                    <w:szCs w:val="20"/>
-                  </w:rPr>
-                  <w:t>ApptoDocNo</w:t>
-                </w:r>
-                <w:proofErr w:type="spellEnd"/>
-              </w:p>
-            </w:tc>
-          </w:sdtContent>
-        </w:sdt>
-        <w:tc>
-          <w:tcPr>
-            <w:tcW w:w="2070" w:type="dxa"/>
-            <w:tcBorders>
-              <w:top w:val="single" w:sz="12" w:space="0" w:color="auto"/>
-              <w:left w:val="nil"/>
-              <w:bottom w:val="nil"/>
-              <w:right w:val="nil"/>
-            </w:tcBorders>
-          </w:tcPr>
-          <w:p>
-            <w:pPr>
-              <w:spacing w:before="120"/>
+      <w:sdt>
+        <w:sdtPr>
+          <w:rPr>
+            <w:sz w:val="20"/>
+            <w:szCs w:val="20"/>
+          </w:rPr>
+          <w:alias w:val="#Nav: /GenJournalLine"/>
+          <w:tag w:val="#Nav: PaymentReceipt/50112"/>
+          <w:id w:val="126594104"/>
+          <w15:dataBinding w:prefixMappings="xmlns:ns0='urn:microsoft-dynamics-nav/reports/PaymentReceipt/50112/'" w:xpath="/ns0:NavWordReportXmlPart[1]/ns0:GenJournalLine" w:storeItemID="{072A5C88-FD1B-4274-ACD9-2C46D19524E4}"/>
+          <w15:repeatingSection/>
+        </w:sdtPr>
+        <w:sdtContent>
+          <w:sdt>
+            <w:sdtPr>
               <w:rPr>
                 <w:sz w:val="20"/>
                 <w:szCs w:val="20"/>
               </w:rPr>
-            </w:pPr>
-          </w:p>
-        </w:tc>
-        <w:tc>
-          <w:tcPr>
-            <w:tcW w:w="1134" w:type="dxa"/>
-            <w:tcBorders>
-              <w:top w:val="single" w:sz="12" w:space="0" w:color="auto"/>
-              <w:left w:val="nil"/>
-              <w:bottom w:val="nil"/>
-              <w:right w:val="nil"/>
-            </w:tcBorders>
-          </w:tcPr>
-          <w:p>
-            <w:pPr>
-              <w:spacing w:before="120"/>
-              <w:rPr>
-                <w:sz w:val="20"/>
-                <w:szCs w:val="20"/>
-              </w:rPr>
-            </w:pPr>
-            <w:r>
-              <w:rPr>
-                <w:sz w:val="20"/>
-                <w:szCs w:val="20"/>
-              </w:rPr>
-              <w:t>AED</w:t>
-            </w:r>
-          </w:p>
-        </w:tc>
-        <w:sdt>
-          <w:sdtPr>
-            <w:rPr>
-              <w:sz w:val="20"/>
-              <w:szCs w:val="20"/>
-            </w:rPr>
-            <w:id w:val="1888225831"/>
-            <w:placeholder>
-              <w:docPart w:val="DefaultPlaceholder_-1854013440"/>
-            </w:placeholder>
-            <w:dataBinding w:prefixMappings="xmlns:ns0='urn:microsoft-dynamics-nav/reports/PaymentReceipt/50112/' " w:xpath="/ns0:NavWordReportXmlPart[1]/ns0:GenJournalLine[1]/ns0:Amount[1]" w:storeItemID="{072A5C88-FD1B-4274-ACD9-2C46D19524E4}"/>
-            <w:text/>
-          </w:sdtPr>
-          <w:sdtContent>
-            <w:tc>
-              <w:tcPr>
-                <w:tcW w:w="1134" w:type="dxa"/>
-                <w:tcBorders>
-                  <w:top w:val="single" w:sz="12" w:space="0" w:color="auto"/>
-                  <w:left w:val="nil"/>
-                  <w:bottom w:val="single" w:sz="12" w:space="0" w:color="auto"/>
-                  <w:right w:val="nil"/>
-                </w:tcBorders>
-              </w:tcPr>
-              <w:p>
-                <w:pPr>
-                  <w:spacing w:before="120"/>
-                  <w:jc w:val="right"/>
-                  <w:rPr>
-                    <w:sz w:val="20"/>
-                    <w:szCs w:val="20"/>
-                  </w:rPr>
-                </w:pPr>
-                <w:r>
-                  <w:rPr>
-                    <w:sz w:val="20"/>
-                    <w:szCs w:val="20"/>
-                  </w:rPr>
-                  <w:t>Amount</w:t>
-                </w:r>
-              </w:p>
-            </w:tc>
-          </w:sdtContent>
-        </w:sdt>
-        <w:tc>
-          <w:tcPr>
-            <w:tcW w:w="1134" w:type="dxa"/>
-            <w:tcBorders>
-              <w:top w:val="single" w:sz="12" w:space="0" w:color="auto"/>
-              <w:left w:val="nil"/>
-              <w:bottom w:val="nil"/>
-              <w:right w:val="nil"/>
-            </w:tcBorders>
-          </w:tcPr>
-          <w:p>
-            <w:pPr>
-              <w:spacing w:before="120"/>
-              <w:jc w:val="right"/>
-              <w:rPr>
-                <w:sz w:val="20"/>
-                <w:szCs w:val="20"/>
-              </w:rPr>
-            </w:pPr>
-            <w:r>
-              <w:rPr>
-                <w:sz w:val="20"/>
-                <w:szCs w:val="20"/>
-              </w:rPr>
-              <w:t>0.00</w:t>
-            </w:r>
-          </w:p>
-        </w:tc>
-        <w:tc>
-          <w:tcPr>
-            <w:tcW w:w="1134" w:type="dxa"/>
-            <w:tcBorders>
-              <w:top w:val="single" w:sz="12" w:space="0" w:color="auto"/>
-              <w:left w:val="nil"/>
-              <w:bottom w:val="nil"/>
-              <w:right w:val="nil"/>
-            </w:tcBorders>
-          </w:tcPr>
-          <w:p>
-            <w:pPr>
-              <w:spacing w:before="120"/>
-              <w:jc w:val="right"/>
-              <w:rPr>
-                <w:sz w:val="20"/>
-                <w:szCs w:val="20"/>
-              </w:rPr>
-            </w:pPr>
-            <w:r>
-              <w:rPr>
-                <w:sz w:val="20"/>
-                <w:szCs w:val="20"/>
-              </w:rPr>
-              <w:t>0.00</w:t>
-            </w:r>
-          </w:p>
-        </w:tc>
-      </w:tr>
+              <w:id w:val="-153991900"/>
+              <w:placeholder>
+                <w:docPart w:val="DefaultPlaceholder_-1854013435"/>
+              </w:placeholder>
+              <w15:repeatingSectionItem/>
+            </w:sdtPr>
+            <w:sdtContent>
+              <w:tr>
+                <w:trPr>
+                  <w:trHeight w:val="539"/>
+                </w:trPr>
+                <w:sdt>
+                  <w:sdtPr>
+                    <w:rPr>
+                      <w:sz w:val="20"/>
+                      <w:szCs w:val="20"/>
+                    </w:rPr>
+                    <w:alias w:val="#Nav: /GenJournalLine/Posting_Date"/>
+                    <w:tag w:val="#Nav: PaymentReceipt/50112"/>
+                    <w:id w:val="1507392582"/>
+                    <w:placeholder>
+                      <w:docPart w:val="DefaultPlaceholder_-1854013440"/>
+                    </w:placeholder>
+                    <w:dataBinding w:prefixMappings="xmlns:ns0='urn:microsoft-dynamics-nav/reports/PaymentReceipt/50112/'" w:xpath="/ns0:NavWordReportXmlPart[1]/ns0:GenJournalLine[1]/ns0:Posting_Date[1]" w:storeItemID="{072A5C88-FD1B-4274-ACD9-2C46D19524E4}"/>
+                    <w:text/>
+                  </w:sdtPr>
+                  <w:sdtContent>
+                    <w:tc>
+                      <w:tcPr>
+                        <w:tcW w:w="1272" w:type="dxa"/>
+                        <w:tcBorders>
+                          <w:top w:val="single" w:color="auto" w:sz="12" w:space="0"/>
+                          <w:left w:val="nil"/>
+                          <w:bottom w:val="nil"/>
+                          <w:right w:val="nil"/>
+                        </w:tcBorders>
+                      </w:tcPr>
+                      <w:p>
+                        <w:pPr>
+                          <w:spacing w:before="120"/>
+                          <w:rPr>
+                            <w:sz w:val="20"/>
+                            <w:szCs w:val="20"/>
+                          </w:rPr>
+                        </w:pPr>
+                        <w:proofErr w:type="spellStart"/>
+                        <w:r>
+                          <w:rPr>
+                            <w:sz w:val="20"/>
+                            <w:szCs w:val="20"/>
+                          </w:rPr>
+                          <w:t>Posting_Date</w:t>
+                        </w:r>
+                        <w:proofErr w:type="spellEnd"/>
+                      </w:p>
+                    </w:tc>
+                  </w:sdtContent>
+                </w:sdt>
+                <w:sdt>
+                  <w:sdtPr>
+                    <w:rPr>
+                      <w:sz w:val="20"/>
+                      <w:szCs w:val="20"/>
+                    </w:rPr>
+                    <w:alias w:val="#Nav: /GenJournalLine/ApptoDocType"/>
+                    <w:tag w:val="#Nav: PaymentReceipt/50112"/>
+                    <w:id w:val="-271789928"/>
+                    <w:placeholder>
+                      <w:docPart w:val="DefaultPlaceholder_-1854013440"/>
+                    </w:placeholder>
+                    <w:dataBinding w:prefixMappings="xmlns:ns0='urn:microsoft-dynamics-nav/reports/PaymentReceipt/50112/'" w:xpath="/ns0:NavWordReportXmlPart[1]/ns0:GenJournalLine[1]/ns0:ApptoDocType[1]" w:storeItemID="{072A5C88-FD1B-4274-ACD9-2C46D19524E4}"/>
+                    <w:text/>
+                  </w:sdtPr>
+                  <w:sdtContent>
+                    <w:tc>
+                      <w:tcPr>
+                        <w:tcW w:w="1555" w:type="dxa"/>
+                        <w:tcBorders>
+                          <w:top w:val="single" w:color="auto" w:sz="12" w:space="0"/>
+                          <w:left w:val="nil"/>
+                          <w:bottom w:val="nil"/>
+                          <w:right w:val="nil"/>
+                        </w:tcBorders>
+                      </w:tcPr>
+                      <w:p>
+                        <w:pPr>
+                          <w:spacing w:before="120"/>
+                          <w:rPr>
+                            <w:sz w:val="20"/>
+                            <w:szCs w:val="20"/>
+                          </w:rPr>
+                        </w:pPr>
+                        <w:proofErr w:type="spellStart"/>
+                        <w:r>
+                          <w:rPr>
+                            <w:sz w:val="20"/>
+                            <w:szCs w:val="20"/>
+                          </w:rPr>
+                          <w:t>ApptoDocType</w:t>
+                        </w:r>
+                        <w:proofErr w:type="spellEnd"/>
+                      </w:p>
+                    </w:tc>
+                  </w:sdtContent>
+                </w:sdt>
+                <w:sdt>
+                  <w:sdtPr>
+                    <w:rPr>
+                      <w:sz w:val="20"/>
+                      <w:szCs w:val="20"/>
+                    </w:rPr>
+                    <w:alias w:val="#Nav: /GenJournalLine/ApptoDocNo"/>
+                    <w:tag w:val="#Nav: PaymentReceipt/50112"/>
+                    <w:id w:val="-289591888"/>
+                    <w:placeholder>
+                      <w:docPart w:val="DefaultPlaceholder_-1854013440"/>
+                    </w:placeholder>
+                    <w:dataBinding w:prefixMappings="xmlns:ns0='urn:microsoft-dynamics-nav/reports/PaymentReceipt/50112/'" w:xpath="/ns0:NavWordReportXmlPart[1]/ns0:GenJournalLine[1]/ns0:ApptoDocNo[1]" w:storeItemID="{072A5C88-FD1B-4274-ACD9-2C46D19524E4}"/>
+                    <w:text/>
+                  </w:sdtPr>
+                  <w:sdtContent>
+                    <w:tc>
+                      <w:tcPr>
+                        <w:tcW w:w="1340" w:type="dxa"/>
+                        <w:tcBorders>
+                          <w:top w:val="single" w:color="auto" w:sz="12" w:space="0"/>
+                          <w:left w:val="nil"/>
+                          <w:bottom w:val="nil"/>
+                          <w:right w:val="nil"/>
+                        </w:tcBorders>
+                      </w:tcPr>
+                      <w:p>
+                        <w:pPr>
+                          <w:spacing w:before="120"/>
+                          <w:rPr>
+                            <w:sz w:val="20"/>
+                            <w:szCs w:val="20"/>
+                          </w:rPr>
+                        </w:pPr>
+                        <w:proofErr w:type="spellStart"/>
+                        <w:r>
+                          <w:rPr>
+                            <w:sz w:val="20"/>
+                            <w:szCs w:val="20"/>
+                          </w:rPr>
+                          <w:t>ApptoDocNo</w:t>
+                        </w:r>
+                        <w:proofErr w:type="spellEnd"/>
+                      </w:p>
+                    </w:tc>
+                  </w:sdtContent>
+                </w:sdt>
+                <w:tc>
+                  <w:tcPr>
+                    <w:tcW w:w="2070" w:type="dxa"/>
+                    <w:tcBorders>
+                      <w:top w:val="single" w:color="auto" w:sz="12" w:space="0"/>
+                      <w:left w:val="nil"/>
+                      <w:bottom w:val="nil"/>
+                      <w:right w:val="nil"/>
+                    </w:tcBorders>
+                  </w:tcPr>
+                  <w:p>
+                    <w:pPr>
+                      <w:spacing w:before="120"/>
+                      <w:rPr>
+                        <w:sz w:val="20"/>
+                        <w:szCs w:val="20"/>
+                      </w:rPr>
+                    </w:pPr>
+                  </w:p>
+                </w:tc>
+                <w:tc>
+                  <w:tcPr>
+                    <w:tcW w:w="1134" w:type="dxa"/>
+                    <w:tcBorders>
+                      <w:top w:val="single" w:color="auto" w:sz="12" w:space="0"/>
+                      <w:left w:val="nil"/>
+                      <w:bottom w:val="nil"/>
+                      <w:right w:val="nil"/>
+                    </w:tcBorders>
+                  </w:tcPr>
+                  <w:p>
+                    <w:pPr>
+                      <w:spacing w:before="120"/>
+                      <w:rPr>
+                        <w:sz w:val="20"/>
+                        <w:szCs w:val="20"/>
+                      </w:rPr>
+                    </w:pPr>
+                    <w:r>
+                      <w:rPr>
+                        <w:sz w:val="20"/>
+                        <w:szCs w:val="20"/>
+                      </w:rPr>
+                      <w:t>AED</w:t>
+                    </w:r>
+                  </w:p>
+                </w:tc>
+                <w:sdt>
+                  <w:sdtPr>
+                    <w:rPr>
+                      <w:sz w:val="20"/>
+                      <w:szCs w:val="20"/>
+                    </w:rPr>
+                    <w:alias w:val="#Nav: /GenJournalLine/Amount"/>
+                    <w:tag w:val="#Nav: PaymentReceipt/50112"/>
+                    <w:id w:val="1888225831"/>
+                    <w:placeholder>
+                      <w:docPart w:val="DefaultPlaceholder_-1854013440"/>
+                    </w:placeholder>
+                    <w:dataBinding w:prefixMappings="xmlns:ns0='urn:microsoft-dynamics-nav/reports/PaymentReceipt/50112/'" w:xpath="/ns0:NavWordReportXmlPart[1]/ns0:GenJournalLine[1]/ns0:Amount[1]" w:storeItemID="{072A5C88-FD1B-4274-ACD9-2C46D19524E4}"/>
+                    <w:text/>
+                  </w:sdtPr>
+                  <w:sdtContent>
+                    <w:tc>
+                      <w:tcPr>
+                        <w:tcW w:w="1134" w:type="dxa"/>
+                        <w:tcBorders>
+                          <w:top w:val="single" w:color="auto" w:sz="12" w:space="0"/>
+                          <w:left w:val="nil"/>
+                          <w:bottom w:val="single" w:color="auto" w:sz="12" w:space="0"/>
+                          <w:right w:val="nil"/>
+                        </w:tcBorders>
+                      </w:tcPr>
+                      <w:p>
+                        <w:pPr>
+                          <w:spacing w:before="120"/>
+                          <w:jc w:val="right"/>
+                          <w:rPr>
+                            <w:sz w:val="20"/>
+                            <w:szCs w:val="20"/>
+                          </w:rPr>
+                        </w:pPr>
+                        <w:r>
+                          <w:rPr>
+                            <w:sz w:val="20"/>
+                            <w:szCs w:val="20"/>
+                          </w:rPr>
+                          <w:t>Amount</w:t>
+                        </w:r>
+                      </w:p>
+                    </w:tc>
+                  </w:sdtContent>
+                </w:sdt>
+                <w:tc>
+                  <w:tcPr>
+                    <w:tcW w:w="1134" w:type="dxa"/>
+                    <w:tcBorders>
+                      <w:top w:val="single" w:color="auto" w:sz="12" w:space="0"/>
+                      <w:left w:val="nil"/>
+                      <w:bottom w:val="nil"/>
+                      <w:right w:val="nil"/>
+                    </w:tcBorders>
+                  </w:tcPr>
+                  <w:p>
+                    <w:pPr>
+                      <w:spacing w:before="120"/>
+                      <w:jc w:val="right"/>
+                      <w:rPr>
+                        <w:sz w:val="20"/>
+                        <w:szCs w:val="20"/>
+                      </w:rPr>
+                    </w:pPr>
+                    <w:r>
+                      <w:rPr>
+                        <w:sz w:val="20"/>
+                        <w:szCs w:val="20"/>
+                      </w:rPr>
+                      <w:t>0.00</w:t>
+                    </w:r>
+                  </w:p>
+                </w:tc>
+                <w:tc>
+                  <w:tcPr>
+                    <w:tcW w:w="1134" w:type="dxa"/>
+                    <w:tcBorders>
+                      <w:top w:val="single" w:color="auto" w:sz="12" w:space="0"/>
+                      <w:left w:val="nil"/>
+                      <w:bottom w:val="nil"/>
+                      <w:right w:val="nil"/>
+                    </w:tcBorders>
+                  </w:tcPr>
+                  <w:p>
+                    <w:pPr>
+                      <w:spacing w:before="120"/>
+                      <w:jc w:val="right"/>
+                      <w:rPr>
+                        <w:sz w:val="20"/>
+                        <w:szCs w:val="20"/>
+                      </w:rPr>
+                    </w:pPr>
+                    <w:r>
+                      <w:rPr>
+                        <w:sz w:val="20"/>
+                        <w:szCs w:val="20"/>
+                      </w:rPr>
+                      <w:t>0.00</w:t>
+                    </w:r>
+                  </w:p>
+                </w:tc>
+              </w:tr>
+            </w:sdtContent>
+          </w:sdt>
+        </w:sdtContent>
+      </w:sdt>
       <w:tr>
         <w:trPr>
           <w:trHeight w:val="261"/>
@@ -1332,19 +1386,21 @@
               <w:b/>
               <w:bCs/>
             </w:rPr>
-            <w:id w:val="1702595389"/>
+            <w:id w:val="247847589"/>
             <w:placeholder>
               <w:docPart w:val="DefaultPlaceholder_-1854013440"/>
             </w:placeholder>
-            <w:dataBinding w:prefixMappings="xmlns:ns0='urn:microsoft-dynamics-nav/reports/PaymentReceipt/50112/' " w:xpath="/ns0:NavWordReportXmlPart[1]/ns0:GenJournalLine[1]/ns0:Amount[1]" w:storeItemID="{072A5C88-FD1B-4274-ACD9-2C46D19524E4}"/>
+            <w:dataBinding w:prefixMappings="xmlns:ns0='urn:microsoft-dynamics-nav/reports/PaymentReceipt/50112/'" w:xpath="/ns0:NavWordReportXmlPart[1]/ns0:GenJournalLine[1]/ns0:Totals[1]/ns0:TAmount[1]" w:storeItemID="{072A5C88-FD1B-4274-ACD9-2C46D19524E4}"/>
             <w:text/>
+            <w:alias w:val="#Nav: /GenJournalLine/Totals/TAmount"/>
+            <w:tag w:val="#Nav: PaymentReceipt/50112"/>
           </w:sdtPr>
           <w:sdtContent>
             <w:tc>
               <w:tcPr>
                 <w:tcW w:w="1134" w:type="dxa"/>
                 <w:tcBorders>
-                  <w:top w:val="single" w:sz="12" w:space="0" w:color="auto"/>
+                  <w:top w:val="single" w:color="auto" w:sz="12" w:space="0"/>
                   <w:left w:val="nil"/>
                   <w:bottom w:val="nil"/>
                   <w:right w:val="nil"/>
@@ -1359,13 +1415,15 @@
                     <w:bCs/>
                   </w:rPr>
                 </w:pPr>
+                <w:proofErr w:type="spellStart"/>
                 <w:r>
                   <w:rPr>
                     <w:b/>
                     <w:bCs/>
                   </w:rPr>
-                  <w:t>Amount</w:t>
+                  <w:t>TAmount</w:t>
                 </w:r>
+                <w:proofErr w:type="spellEnd"/>
               </w:p>
             </w:tc>
           </w:sdtContent>
@@ -1456,7 +1514,7 @@
 </file>
 
 <file path=word/header1.xml><?xml version="1.0" encoding="utf-8"?>
-<w:hdr xmlns:wpc="http://schemas.microsoft.com/office/word/2010/wordprocessingCanvas" xmlns:cx="http://schemas.microsoft.com/office/drawing/2014/chartex" xmlns:cx1="http://schemas.microsoft.com/office/drawing/2015/9/8/chartex" xmlns:cx2="http://schemas.microsoft.com/office/drawing/2015/10/21/chartex" xmlns:cx3="http://schemas.microsoft.com/office/drawing/2016/5/9/chartex" xmlns:cx4="http://schemas.microsoft.com/office/drawing/2016/5/10/chartex" xmlns:cx5="http://schemas.microsoft.com/office/drawing/2016/5/11/chartex" xmlns:cx6="http://schemas.microsoft.com/office/drawing/2016/5/12/chartex" xmlns:cx7="http://schemas.microsoft.com/office/drawing/2016/5/13/chartex" xmlns:cx8="http://schemas.microsoft.com/office/drawing/2016/5/14/chartex" xmlns:mc="http://schemas.openxmlformats.org/markup-compatibility/2006" xmlns:aink="http://schemas.microsoft.com/office/drawing/2016/ink" xmlns:am3d="http://schemas.microsoft.com/office/drawing/2017/model3d" xmlns:o="urn:schemas-microsoft-com:office:office" xmlns:oel="http://schemas.microsoft.com/office/2019/extlst" xmlns:r="http://schemas.openxmlformats.org/officeDocument/2006/relationships" xmlns:m="http://schemas.openxmlformats.org/officeDocument/2006/math" xmlns:v="urn:schemas-microsoft-com:vml" xmlns:wp14="http://schemas.microsoft.com/office/word/2010/wordprocessingDrawing" xmlns:wp="http://schemas.openxmlformats.org/drawingml/2006/wordprocessingDrawing" xmlns:w10="urn:schemas-microsoft-com:office:word" xmlns:w="http://schemas.openxmlformats.org/wordprocessingml/2006/main" xmlns:w14="http://schemas.microsoft.com/office/word/2010/wordml" xmlns:w15="http://schemas.microsoft.com/office/word/2012/wordml" xmlns:w16cex="http://schemas.microsoft.com/office/word/2018/wordml/cex" xmlns:w16cid="http://schemas.microsoft.com/office/word/2016/wordml/cid" xmlns:w16="http://schemas.microsoft.com/office/word/2018/wordml" xmlns:w16du="http://schemas.microsoft.com/office/word/2023/wordml/word16du" xmlns:w16sdtdh="http://schemas.microsoft.com/office/word/2020/wordml/sdtdatahash" xmlns:w16se="http://schemas.microsoft.com/office/word/2015/wordml/symex" xmlns:wpg="http://schemas.microsoft.com/office/word/2010/wordprocessingGroup" xmlns:wpi="http://schemas.microsoft.com/office/word/2010/wordprocessingInk" xmlns:wne="http://schemas.microsoft.com/office/word/2006/wordml" xmlns:wps="http://schemas.microsoft.com/office/word/2010/wordprocessingShape" mc:Ignorable="w14 w15 w16se w16cid w16 w16cex w16sdtdh w16du wp14">
+<w:hdr xmlns:a="http://schemas.openxmlformats.org/drawingml/2006/main" xmlns:pic="http://schemas.openxmlformats.org/drawingml/2006/picture" xmlns:wpc="http://schemas.microsoft.com/office/word/2010/wordprocessingCanvas" xmlns:cx="http://schemas.microsoft.com/office/drawing/2014/chartex" xmlns:cx1="http://schemas.microsoft.com/office/drawing/2015/9/8/chartex" xmlns:cx2="http://schemas.microsoft.com/office/drawing/2015/10/21/chartex" xmlns:cx3="http://schemas.microsoft.com/office/drawing/2016/5/9/chartex" xmlns:cx4="http://schemas.microsoft.com/office/drawing/2016/5/10/chartex" xmlns:cx5="http://schemas.microsoft.com/office/drawing/2016/5/11/chartex" xmlns:cx6="http://schemas.microsoft.com/office/drawing/2016/5/12/chartex" xmlns:cx7="http://schemas.microsoft.com/office/drawing/2016/5/13/chartex" xmlns:cx8="http://schemas.microsoft.com/office/drawing/2016/5/14/chartex" xmlns:mc="http://schemas.openxmlformats.org/markup-compatibility/2006" xmlns:aink="http://schemas.microsoft.com/office/drawing/2016/ink" xmlns:am3d="http://schemas.microsoft.com/office/drawing/2017/model3d" xmlns:o="urn:schemas-microsoft-com:office:office" xmlns:oel="http://schemas.microsoft.com/office/2019/extlst" xmlns:r="http://schemas.openxmlformats.org/officeDocument/2006/relationships" xmlns:m="http://schemas.openxmlformats.org/officeDocument/2006/math" xmlns:v="urn:schemas-microsoft-com:vml" xmlns:wp14="http://schemas.microsoft.com/office/word/2010/wordprocessingDrawing" xmlns:wp="http://schemas.openxmlformats.org/drawingml/2006/wordprocessingDrawing" xmlns:w10="urn:schemas-microsoft-com:office:word" xmlns:w="http://schemas.openxmlformats.org/wordprocessingml/2006/main" xmlns:w14="http://schemas.microsoft.com/office/word/2010/wordml" xmlns:w15="http://schemas.microsoft.com/office/word/2012/wordml" xmlns:w16cex="http://schemas.microsoft.com/office/word/2018/wordml/cex" xmlns:w16cid="http://schemas.microsoft.com/office/word/2016/wordml/cid" xmlns:w16="http://schemas.microsoft.com/office/word/2018/wordml" xmlns:w16du="http://schemas.microsoft.com/office/word/2023/wordml/word16du" xmlns:w16sdtdh="http://schemas.microsoft.com/office/word/2020/wordml/sdtdatahash" xmlns:w16se="http://schemas.microsoft.com/office/word/2015/wordml/symex" xmlns:wpg="http://schemas.microsoft.com/office/word/2010/wordprocessingGroup" xmlns:wpi="http://schemas.microsoft.com/office/word/2010/wordprocessingInk" xmlns:wne="http://schemas.microsoft.com/office/word/2006/wordml" xmlns:wps="http://schemas.microsoft.com/office/word/2010/wordprocessingShape" mc:Ignorable="w14 w15 w16se w16cid w16 w16cex w16sdtdh w16du wp14">
   <w:p>
     <w:pPr>
       <w:pStyle w:val="Header"/>
@@ -1469,7 +1527,7 @@
       <mc:AlternateContent>
         <mc:Choice Requires="wps">
           <w:drawing>
-            <wp:anchor distT="45720" distB="45720" distL="114300" distR="114300" simplePos="0" relativeHeight="251659264" behindDoc="0" locked="0" layoutInCell="1" allowOverlap="1" wp14:anchorId="0AC04D7A" wp14:editId="0A6B93C2">
+            <wp:anchor distT="45720" distB="45720" distL="114300" distR="114300" simplePos="0" relativeHeight="251659264" behindDoc="0" locked="0" layoutInCell="1" allowOverlap="1" wp14:editId="0A6B93C2" wp14:anchorId="0AC04D7A">
               <wp:simplePos x="0" y="0"/>
               <wp:positionH relativeFrom="column">
                 <wp:posOffset>3729990</wp:posOffset>
@@ -1512,8 +1570,10 @@
                       <w:txbxContent>
                         <w:sdt>
                           <w:sdtPr>
+                            <w:alias w:val="#Nav: /GenJournalLine/CompanyPicture"/>
+                            <w:tag w:val="#Nav: PaymentReceipt/50112"/>
                             <w:id w:val="707687641"/>
-                            <w:dataBinding w:prefixMappings="xmlns:ns0='urn:microsoft-dynamics-nav/reports/PaymentReceipt/50112/' " w:xpath="/ns0:NavWordReportXmlPart[1]/ns0:GenJournalLine[1]/ns0:CompanyPicture[1]" w:storeItemID="{072A5C88-FD1B-4274-ACD9-2C46D19524E4}"/>
+                            <w:dataBinding w:prefixMappings="xmlns:ns0='urn:microsoft-dynamics-nav/reports/PaymentReceipt/50112/'" w:xpath="/ns0:NavWordReportXmlPart[1]/ns0:GenJournalLine[1]/ns0:CompanyPicture[1]" w:storeItemID="{072A5C88-FD1B-4274-ACD9-2C46D19524E4}"/>
                             <w:picture/>
                           </w:sdtPr>
                           <w:sdtContent>
@@ -1523,8 +1583,8 @@
                                   <w:noProof/>
                                 </w:rPr>
                                 <w:drawing>
-                                  <wp:inline distT="0" distB="0" distL="0" distR="0" wp14:anchorId="60BB6C3C" wp14:editId="6A9A8AEB">
-                                    <wp:extent cx="2636520" cy="647700"/>
+                                  <wp:inline distT="0" distB="0" distL="0" distR="0" wp14:anchorId="60BB6C3C" wp14:editId="483229AD">
+                                    <wp:extent cx="2667000" cy="647700"/>
                                     <wp:effectExtent l="0" t="0" r="0" b="0"/>
                                     <wp:docPr id="1" name="Picture 1"/>
                                     <wp:cNvGraphicFramePr>
@@ -1548,7 +1608,7 @@
                                           <pic:spPr bwMode="auto">
                                             <a:xfrm>
                                               <a:off x="0" y="0"/>
-                                              <a:ext cx="2636520" cy="647700"/>
+                                              <a:ext cx="2667000" cy="647700"/>
                                             </a:xfrm>
                                             <a:prstGeom prst="rect">
                                               <a:avLst/>
@@ -1586,17 +1646,19 @@
         </mc:Choice>
         <mc:Fallback>
           <w:pict>
-            <v:shapetype w14:anchorId="0AC04D7A" id="_x0000_t202" coordsize="21600,21600" o:spt="202" path="m,l,21600r21600,l21600,xe">
+            <v:shapetype id="_x0000_t202" coordsize="21600,21600" o:spt="202" path="m,l,21600r21600,l21600,xe" w14:anchorId="0AC04D7A">
               <v:stroke joinstyle="miter"/>
               <v:path gradientshapeok="t" o:connecttype="rect"/>
             </v:shapetype>
-            <v:shape id="Text Box 2" o:spid="_x0000_s1026" type="#_x0000_t202" style="position:absolute;left:0;text-align:left;margin-left:293.7pt;margin-top:-18pt;width:237pt;height:58.8pt;z-index:251659264;visibility:visible;mso-wrap-style:square;mso-width-percent:0;mso-height-percent:0;mso-wrap-distance-left:9pt;mso-wrap-distance-top:3.6pt;mso-wrap-distance-right:9pt;mso-wrap-distance-bottom:3.6pt;mso-position-horizontal:absolute;mso-position-horizontal-relative:text;mso-position-vertical:absolute;mso-position-vertical-relative:text;mso-width-percent:0;mso-height-percent:0;mso-width-relative:margin;mso-height-relative:margin;v-text-anchor:top" o:gfxdata="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" stroked="f">
+            <v:shape id="Text Box 2" style="position:absolute;left:0;text-align:left;margin-left:293.7pt;margin-top:-18pt;width:237pt;height:58.8pt;z-index:251659264;visibility:visible;mso-wrap-style:square;mso-width-percent:0;mso-height-percent:0;mso-wrap-distance-left:9pt;mso-wrap-distance-top:3.6pt;mso-wrap-distance-right:9pt;mso-wrap-distance-bottom:3.6pt;mso-position-horizontal:absolute;mso-position-horizontal-relative:text;mso-position-vertical:absolute;mso-position-vertical-relative:text;mso-width-percent:0;mso-height-percent:0;mso-width-relative:margin;mso-height-relative:margin;v-text-anchor:top" o:spid="_x0000_s1026" stroked="f" type="#_x0000_t202" o:gfxdata="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">
               <v:textbox>
                 <w:txbxContent>
                   <w:sdt>
                     <w:sdtPr>
+                      <w:alias w:val="#Nav: /GenJournalLine/CompanyPicture"/>
+                      <w:tag w:val="#Nav: PaymentReceipt/50112"/>
                       <w:id w:val="707687641"/>
-                      <w:dataBinding w:prefixMappings="xmlns:ns0='urn:microsoft-dynamics-nav/reports/PaymentReceipt/50112/' " w:xpath="/ns0:NavWordReportXmlPart[1]/ns0:GenJournalLine[1]/ns0:CompanyPicture[1]" w:storeItemID="{072A5C88-FD1B-4274-ACD9-2C46D19524E4}"/>
+                      <w:dataBinding w:prefixMappings="xmlns:ns0='urn:microsoft-dynamics-nav/reports/PaymentReceipt/50112/'" w:xpath="/ns0:NavWordReportXmlPart[1]/ns0:GenJournalLine[1]/ns0:CompanyPicture[1]" w:storeItemID="{072A5C88-FD1B-4274-ACD9-2C46D19524E4}"/>
                       <w:picture/>
                     </w:sdtPr>
                     <w:sdtContent>
@@ -1606,8 +1668,8 @@
                             <w:noProof/>
                           </w:rPr>
                           <w:drawing>
-                            <wp:inline distT="0" distB="0" distL="0" distR="0" wp14:anchorId="60BB6C3C" wp14:editId="6A9A8AEB">
-                              <wp:extent cx="2636520" cy="647700"/>
+                            <wp:inline distT="0" distB="0" distL="0" distR="0" wp14:anchorId="60BB6C3C" wp14:editId="483229AD">
+                              <wp:extent cx="2667000" cy="647700"/>
                               <wp:effectExtent l="0" t="0" r="0" b="0"/>
                               <wp:docPr id="1" name="Picture 1"/>
                               <wp:cNvGraphicFramePr>
@@ -1631,7 +1693,7 @@
                                     <pic:spPr bwMode="auto">
                                       <a:xfrm>
                                         <a:off x="0" y="0"/>
-                                        <a:ext cx="2636520" cy="647700"/>
+                                        <a:ext cx="2667000" cy="647700"/>
                                       </a:xfrm>
                                       <a:prstGeom prst="rect">
                                         <a:avLst/>
@@ -2201,6 +2263,32 @@
         </w:p>
       </w:docPartBody>
     </w:docPart>
+    <w:docPart>
+      <w:docPartPr>
+        <w:name w:val="DefaultPlaceholder_-1854013435"/>
+        <w:category>
+          <w:name w:val="General"/>
+          <w:gallery w:val="placeholder"/>
+        </w:category>
+        <w:types>
+          <w:type w:val="bbPlcHdr"/>
+        </w:types>
+        <w:behaviors>
+          <w:behavior w:val="content"/>
+        </w:behaviors>
+        <w:guid w:val="{C892EF88-D813-4F50-B690-2B8D1E77F1B4}"/>
+      </w:docPartPr>
+      <w:docPartBody>
+        <w:p>
+          <w:r>
+            <w:rPr>
+              <w:rStyle w:val="PlaceholderText"/>
+            </w:rPr>
+            <w:t>Enter any content that you want to repeat, including other content controls. You can also insert this control around table rows in order to repeat parts of a table.</w:t>
+          </w:r>
+        </w:p>
+      </w:docPartBody>
+    </w:docPart>
   </w:docParts>
 </w:glossaryDocument>
 </file>
@@ -2249,9 +2337,15 @@
     <w:rsidRoot w:val="0082134E"/>
     <w:rsid w:val="0001070E"/>
     <w:rsid w:val="004825E1"/>
+    <w:rsid w:val="00563D2B"/>
     <w:rsid w:val="0082134E"/>
+    <w:rsid w:val="008928B5"/>
     <w:rsid w:val="008E558E"/>
     <w:rsid w:val="008E6806"/>
+    <w:rsid w:val="009F2EE6"/>
+    <w:rsid w:val="00BC1156"/>
+    <w:rsid w:val="00C02B33"/>
+    <w:rsid w:val="00CE70BE"/>
     <w:rsid w:val="00D20B7E"/>
     <w:rsid w:val="00D42304"/>
     <w:rsid w:val="00FC59D2"/>
@@ -2710,7 +2804,7 @@
     <w:basedOn w:val="DefaultParagraphFont"/>
     <w:uiPriority w:val="99"/>
     <w:semiHidden/>
-    <w:rsid w:val="0082134E"/>
+    <w:rsid w:val="00CE70BE"/>
     <w:rPr>
       <w:color w:val="666666"/>
     </w:rPr>
@@ -3088,6 +3182,12 @@
  
          < / C u s t _ L e d g e r _ E n t r y >   
+         < T o t a l s > + 
+             < T A m o u n t > T A m o u n t < / T A m o u n t > + 
+         < / T o t a l s > + 
      < / G e n J o u r n a l L i n e >   
  < / N a v W o r d R e p o r t X m l P a r t > 

</xml_diff>

<commit_message>
Changes in Payment Receipt
</commit_message>
<xml_diff>
--- a/PaymentReceipt.docx
+++ b/PaymentReceipt.docx
@@ -1,16 +1,17 @@
 
 <file path=word/document.xml><?xml version="1.0" encoding="utf-8"?>
-<w:document xmlns:wpc="http://schemas.microsoft.com/office/word/2010/wordprocessingCanvas" xmlns:cx="http://schemas.microsoft.com/office/drawing/2014/chartex" xmlns:cx1="http://schemas.microsoft.com/office/drawing/2015/9/8/chartex" xmlns:cx2="http://schemas.microsoft.com/office/drawing/2015/10/21/chartex" xmlns:cx3="http://schemas.microsoft.com/office/drawing/2016/5/9/chartex" xmlns:cx4="http://schemas.microsoft.com/office/drawing/2016/5/10/chartex" xmlns:cx5="http://schemas.microsoft.com/office/drawing/2016/5/11/chartex" xmlns:cx6="http://schemas.microsoft.com/office/drawing/2016/5/12/chartex" xmlns:cx7="http://schemas.microsoft.com/office/drawing/2016/5/13/chartex" xmlns:cx8="http://schemas.microsoft.com/office/drawing/2016/5/14/chartex" xmlns:mc="http://schemas.openxmlformats.org/markup-compatibility/2006" xmlns:aink="http://schemas.microsoft.com/office/drawing/2016/ink" xmlns:am3d="http://schemas.microsoft.com/office/drawing/2017/model3d" xmlns:o="urn:schemas-microsoft-com:office:office" xmlns:oel="http://schemas.microsoft.com/office/2019/extlst" xmlns:r="http://schemas.openxmlformats.org/officeDocument/2006/relationships" xmlns:m="http://schemas.openxmlformats.org/officeDocument/2006/math" xmlns:v="urn:schemas-microsoft-com:vml" xmlns:wp14="http://schemas.microsoft.com/office/word/2010/wordprocessingDrawing" xmlns:wp="http://schemas.openxmlformats.org/drawingml/2006/wordprocessingDrawing" xmlns:w10="urn:schemas-microsoft-com:office:word" xmlns:w="http://schemas.openxmlformats.org/wordprocessingml/2006/main" xmlns:w14="http://schemas.microsoft.com/office/word/2010/wordml" xmlns:w15="http://schemas.microsoft.com/office/word/2012/wordml" xmlns:w16cex="http://schemas.microsoft.com/office/word/2018/wordml/cex" xmlns:w16cid="http://schemas.microsoft.com/office/word/2016/wordml/cid" xmlns:w16="http://schemas.microsoft.com/office/word/2018/wordml" xmlns:w16du="http://schemas.microsoft.com/office/word/2023/wordml/word16du" xmlns:w16sdtdh="http://schemas.microsoft.com/office/word/2020/wordml/sdtdatahash" xmlns:w16se="http://schemas.microsoft.com/office/word/2015/wordml/symex" xmlns:wpg="http://schemas.microsoft.com/office/word/2010/wordprocessingGroup" xmlns:wpi="http://schemas.microsoft.com/office/word/2010/wordprocessingInk" xmlns:wne="http://schemas.microsoft.com/office/word/2006/wordml" xmlns:wps="http://schemas.microsoft.com/office/word/2010/wordprocessingShape" mc:Ignorable="w14 w15 w16se w16cid w16 w16cex w16sdtdh w16du wp14">
+<w:document xmlns:a="http://schemas.openxmlformats.org/drawingml/2006/main" xmlns:pic="http://schemas.openxmlformats.org/drawingml/2006/picture" xmlns:wpc="http://schemas.microsoft.com/office/word/2010/wordprocessingCanvas" xmlns:cx="http://schemas.microsoft.com/office/drawing/2014/chartex" xmlns:cx1="http://schemas.microsoft.com/office/drawing/2015/9/8/chartex" xmlns:cx2="http://schemas.microsoft.com/office/drawing/2015/10/21/chartex" xmlns:cx3="http://schemas.microsoft.com/office/drawing/2016/5/9/chartex" xmlns:cx4="http://schemas.microsoft.com/office/drawing/2016/5/10/chartex" xmlns:cx5="http://schemas.microsoft.com/office/drawing/2016/5/11/chartex" xmlns:cx6="http://schemas.microsoft.com/office/drawing/2016/5/12/chartex" xmlns:cx7="http://schemas.microsoft.com/office/drawing/2016/5/13/chartex" xmlns:cx8="http://schemas.microsoft.com/office/drawing/2016/5/14/chartex" xmlns:mc="http://schemas.openxmlformats.org/markup-compatibility/2006" xmlns:aink="http://schemas.microsoft.com/office/drawing/2016/ink" xmlns:am3d="http://schemas.microsoft.com/office/drawing/2017/model3d" xmlns:o="urn:schemas-microsoft-com:office:office" xmlns:oel="http://schemas.microsoft.com/office/2019/extlst" xmlns:r="http://schemas.openxmlformats.org/officeDocument/2006/relationships" xmlns:m="http://schemas.openxmlformats.org/officeDocument/2006/math" xmlns:v="urn:schemas-microsoft-com:vml" xmlns:wp14="http://schemas.microsoft.com/office/word/2010/wordprocessingDrawing" xmlns:wp="http://schemas.openxmlformats.org/drawingml/2006/wordprocessingDrawing" xmlns:w10="urn:schemas-microsoft-com:office:word" xmlns:w="http://schemas.openxmlformats.org/wordprocessingml/2006/main" xmlns:w14="http://schemas.microsoft.com/office/word/2010/wordml" xmlns:w15="http://schemas.microsoft.com/office/word/2012/wordml" xmlns:w16cex="http://schemas.microsoft.com/office/word/2018/wordml/cex" xmlns:w16cid="http://schemas.microsoft.com/office/word/2016/wordml/cid" xmlns:w16="http://schemas.microsoft.com/office/word/2018/wordml" xmlns:w16du="http://schemas.microsoft.com/office/word/2023/wordml/word16du" xmlns:w16sdtdh="http://schemas.microsoft.com/office/word/2020/wordml/sdtdatahash" xmlns:w16se="http://schemas.microsoft.com/office/word/2015/wordml/symex" xmlns:wpg="http://schemas.microsoft.com/office/word/2010/wordprocessingGroup" xmlns:wpi="http://schemas.microsoft.com/office/word/2010/wordprocessingInk" xmlns:wne="http://schemas.microsoft.com/office/word/2006/wordml" xmlns:wps="http://schemas.microsoft.com/office/word/2010/wordprocessingShape" mc:Ignorable="w14 w15 w16se w16cid w16 w16cex w16sdtdh w16du wp14">
   <w:body>
     <w:tbl>
       <w:tblPr>
         <w:tblStyle w:val="TableGrid"/>
-        <w:tblW w:w="11341" w:type="dxa"/>
-        <w:tblInd w:w="-866" w:type="dxa"/>
+        <w:tblW w:w="11625" w:type="dxa"/>
+        <w:tblInd w:w="-1008" w:type="dxa"/>
+        <w:tblLayout w:type="fixed"/>
         <w:tblLook w:val="04A0" w:firstRow="1" w:lastRow="0" w:firstColumn="1" w:lastColumn="0" w:noHBand="0" w:noVBand="1"/>
       </w:tblPr>
       <w:tblGrid>
-        <w:gridCol w:w="11341"/>
+        <w:gridCol w:w="11625"/>
       </w:tblGrid>
       <w:tr>
         <w:trPr>
@@ -18,32 +19,33 @@
         </w:trPr>
         <w:tc>
           <w:tcPr>
-            <w:tcW w:w="11341" w:type="dxa"/>
+            <w:tcW w:w="11625" w:type="dxa"/>
             <w:tcBorders>
-              <w:top w:val="single" w:sz="12" w:space="0" w:color="auto"/>
-              <w:left w:val="single" w:sz="12" w:space="0" w:color="auto"/>
-              <w:bottom w:val="single" w:sz="12" w:space="0" w:color="auto"/>
-              <w:right w:val="single" w:sz="12" w:space="0" w:color="auto"/>
+              <w:top w:val="single" w:color="auto" w:sz="12" w:space="0"/>
+              <w:left w:val="single" w:color="auto" w:sz="12" w:space="0"/>
+              <w:bottom w:val="single" w:color="auto" w:sz="12" w:space="0"/>
+              <w:right w:val="single" w:color="auto" w:sz="12" w:space="0"/>
             </w:tcBorders>
           </w:tcPr>
           <w:tbl>
             <w:tblPr>
               <w:tblStyle w:val="TableGrid"/>
-              <w:tblpPr w:leftFromText="180" w:rightFromText="180" w:vertAnchor="page" w:horzAnchor="margin" w:tblpX="137" w:tblpY="295"/>
+              <w:tblpPr w:leftFromText="180" w:rightFromText="180" w:vertAnchor="page" w:horzAnchor="margin" w:tblpX="132" w:tblpY="295"/>
               <w:tblOverlap w:val="never"/>
               <w:tblW w:w="0" w:type="auto"/>
+              <w:tblLayout w:type="fixed"/>
               <w:tblLook w:val="04A0" w:firstRow="1" w:lastRow="0" w:firstColumn="1" w:lastColumn="0" w:noHBand="0" w:noVBand="1"/>
             </w:tblPr>
             <w:tblGrid>
-              <w:gridCol w:w="1021"/>
-              <w:gridCol w:w="1242"/>
-              <w:gridCol w:w="2410"/>
-              <w:gridCol w:w="231"/>
-              <w:gridCol w:w="1754"/>
-              <w:gridCol w:w="1275"/>
-              <w:gridCol w:w="957"/>
-              <w:gridCol w:w="1028"/>
-              <w:gridCol w:w="956"/>
+              <w:gridCol w:w="1026"/>
+              <w:gridCol w:w="1160"/>
+              <w:gridCol w:w="2209"/>
+              <w:gridCol w:w="185"/>
+              <w:gridCol w:w="1657"/>
+              <w:gridCol w:w="1276"/>
+              <w:gridCol w:w="1186"/>
+              <w:gridCol w:w="1224"/>
+              <w:gridCol w:w="1271"/>
             </w:tblGrid>
             <w:tr>
               <w:trPr>
@@ -57,19 +59,19 @@
                     <w:sz w:val="32"/>
                     <w:szCs w:val="32"/>
                   </w:rPr>
-                  <w:alias w:val="#Nav: /Payment_Schedule2/CompanyName"/>
+                  <w:alias w:val="#Nav: /Payment_Mode2/CompanyName"/>
                   <w:tag w:val="#Nav: PaymentReceipt/50112"/>
-                  <w:id w:val="431400011"/>
+                  <w:id w:val="789013839"/>
                   <w:placeholder>
                     <w:docPart w:val="DefaultPlaceholder_-1854013440"/>
                   </w:placeholder>
-                  <w:dataBinding w:prefixMappings="xmlns:ns0='urn:microsoft-dynamics-nav/reports/PaymentReceipt/50112/'" w:xpath="/ns0:NavWordReportXmlPart[1]/ns0:Payment_Schedule2[1]/ns0:CompanyName[1]" w:storeItemID="{072A5C88-FD1B-4274-ACD9-2C46D19524E4}"/>
+                  <w:dataBinding w:prefixMappings="xmlns:ns0='urn:microsoft-dynamics-nav/reports/PaymentReceipt/50112/'" w:xpath="/ns0:NavWordReportXmlPart[1]/ns0:Payment_Mode2[1]/ns0:CompanyName[1]" w:storeItemID="{072A5C88-FD1B-4274-ACD9-2C46D19524E4}"/>
                   <w:text/>
                 </w:sdtPr>
                 <w:sdtContent>
                   <w:tc>
                     <w:tcPr>
-                      <w:tcW w:w="4904" w:type="dxa"/>
+                      <w:tcW w:w="4580" w:type="dxa"/>
                       <w:gridSpan w:val="4"/>
                       <w:tcBorders>
                         <w:bottom w:val="nil"/>
@@ -77,7 +79,6 @@
                       </w:tcBorders>
                     </w:tcPr>
                     <w:p>
-                      <w:proofErr w:type="spellStart"/>
                       <w:r>
                         <w:rPr>
                           <w:b/>
@@ -87,14 +88,13 @@
                         </w:rPr>
                         <w:t>CompanyName</w:t>
                       </w:r>
-                      <w:proofErr w:type="spellEnd"/>
                     </w:p>
                   </w:tc>
                 </w:sdtContent>
               </w:sdt>
               <w:tc>
                 <w:tcPr>
-                  <w:tcW w:w="5970" w:type="dxa"/>
+                  <w:tcW w:w="6614" w:type="dxa"/>
                   <w:gridSpan w:val="5"/>
                   <w:tcBorders>
                     <w:left w:val="nil"/>
@@ -118,7 +118,7 @@
                       <w:sz w:val="36"/>
                       <w:szCs w:val="36"/>
                     </w:rPr>
-                    <w:t>Tax Invoice</w:t>
+                    <w:t>Payment Receipt</w:t>
                   </w:r>
                 </w:p>
               </w:tc>
@@ -126,19 +126,19 @@
             <w:tr>
               <w:sdt>
                 <w:sdtPr>
-                  <w:alias w:val="#Nav: /Payment_Schedule2/CompanyAddress"/>
+                  <w:alias w:val="#Nav: /Payment_Mode2/CompanyAddress"/>
                   <w:tag w:val="#Nav: PaymentReceipt/50112"/>
-                  <w:id w:val="-1516915951"/>
+                  <w:id w:val="-40833781"/>
                   <w:placeholder>
                     <w:docPart w:val="DefaultPlaceholder_-1854013440"/>
                   </w:placeholder>
-                  <w:dataBinding w:prefixMappings="xmlns:ns0='urn:microsoft-dynamics-nav/reports/PaymentReceipt/50112/'" w:xpath="/ns0:NavWordReportXmlPart[1]/ns0:Payment_Schedule2[1]/ns0:CompanyAddress[1]" w:storeItemID="{072A5C88-FD1B-4274-ACD9-2C46D19524E4}"/>
+                  <w:dataBinding w:prefixMappings="xmlns:ns0='urn:microsoft-dynamics-nav/reports/PaymentReceipt/50112/'" w:xpath="/ns0:NavWordReportXmlPart[1]/ns0:Payment_Mode2[1]/ns0:CompanyAddress[1]" w:storeItemID="{072A5C88-FD1B-4274-ACD9-2C46D19524E4}"/>
                   <w:text/>
                 </w:sdtPr>
                 <w:sdtContent>
                   <w:tc>
                     <w:tcPr>
-                      <w:tcW w:w="4904" w:type="dxa"/>
+                      <w:tcW w:w="4580" w:type="dxa"/>
                       <w:gridSpan w:val="4"/>
                       <w:tcBorders>
                         <w:top w:val="nil"/>
@@ -147,34 +147,32 @@
                       </w:tcBorders>
                     </w:tcPr>
                     <w:p>
-                      <w:proofErr w:type="spellStart"/>
                       <w:r>
                         <w:t>CompanyAddress</w:t>
                       </w:r>
-                      <w:proofErr w:type="spellEnd"/>
                     </w:p>
                   </w:tc>
                 </w:sdtContent>
               </w:sdt>
               <w:sdt>
                 <w:sdtPr>
-                  <w:alias w:val="#Nav: /Payment_Schedule2/CompanyPicture"/>
+                  <w:alias w:val="#Nav: /Payment_Mode2/CompanyPicture"/>
                   <w:tag w:val="#Nav: PaymentReceipt/50112"/>
-                  <w:id w:val="-304463905"/>
-                  <w:dataBinding w:prefixMappings="xmlns:ns0='urn:microsoft-dynamics-nav/reports/PaymentReceipt/50112/'" w:xpath="/ns0:NavWordReportXmlPart[1]/ns0:Payment_Schedule2[1]/ns0:CompanyPicture[1]" w:storeItemID="{072A5C88-FD1B-4274-ACD9-2C46D19524E4}"/>
+                  <w:id w:val="723412771"/>
+                  <w:dataBinding w:prefixMappings="xmlns:ns0='urn:microsoft-dynamics-nav/reports/PaymentReceipt/50112/'" w:xpath="/ns0:NavWordReportXmlPart[1]/ns0:Payment_Mode2[1]/ns0:CompanyPicture[1]" w:storeItemID="{072A5C88-FD1B-4274-ACD9-2C46D19524E4}"/>
                   <w:picture/>
                 </w:sdtPr>
                 <w:sdtContent>
                   <w:tc>
                     <w:tcPr>
-                      <w:tcW w:w="5970" w:type="dxa"/>
+                      <w:tcW w:w="6614" w:type="dxa"/>
                       <w:gridSpan w:val="5"/>
                       <w:vMerge w:val="restart"/>
                       <w:tcBorders>
                         <w:top w:val="nil"/>
                         <w:left w:val="nil"/>
                         <w:bottom w:val="nil"/>
-                        <w:right w:val="single" w:sz="4" w:space="0" w:color="auto"/>
+                        <w:right w:val="single" w:color="auto" w:sz="4" w:space="0"/>
                       </w:tcBorders>
                     </w:tcPr>
                     <w:p>
@@ -186,10 +184,10 @@
                           <w:noProof/>
                         </w:rPr>
                         <w:drawing>
-                          <wp:inline distT="0" distB="0" distL="0" distR="0" wp14:anchorId="7294BF7E" wp14:editId="57417D43">
-                            <wp:extent cx="3573780" cy="975360"/>
-                            <wp:effectExtent l="0" t="0" r="7620" b="0"/>
-                            <wp:docPr id="1" name="Picture 2"/>
+                          <wp:inline distT="0" distB="0" distL="0" distR="0" wp14:anchorId="1339894C" wp14:editId="101453E6">
+                            <wp:extent cx="3467100" cy="944880"/>
+                            <wp:effectExtent l="0" t="0" r="0" b="7620"/>
+                            <wp:docPr id="1481787238" name="Picture 1"/>
                             <wp:cNvGraphicFramePr>
                               <a:graphicFrameLocks xmlns:a="http://schemas.openxmlformats.org/drawingml/2006/main" noChangeAspect="1"/>
                             </wp:cNvGraphicFramePr>
@@ -197,7 +195,7 @@
                               <a:graphicData uri="http://schemas.openxmlformats.org/drawingml/2006/picture">
                                 <pic:pic xmlns:pic="http://schemas.openxmlformats.org/drawingml/2006/picture">
                                   <pic:nvPicPr>
-                                    <pic:cNvPr id="1" name="Picture 2"/>
+                                    <pic:cNvPr id="1481787238" name="Picture 1"/>
                                     <pic:cNvPicPr>
                                       <a:picLocks noChangeAspect="1" noChangeArrowheads="1"/>
                                     </pic:cNvPicPr>
@@ -211,7 +209,7 @@
                                   <pic:spPr bwMode="auto">
                                     <a:xfrm>
                                       <a:off x="0" y="0"/>
-                                      <a:ext cx="3573780" cy="975360"/>
+                                      <a:ext cx="3467100" cy="944880"/>
                                     </a:xfrm>
                                     <a:prstGeom prst="rect">
                                       <a:avLst/>
@@ -235,7 +233,7 @@
             <w:tr>
               <w:tc>
                 <w:tcPr>
-                  <w:tcW w:w="4904" w:type="dxa"/>
+                  <w:tcW w:w="4580" w:type="dxa"/>
                   <w:gridSpan w:val="4"/>
                   <w:tcBorders>
                     <w:top w:val="nil"/>
@@ -246,17 +244,16 @@
                 <w:p>
                   <w:sdt>
                     <w:sdtPr>
-                      <w:alias w:val="#Nav: /Payment_Schedule2/CompanyCity"/>
+                      <w:alias w:val="#Nav: /Payment_Mode2/CompanyCity"/>
                       <w:tag w:val="#Nav: PaymentReceipt/50112"/>
-                      <w:id w:val="-938220110"/>
+                      <w:id w:val="-1331360898"/>
                       <w:placeholder>
                         <w:docPart w:val="DefaultPlaceholder_-1854013440"/>
                       </w:placeholder>
-                      <w:dataBinding w:prefixMappings="xmlns:ns0='urn:microsoft-dynamics-nav/reports/PaymentReceipt/50112/'" w:xpath="/ns0:NavWordReportXmlPart[1]/ns0:Payment_Schedule2[1]/ns0:CompanyCity[1]" w:storeItemID="{072A5C88-FD1B-4274-ACD9-2C46D19524E4}"/>
+                      <w:dataBinding w:prefixMappings="xmlns:ns0='urn:microsoft-dynamics-nav/reports/PaymentReceipt/50112/'" w:xpath="/ns0:NavWordReportXmlPart[1]/ns0:Payment_Mode2[1]/ns0:CompanyCity[1]" w:storeItemID="{072A5C88-FD1B-4274-ACD9-2C46D19524E4}"/>
                       <w:text/>
                     </w:sdtPr>
                     <w:sdtContent>
-                      <w:proofErr w:type="spellStart"/>
                       <w:r>
                         <w:t>CompanyCity</w:t>
                       </w:r>
@@ -267,20 +264,19 @@
                   </w:r>
                   <w:sdt>
                     <w:sdtPr>
-                      <w:alias w:val="#Nav: /Payment_Schedule2/CompanyPostcode"/>
+                      <w:alias w:val="#Nav: /Payment_Mode2/CompanyPostcode"/>
                       <w:tag w:val="#Nav: PaymentReceipt/50112"/>
-                      <w:id w:val="2084868015"/>
+                      <w:id w:val="-847331683"/>
                       <w:placeholder>
                         <w:docPart w:val="DefaultPlaceholder_-1854013440"/>
                       </w:placeholder>
-                      <w:dataBinding w:prefixMappings="xmlns:ns0='urn:microsoft-dynamics-nav/reports/PaymentReceipt/50112/'" w:xpath="/ns0:NavWordReportXmlPart[1]/ns0:Payment_Schedule2[1]/ns0:CompanyPostcode[1]" w:storeItemID="{072A5C88-FD1B-4274-ACD9-2C46D19524E4}"/>
+                      <w:dataBinding w:prefixMappings="xmlns:ns0='urn:microsoft-dynamics-nav/reports/PaymentReceipt/50112/'" w:xpath="/ns0:NavWordReportXmlPart[1]/ns0:Payment_Mode2[1]/ns0:CompanyPostcode[1]" w:storeItemID="{072A5C88-FD1B-4274-ACD9-2C46D19524E4}"/>
                       <w:text/>
                     </w:sdtPr>
                     <w:sdtContent>
                       <w:r>
                         <w:t>CompanyPostcode</w:t>
                       </w:r>
-                      <w:proofErr w:type="spellEnd"/>
                     </w:sdtContent>
                   </w:sdt>
                   <w:r>
@@ -289,37 +285,35 @@
                   <w:r>
                     <w:t>,</w:t>
                   </w:r>
-                  <w:proofErr w:type="spellStart"/>
                   <w:sdt>
                     <w:sdtPr>
-                      <w:alias w:val="#Nav: /Payment_Schedule2/CompanyCountry"/>
+                      <w:alias w:val="#Nav: /Payment_Mode2/CompanyCountry"/>
                       <w:tag w:val="#Nav: PaymentReceipt/50112"/>
-                      <w:id w:val="510571250"/>
+                      <w:id w:val="274830242"/>
                       <w:placeholder>
                         <w:docPart w:val="DefaultPlaceholder_-1854013440"/>
                       </w:placeholder>
-                      <w:dataBinding w:prefixMappings="xmlns:ns0='urn:microsoft-dynamics-nav/reports/PaymentReceipt/50112/'" w:xpath="/ns0:NavWordReportXmlPart[1]/ns0:Payment_Schedule2[1]/ns0:CompanyCountry[1]" w:storeItemID="{072A5C88-FD1B-4274-ACD9-2C46D19524E4}"/>
+                      <w:dataBinding w:prefixMappings="xmlns:ns0='urn:microsoft-dynamics-nav/reports/PaymentReceipt/50112/'" w:xpath="/ns0:NavWordReportXmlPart[1]/ns0:Payment_Mode2[1]/ns0:CompanyCountry[1]" w:storeItemID="{072A5C88-FD1B-4274-ACD9-2C46D19524E4}"/>
                       <w:text/>
                     </w:sdtPr>
                     <w:sdtContent>
                       <w:r>
                         <w:t>CompanyCountry</w:t>
                       </w:r>
-                      <w:proofErr w:type="spellEnd"/>
                     </w:sdtContent>
                   </w:sdt>
                 </w:p>
               </w:tc>
               <w:tc>
                 <w:tcPr>
-                  <w:tcW w:w="5970" w:type="dxa"/>
+                  <w:tcW w:w="6614" w:type="dxa"/>
                   <w:gridSpan w:val="5"/>
                   <w:vMerge/>
                   <w:tcBorders>
                     <w:top w:val="nil"/>
                     <w:left w:val="nil"/>
                     <w:bottom w:val="nil"/>
-                    <w:right w:val="single" w:sz="4" w:space="0" w:color="auto"/>
+                    <w:right w:val="single" w:color="auto" w:sz="4" w:space="0"/>
                   </w:tcBorders>
                 </w:tcPr>
                 <w:p/>
@@ -328,7 +322,7 @@
             <w:tr>
               <w:tc>
                 <w:tcPr>
-                  <w:tcW w:w="4904" w:type="dxa"/>
+                  <w:tcW w:w="4580" w:type="dxa"/>
                   <w:gridSpan w:val="4"/>
                   <w:tcBorders>
                     <w:top w:val="nil"/>
@@ -342,35 +336,33 @@
                   </w:r>
                   <w:sdt>
                     <w:sdtPr>
-                      <w:alias w:val="#Nav: /Payment_Schedule2/CompanyPhone"/>
+                      <w:alias w:val="#Nav: /Payment_Mode2/CompanyPhone"/>
                       <w:tag w:val="#Nav: PaymentReceipt/50112"/>
-                      <w:id w:val="-2121214702"/>
+                      <w:id w:val="1154495664"/>
                       <w:placeholder>
                         <w:docPart w:val="DefaultPlaceholder_-1854013440"/>
                       </w:placeholder>
-                      <w:dataBinding w:prefixMappings="xmlns:ns0='urn:microsoft-dynamics-nav/reports/PaymentReceipt/50112/'" w:xpath="/ns0:NavWordReportXmlPart[1]/ns0:Payment_Schedule2[1]/ns0:CompanyPhone[1]" w:storeItemID="{072A5C88-FD1B-4274-ACD9-2C46D19524E4}"/>
+                      <w:dataBinding w:prefixMappings="xmlns:ns0='urn:microsoft-dynamics-nav/reports/PaymentReceipt/50112/'" w:xpath="/ns0:NavWordReportXmlPart[1]/ns0:Payment_Mode2[1]/ns0:CompanyPhone[1]" w:storeItemID="{072A5C88-FD1B-4274-ACD9-2C46D19524E4}"/>
                       <w:text/>
                     </w:sdtPr>
                     <w:sdtContent>
-                      <w:proofErr w:type="spellStart"/>
                       <w:r>
                         <w:t>CompanyPhone</w:t>
                       </w:r>
-                      <w:proofErr w:type="spellEnd"/>
                     </w:sdtContent>
                   </w:sdt>
                 </w:p>
               </w:tc>
               <w:tc>
                 <w:tcPr>
-                  <w:tcW w:w="5970" w:type="dxa"/>
+                  <w:tcW w:w="6614" w:type="dxa"/>
                   <w:gridSpan w:val="5"/>
                   <w:vMerge/>
                   <w:tcBorders>
                     <w:top w:val="nil"/>
                     <w:left w:val="nil"/>
                     <w:bottom w:val="nil"/>
-                    <w:right w:val="single" w:sz="4" w:space="0" w:color="auto"/>
+                    <w:right w:val="single" w:color="auto" w:sz="4" w:space="0"/>
                   </w:tcBorders>
                 </w:tcPr>
                 <w:p/>
@@ -379,7 +371,7 @@
             <w:tr>
               <w:tc>
                 <w:tcPr>
-                  <w:tcW w:w="4904" w:type="dxa"/>
+                  <w:tcW w:w="4580" w:type="dxa"/>
                   <w:gridSpan w:val="4"/>
                   <w:tcBorders>
                     <w:top w:val="nil"/>
@@ -393,35 +385,33 @@
                   </w:r>
                   <w:sdt>
                     <w:sdtPr>
-                      <w:alias w:val="#Nav: /Payment_Schedule2/CompanyEmail"/>
+                      <w:alias w:val="#Nav: /Payment_Mode2/CompanyEmail"/>
                       <w:tag w:val="#Nav: PaymentReceipt/50112"/>
-                      <w:id w:val="937723549"/>
+                      <w:id w:val="-130862423"/>
                       <w:placeholder>
                         <w:docPart w:val="DefaultPlaceholder_-1854013440"/>
                       </w:placeholder>
-                      <w:dataBinding w:prefixMappings="xmlns:ns0='urn:microsoft-dynamics-nav/reports/PaymentReceipt/50112/'" w:xpath="/ns0:NavWordReportXmlPart[1]/ns0:Payment_Schedule2[1]/ns0:CompanyEmail[1]" w:storeItemID="{072A5C88-FD1B-4274-ACD9-2C46D19524E4}"/>
+                      <w:dataBinding w:prefixMappings="xmlns:ns0='urn:microsoft-dynamics-nav/reports/PaymentReceipt/50112/'" w:xpath="/ns0:NavWordReportXmlPart[1]/ns0:Payment_Mode2[1]/ns0:CompanyEmail[1]" w:storeItemID="{072A5C88-FD1B-4274-ACD9-2C46D19524E4}"/>
                       <w:text/>
                     </w:sdtPr>
                     <w:sdtContent>
-                      <w:proofErr w:type="spellStart"/>
                       <w:r>
                         <w:t>CompanyEmail</w:t>
                       </w:r>
-                      <w:proofErr w:type="spellEnd"/>
                     </w:sdtContent>
                   </w:sdt>
                 </w:p>
               </w:tc>
               <w:tc>
                 <w:tcPr>
-                  <w:tcW w:w="5970" w:type="dxa"/>
+                  <w:tcW w:w="6614" w:type="dxa"/>
                   <w:gridSpan w:val="5"/>
                   <w:vMerge/>
                   <w:tcBorders>
                     <w:top w:val="nil"/>
                     <w:left w:val="nil"/>
                     <w:bottom w:val="nil"/>
-                    <w:right w:val="single" w:sz="4" w:space="0" w:color="auto"/>
+                    <w:right w:val="single" w:color="auto" w:sz="4" w:space="0"/>
                   </w:tcBorders>
                 </w:tcPr>
                 <w:p/>
@@ -430,7 +420,7 @@
             <w:tr>
               <w:tc>
                 <w:tcPr>
-                  <w:tcW w:w="4904" w:type="dxa"/>
+                  <w:tcW w:w="4580" w:type="dxa"/>
                   <w:gridSpan w:val="4"/>
                   <w:tcBorders>
                     <w:top w:val="nil"/>
@@ -446,14 +436,14 @@
               </w:tc>
               <w:tc>
                 <w:tcPr>
-                  <w:tcW w:w="5970" w:type="dxa"/>
+                  <w:tcW w:w="6614" w:type="dxa"/>
                   <w:gridSpan w:val="5"/>
                   <w:vMerge/>
                   <w:tcBorders>
                     <w:top w:val="nil"/>
                     <w:left w:val="nil"/>
                     <w:bottom w:val="nil"/>
-                    <w:right w:val="single" w:sz="4" w:space="0" w:color="auto"/>
+                    <w:right w:val="single" w:color="auto" w:sz="4" w:space="0"/>
                   </w:tcBorders>
                 </w:tcPr>
                 <w:p/>
@@ -462,7 +452,7 @@
             <w:tr>
               <w:tc>
                 <w:tcPr>
-                  <w:tcW w:w="10874" w:type="dxa"/>
+                  <w:tcW w:w="11194" w:type="dxa"/>
                   <w:gridSpan w:val="9"/>
                   <w:tcBorders>
                     <w:top w:val="nil"/>
@@ -474,7 +464,7 @@
             <w:tr>
               <w:tc>
                 <w:tcPr>
-                  <w:tcW w:w="10874" w:type="dxa"/>
+                  <w:tcW w:w="11194" w:type="dxa"/>
                   <w:gridSpan w:val="9"/>
                   <w:tcBorders>
                     <w:bottom w:val="nil"/>
@@ -484,17 +474,20 @@
                   <w:r>
                     <w:t xml:space="preserve">Receipt No: </w:t>
                   </w:r>
+                  <w:r>
+                    <w:t>1</w:t>
+                  </w:r>
                 </w:p>
               </w:tc>
             </w:tr>
             <w:tr>
               <w:tc>
                 <w:tcPr>
-                  <w:tcW w:w="10874" w:type="dxa"/>
+                  <w:tcW w:w="11194" w:type="dxa"/>
                   <w:gridSpan w:val="9"/>
                   <w:tcBorders>
                     <w:top w:val="nil"/>
-                    <w:bottom w:val="single" w:sz="4" w:space="0" w:color="auto"/>
+                    <w:bottom w:val="single" w:color="auto" w:sz="4" w:space="0"/>
                   </w:tcBorders>
                 </w:tcPr>
                 <w:p>
@@ -508,21 +501,19 @@
                   </w:r>
                   <w:sdt>
                     <w:sdtPr>
-                      <w:alias w:val="#Nav: /Payment_Schedule2/CurrentDate"/>
+                      <w:alias w:val="#Nav: /Payment_Mode2/CurrentDate"/>
                       <w:tag w:val="#Nav: PaymentReceipt/50112"/>
-                      <w:id w:val="-1324428750"/>
+                      <w:id w:val="-1709092755"/>
                       <w:placeholder>
                         <w:docPart w:val="DefaultPlaceholder_-1854013440"/>
                       </w:placeholder>
-                      <w:dataBinding w:prefixMappings="xmlns:ns0='urn:microsoft-dynamics-nav/reports/PaymentReceipt/50112/'" w:xpath="/ns0:NavWordReportXmlPart[1]/ns0:Payment_Schedule2[1]/ns0:CurrentDate[1]" w:storeItemID="{072A5C88-FD1B-4274-ACD9-2C46D19524E4}"/>
+                      <w:dataBinding w:prefixMappings="xmlns:ns0='urn:microsoft-dynamics-nav/reports/PaymentReceipt/50112/'" w:xpath="/ns0:NavWordReportXmlPart[1]/ns0:Payment_Mode2[1]/ns0:CurrentDate[1]" w:storeItemID="{072A5C88-FD1B-4274-ACD9-2C46D19524E4}"/>
                       <w:text/>
                     </w:sdtPr>
                     <w:sdtContent>
-                      <w:proofErr w:type="spellStart"/>
                       <w:r>
                         <w:t>CurrentDate</w:t>
                       </w:r>
-                      <w:proofErr w:type="spellEnd"/>
                     </w:sdtContent>
                   </w:sdt>
                 </w:p>
@@ -531,7 +522,7 @@
             <w:tr>
               <w:tc>
                 <w:tcPr>
-                  <w:tcW w:w="10874" w:type="dxa"/>
+                  <w:tcW w:w="11194" w:type="dxa"/>
                   <w:gridSpan w:val="9"/>
                   <w:tcBorders>
                     <w:left w:val="nil"/>
@@ -544,7 +535,7 @@
             <w:tr>
               <w:tc>
                 <w:tcPr>
-                  <w:tcW w:w="10874" w:type="dxa"/>
+                  <w:tcW w:w="11194" w:type="dxa"/>
                   <w:gridSpan w:val="9"/>
                   <w:shd w:val="clear" w:color="auto" w:fill="00B0F0"/>
                 </w:tcPr>
@@ -592,19 +583,19 @@
               </w:trPr>
               <w:sdt>
                 <w:sdtPr>
-                  <w:alias w:val="#Nav: /Payment_Schedule2/Customer/Name"/>
+                  <w:alias w:val="#Nav: /Payment_Mode2/Tenant_Name"/>
                   <w:tag w:val="#Nav: PaymentReceipt/50112"/>
-                  <w:id w:val="-240877835"/>
+                  <w:id w:val="1773817425"/>
                   <w:placeholder>
                     <w:docPart w:val="DefaultPlaceholder_-1854013440"/>
                   </w:placeholder>
-                  <w:dataBinding w:prefixMappings="xmlns:ns0='urn:microsoft-dynamics-nav/reports/PaymentReceipt/50112/'" w:xpath="/ns0:NavWordReportXmlPart[1]/ns0:Payment_Schedule2[1]/ns0:Customer[1]/ns0:Name[1]" w:storeItemID="{072A5C88-FD1B-4274-ACD9-2C46D19524E4}"/>
+                  <w:dataBinding w:prefixMappings="xmlns:ns0='urn:microsoft-dynamics-nav/reports/PaymentReceipt/50112/'" w:xpath="/ns0:NavWordReportXmlPart[1]/ns0:Payment_Mode2[1]/ns0:Tenant_Name[1]" w:storeItemID="{072A5C88-FD1B-4274-ACD9-2C46D19524E4}"/>
                   <w:text/>
                 </w:sdtPr>
                 <w:sdtContent>
                   <w:tc>
                     <w:tcPr>
-                      <w:tcW w:w="4904" w:type="dxa"/>
+                      <w:tcW w:w="4580" w:type="dxa"/>
                       <w:gridSpan w:val="4"/>
                       <w:tcBorders>
                         <w:bottom w:val="nil"/>
@@ -612,7 +603,7 @@
                     </w:tcPr>
                     <w:p>
                       <w:r>
-                        <w:t>Name</w:t>
+                        <w:t>Tenant_Name</w:t>
                       </w:r>
                     </w:p>
                   </w:tc>
@@ -620,7 +611,7 @@
               </w:sdt>
               <w:tc>
                 <w:tcPr>
-                  <w:tcW w:w="5970" w:type="dxa"/>
+                  <w:tcW w:w="6614" w:type="dxa"/>
                   <w:gridSpan w:val="5"/>
                   <w:tcBorders>
                     <w:bottom w:val="nil"/>
@@ -632,21 +623,19 @@
                   </w:r>
                   <w:sdt>
                     <w:sdtPr>
-                      <w:alias w:val="#Nav: /Payment_Schedule2/Contract_ID"/>
+                      <w:alias w:val="#Nav: /Payment_Mode2/Contract_ID"/>
                       <w:tag w:val="#Nav: PaymentReceipt/50112"/>
-                      <w:id w:val="-1512360902"/>
+                      <w:id w:val="-1811244751"/>
                       <w:placeholder>
                         <w:docPart w:val="DefaultPlaceholder_-1854013440"/>
                       </w:placeholder>
-                      <w:dataBinding w:prefixMappings="xmlns:ns0='urn:microsoft-dynamics-nav/reports/PaymentReceipt/50112/'" w:xpath="/ns0:NavWordReportXmlPart[1]/ns0:Payment_Schedule2[1]/ns0:Contract_ID[1]" w:storeItemID="{072A5C88-FD1B-4274-ACD9-2C46D19524E4}"/>
+                      <w:dataBinding w:prefixMappings="xmlns:ns0='urn:microsoft-dynamics-nav/reports/PaymentReceipt/50112/'" w:xpath="/ns0:NavWordReportXmlPart[1]/ns0:Payment_Mode2[1]/ns0:Contract_ID[1]" w:storeItemID="{072A5C88-FD1B-4274-ACD9-2C46D19524E4}"/>
                       <w:text/>
                     </w:sdtPr>
                     <w:sdtContent>
-                      <w:proofErr w:type="spellStart"/>
                       <w:r>
                         <w:t>Contract_ID</w:t>
                       </w:r>
-                      <w:proofErr w:type="spellEnd"/>
                     </w:sdtContent>
                   </w:sdt>
                 </w:p>
@@ -658,19 +647,19 @@
               </w:trPr>
               <w:sdt>
                 <w:sdtPr>
-                  <w:alias w:val="#Nav: /Payment_Schedule2/Customer/E_Mail"/>
+                  <w:alias w:val="#Nav: /Payment_Mode2/Customer/Address"/>
                   <w:tag w:val="#Nav: PaymentReceipt/50112"/>
-                  <w:id w:val="824322987"/>
+                  <w:id w:val="-552774509"/>
                   <w:placeholder>
                     <w:docPart w:val="DefaultPlaceholder_-1854013440"/>
                   </w:placeholder>
-                  <w:dataBinding w:prefixMappings="xmlns:ns0='urn:microsoft-dynamics-nav/reports/PaymentReceipt/50112/'" w:xpath="/ns0:NavWordReportXmlPart[1]/ns0:Payment_Schedule2[1]/ns0:Customer[1]/ns0:E_Mail[1]" w:storeItemID="{072A5C88-FD1B-4274-ACD9-2C46D19524E4}"/>
+                  <w:dataBinding w:prefixMappings="xmlns:ns0='urn:microsoft-dynamics-nav/reports/PaymentReceipt/50112/'" w:xpath="/ns0:NavWordReportXmlPart[1]/ns0:Payment_Mode2[1]/ns0:Customer[1]/ns0:Address[1]" w:storeItemID="{072A5C88-FD1B-4274-ACD9-2C46D19524E4}"/>
                   <w:text/>
                 </w:sdtPr>
                 <w:sdtContent>
                   <w:tc>
                     <w:tcPr>
-                      <w:tcW w:w="4904" w:type="dxa"/>
+                      <w:tcW w:w="4580" w:type="dxa"/>
                       <w:gridSpan w:val="4"/>
                       <w:tcBorders>
                         <w:top w:val="nil"/>
@@ -678,18 +667,16 @@
                       </w:tcBorders>
                     </w:tcPr>
                     <w:p>
-                      <w:proofErr w:type="spellStart"/>
                       <w:r>
-                        <w:t>E_Mail</w:t>
+                        <w:t>Address</w:t>
                       </w:r>
-                      <w:proofErr w:type="spellEnd"/>
                     </w:p>
                   </w:tc>
                 </w:sdtContent>
               </w:sdt>
               <w:tc>
                 <w:tcPr>
-                  <w:tcW w:w="5970" w:type="dxa"/>
+                  <w:tcW w:w="6614" w:type="dxa"/>
                   <w:gridSpan w:val="5"/>
                   <w:tcBorders>
                     <w:top w:val="nil"/>
@@ -702,21 +689,19 @@
                   </w:r>
                   <w:sdt>
                     <w:sdtPr>
-                      <w:alias w:val="#Nav: /Payment_Schedule2/Tenancy_Contract/Property_Name"/>
+                      <w:alias w:val="#Nav: /Payment_Mode2/Tenancy_Contract/Property_Name"/>
                       <w:tag w:val="#Nav: PaymentReceipt/50112"/>
-                      <w:id w:val="-1594079860"/>
+                      <w:id w:val="-318037813"/>
                       <w:placeholder>
                         <w:docPart w:val="DefaultPlaceholder_-1854013440"/>
                       </w:placeholder>
-                      <w:dataBinding w:prefixMappings="xmlns:ns0='urn:microsoft-dynamics-nav/reports/PaymentReceipt/50112/'" w:xpath="/ns0:NavWordReportXmlPart[1]/ns0:Payment_Schedule2[1]/ns0:Tenancy_Contract[1]/ns0:Property_Name[1]" w:storeItemID="{072A5C88-FD1B-4274-ACD9-2C46D19524E4}"/>
+                      <w:dataBinding w:prefixMappings="xmlns:ns0='urn:microsoft-dynamics-nav/reports/PaymentReceipt/50112/'" w:xpath="/ns0:NavWordReportXmlPart[1]/ns0:Payment_Mode2[1]/ns0:Tenancy_Contract[1]/ns0:Property_Name[1]" w:storeItemID="{072A5C88-FD1B-4274-ACD9-2C46D19524E4}"/>
                       <w:text/>
                     </w:sdtPr>
                     <w:sdtContent>
-                      <w:proofErr w:type="spellStart"/>
                       <w:r>
                         <w:t>Property_Name</w:t>
                       </w:r>
-                      <w:proofErr w:type="spellEnd"/>
                     </w:sdtContent>
                   </w:sdt>
                 </w:p>
@@ -728,7 +713,7 @@
               </w:trPr>
               <w:tc>
                 <w:tcPr>
-                  <w:tcW w:w="4904" w:type="dxa"/>
+                  <w:tcW w:w="4580" w:type="dxa"/>
                   <w:gridSpan w:val="4"/>
                   <w:tcBorders>
                     <w:top w:val="nil"/>
@@ -741,23 +726,18 @@
                   </w:r>
                   <w:sdt>
                     <w:sdtPr>
-                      <w:alias w:val="#Nav: /Payment_Schedule2/Customer/Phone_No_"/>
+                      <w:alias w:val="#Nav: /Payment_Mode2/Customer/Phone_No_"/>
                       <w:tag w:val="#Nav: PaymentReceipt/50112"/>
-                      <w:id w:val="497235607"/>
+                      <w:id w:val="130597214"/>
                       <w:placeholder>
                         <w:docPart w:val="DefaultPlaceholder_-1854013440"/>
                       </w:placeholder>
-                      <w:dataBinding w:prefixMappings="xmlns:ns0='urn:microsoft-dynamics-nav/reports/PaymentReceipt/50112/'" w:xpath="/ns0:NavWordReportXmlPart[1]/ns0:Payment_Schedule2[1]/ns0:Customer[1]/ns0:Phone_No_[1]" w:storeItemID="{072A5C88-FD1B-4274-ACD9-2C46D19524E4}"/>
+                      <w:dataBinding w:prefixMappings="xmlns:ns0='urn:microsoft-dynamics-nav/reports/PaymentReceipt/50112/'" w:xpath="/ns0:NavWordReportXmlPart[1]/ns0:Payment_Mode2[1]/ns0:Customer[1]/ns0:Phone_No_[1]" w:storeItemID="{072A5C88-FD1B-4274-ACD9-2C46D19524E4}"/>
                       <w:text/>
                     </w:sdtPr>
                     <w:sdtContent>
-                      <w:proofErr w:type="spellStart"/>
                       <w:r>
-                        <w:t>Phone_No</w:t>
-                      </w:r>
-                      <w:proofErr w:type="spellEnd"/>
-                      <w:r>
-                        <w:t>_</w:t>
+                        <w:t>Phone_No_</w:t>
                       </w:r>
                     </w:sdtContent>
                   </w:sdt>
@@ -765,7 +745,7 @@
               </w:tc>
               <w:tc>
                 <w:tcPr>
-                  <w:tcW w:w="5970" w:type="dxa"/>
+                  <w:tcW w:w="6614" w:type="dxa"/>
                   <w:gridSpan w:val="5"/>
                   <w:tcBorders>
                     <w:top w:val="nil"/>
@@ -778,21 +758,19 @@
                   </w:r>
                   <w:sdt>
                     <w:sdtPr>
-                      <w:alias w:val="#Nav: /Payment_Schedule2/Tenancy_Contract/Unit_Name"/>
+                      <w:alias w:val="#Nav: /Payment_Mode2/Tenancy_Contract/Unit_Name"/>
                       <w:tag w:val="#Nav: PaymentReceipt/50112"/>
-                      <w:id w:val="1123656311"/>
+                      <w:id w:val="-721284586"/>
                       <w:placeholder>
                         <w:docPart w:val="DefaultPlaceholder_-1854013440"/>
                       </w:placeholder>
-                      <w:dataBinding w:prefixMappings="xmlns:ns0='urn:microsoft-dynamics-nav/reports/PaymentReceipt/50112/'" w:xpath="/ns0:NavWordReportXmlPart[1]/ns0:Payment_Schedule2[1]/ns0:Tenancy_Contract[1]/ns0:Unit_Name[1]" w:storeItemID="{072A5C88-FD1B-4274-ACD9-2C46D19524E4}"/>
+                      <w:dataBinding w:prefixMappings="xmlns:ns0='urn:microsoft-dynamics-nav/reports/PaymentReceipt/50112/'" w:xpath="/ns0:NavWordReportXmlPart[1]/ns0:Payment_Mode2[1]/ns0:Tenancy_Contract[1]/ns0:Unit_Name[1]" w:storeItemID="{072A5C88-FD1B-4274-ACD9-2C46D19524E4}"/>
                       <w:text/>
                     </w:sdtPr>
                     <w:sdtContent>
-                      <w:proofErr w:type="spellStart"/>
                       <w:r>
                         <w:t>Unit_Name</w:t>
                       </w:r>
-                      <w:proofErr w:type="spellEnd"/>
                     </w:sdtContent>
                   </w:sdt>
                 </w:p>
@@ -804,7 +782,7 @@
               </w:trPr>
               <w:tc>
                 <w:tcPr>
-                  <w:tcW w:w="4904" w:type="dxa"/>
+                  <w:tcW w:w="4580" w:type="dxa"/>
                   <w:gridSpan w:val="4"/>
                   <w:tcBorders>
                     <w:top w:val="nil"/>
@@ -817,28 +795,26 @@
                   </w:r>
                   <w:sdt>
                     <w:sdtPr>
-                      <w:alias w:val="#Nav: /Payment_Schedule2/Customer/E_Mail"/>
+                      <w:alias w:val="#Nav: /Payment_Mode2/Tenant_Email"/>
                       <w:tag w:val="#Nav: PaymentReceipt/50112"/>
-                      <w:id w:val="937092497"/>
+                      <w:id w:val="-1683736546"/>
                       <w:placeholder>
                         <w:docPart w:val="DefaultPlaceholder_-1854013440"/>
                       </w:placeholder>
-                      <w:dataBinding w:prefixMappings="xmlns:ns0='urn:microsoft-dynamics-nav/reports/PaymentReceipt/50112/'" w:xpath="/ns0:NavWordReportXmlPart[1]/ns0:Payment_Schedule2[1]/ns0:Customer[1]/ns0:E_Mail[1]" w:storeItemID="{072A5C88-FD1B-4274-ACD9-2C46D19524E4}"/>
+                      <w:dataBinding w:prefixMappings="xmlns:ns0='urn:microsoft-dynamics-nav/reports/PaymentReceipt/50112/'" w:xpath="/ns0:NavWordReportXmlPart[1]/ns0:Payment_Mode2[1]/ns0:Tenant_Email[1]" w:storeItemID="{072A5C88-FD1B-4274-ACD9-2C46D19524E4}"/>
                       <w:text/>
                     </w:sdtPr>
                     <w:sdtContent>
-                      <w:proofErr w:type="spellStart"/>
                       <w:r>
-                        <w:t>E_Mail</w:t>
+                        <w:t>Tenant_Email</w:t>
                       </w:r>
-                      <w:proofErr w:type="spellEnd"/>
                     </w:sdtContent>
                   </w:sdt>
                 </w:p>
               </w:tc>
               <w:tc>
                 <w:tcPr>
-                  <w:tcW w:w="5970" w:type="dxa"/>
+                  <w:tcW w:w="6614" w:type="dxa"/>
                   <w:gridSpan w:val="5"/>
                   <w:tcBorders>
                     <w:top w:val="nil"/>
@@ -858,7 +834,7 @@
               </w:trPr>
               <w:tc>
                 <w:tcPr>
-                  <w:tcW w:w="4904" w:type="dxa"/>
+                  <w:tcW w:w="4580" w:type="dxa"/>
                   <w:gridSpan w:val="4"/>
                   <w:tcBorders>
                     <w:top w:val="nil"/>
@@ -872,7 +848,7 @@
               </w:tc>
               <w:tc>
                 <w:tcPr>
-                  <w:tcW w:w="5970" w:type="dxa"/>
+                  <w:tcW w:w="6614" w:type="dxa"/>
                   <w:gridSpan w:val="5"/>
                   <w:tcBorders>
                     <w:top w:val="nil"/>
@@ -884,21 +860,19 @@
                   </w:r>
                   <w:sdt>
                     <w:sdtPr>
-                      <w:alias w:val="#Nav: /Payment_Schedule2/Tenancy_Contract/Contract_Tenor"/>
+                      <w:alias w:val="#Nav: /Payment_Mode2/Tenancy_Contract/Contract_Tenor"/>
                       <w:tag w:val="#Nav: PaymentReceipt/50112"/>
-                      <w:id w:val="-1033952677"/>
+                      <w:id w:val="1482349267"/>
                       <w:placeholder>
                         <w:docPart w:val="DefaultPlaceholder_-1854013440"/>
                       </w:placeholder>
-                      <w:dataBinding w:prefixMappings="xmlns:ns0='urn:microsoft-dynamics-nav/reports/PaymentReceipt/50112/'" w:xpath="/ns0:NavWordReportXmlPart[1]/ns0:Payment_Schedule2[1]/ns0:Tenancy_Contract[1]/ns0:Contract_Tenor[1]" w:storeItemID="{072A5C88-FD1B-4274-ACD9-2C46D19524E4}"/>
+                      <w:dataBinding w:prefixMappings="xmlns:ns0='urn:microsoft-dynamics-nav/reports/PaymentReceipt/50112/'" w:xpath="/ns0:NavWordReportXmlPart[1]/ns0:Payment_Mode2[1]/ns0:Tenancy_Contract[1]/ns0:Contract_Tenor[1]" w:storeItemID="{072A5C88-FD1B-4274-ACD9-2C46D19524E4}"/>
                       <w:text/>
                     </w:sdtPr>
                     <w:sdtContent>
-                      <w:proofErr w:type="spellStart"/>
                       <w:r>
                         <w:t>Contract_Tenor</w:t>
                       </w:r>
-                      <w:proofErr w:type="spellEnd"/>
                     </w:sdtContent>
                   </w:sdt>
                 </w:p>
@@ -910,7 +884,7 @@
               </w:trPr>
               <w:tc>
                 <w:tcPr>
-                  <w:tcW w:w="10874" w:type="dxa"/>
+                  <w:tcW w:w="11194" w:type="dxa"/>
                   <w:gridSpan w:val="9"/>
                 </w:tcPr>
                 <w:p>
@@ -937,7 +911,7 @@
               </w:trPr>
               <w:tc>
                 <w:tcPr>
-                  <w:tcW w:w="1021" w:type="dxa"/>
+                  <w:tcW w:w="1026" w:type="dxa"/>
                   <w:shd w:val="clear" w:color="auto" w:fill="00B0F0"/>
                 </w:tcPr>
                 <w:p>
@@ -958,12 +932,11 @@
               </w:tc>
               <w:tc>
                 <w:tcPr>
-                  <w:tcW w:w="1242" w:type="dxa"/>
+                  <w:tcW w:w="1160" w:type="dxa"/>
                   <w:shd w:val="clear" w:color="auto" w:fill="00B0F0"/>
                 </w:tcPr>
                 <w:p>
                   <w:pPr>
-                    <w:spacing w:before="120"/>
                     <w:rPr>
                       <w:b/>
                       <w:bCs/>
@@ -980,7 +953,7 @@
               </w:tc>
               <w:tc>
                 <w:tcPr>
-                  <w:tcW w:w="2410" w:type="dxa"/>
+                  <w:tcW w:w="2209" w:type="dxa"/>
                   <w:shd w:val="clear" w:color="auto" w:fill="00B0F0"/>
                 </w:tcPr>
                 <w:p>
@@ -1002,7 +975,7 @@
               </w:tc>
               <w:tc>
                 <w:tcPr>
-                  <w:tcW w:w="1985" w:type="dxa"/>
+                  <w:tcW w:w="1842" w:type="dxa"/>
                   <w:gridSpan w:val="2"/>
                   <w:shd w:val="clear" w:color="auto" w:fill="00B0F0"/>
                 </w:tcPr>
@@ -1025,7 +998,7 @@
               </w:tc>
               <w:tc>
                 <w:tcPr>
-                  <w:tcW w:w="1275" w:type="dxa"/>
+                  <w:tcW w:w="1276" w:type="dxa"/>
                   <w:shd w:val="clear" w:color="auto" w:fill="00B0F0"/>
                 </w:tcPr>
                 <w:p>
@@ -1047,7 +1020,7 @@
               </w:tc>
               <w:tc>
                 <w:tcPr>
-                  <w:tcW w:w="957" w:type="dxa"/>
+                  <w:tcW w:w="1186" w:type="dxa"/>
                   <w:shd w:val="clear" w:color="auto" w:fill="00B0F0"/>
                 </w:tcPr>
                 <w:p>
@@ -1070,7 +1043,7 @@
               </w:tc>
               <w:tc>
                 <w:tcPr>
-                  <w:tcW w:w="1028" w:type="dxa"/>
+                  <w:tcW w:w="1224" w:type="dxa"/>
                   <w:shd w:val="clear" w:color="auto" w:fill="00B0F0"/>
                 </w:tcPr>
                 <w:p>
@@ -1092,7 +1065,7 @@
               </w:tc>
               <w:tc>
                 <w:tcPr>
-                  <w:tcW w:w="956" w:type="dxa"/>
+                  <w:tcW w:w="1271" w:type="dxa"/>
                   <w:shd w:val="clear" w:color="auto" w:fill="00B0F0"/>
                 </w:tcPr>
                 <w:p>
@@ -1116,16 +1089,16 @@
             </w:tr>
             <w:sdt>
               <w:sdtPr>
-                <w:alias w:val="#Nav: /Payment_Schedule2/Payment_Mode2"/>
+                <w:alias w:val="#Nav: /Payment_Mode2/Payment_Schedule2"/>
                 <w:tag w:val="#Nav: PaymentReceipt/50112"/>
-                <w:id w:val="552968186"/>
-                <w15:dataBinding w:prefixMappings="xmlns:ns0='urn:microsoft-dynamics-nav/reports/PaymentReceipt/50112/'" w:xpath="/ns0:NavWordReportXmlPart[1]/ns0:Payment_Schedule2[1]/ns0:Payment_Mode2" w:storeItemID="{072A5C88-FD1B-4274-ACD9-2C46D19524E4}"/>
+                <w:id w:val="-836683949"/>
+                <w15:dataBinding w:prefixMappings="xmlns:ns0='urn:microsoft-dynamics-nav/reports/PaymentReceipt/50112/'" w:xpath="/ns0:NavWordReportXmlPart[1]/ns0:Payment_Mode2[1]/ns0:Payment_Schedule2" w:storeItemID="{072A5C88-FD1B-4274-ACD9-2C46D19524E4}"/>
                 <w15:repeatingSection/>
               </w:sdtPr>
               <w:sdtContent>
                 <w:sdt>
                   <w:sdtPr>
-                    <w:id w:val="-653523719"/>
+                    <w:id w:val="-1290043654"/>
                     <w:placeholder>
                       <w:docPart w:val="DefaultPlaceholder_-1854013435"/>
                     </w:placeholder>
@@ -1138,130 +1111,140 @@
                       </w:trPr>
                       <w:sdt>
                         <w:sdtPr>
-                          <w:alias w:val="#Nav: /Payment_Schedule2/Pay_S"/>
+                          <w:alias w:val="#Nav: /Payment_Mode2/Payment_Schedule2/Pay_S"/>
                           <w:tag w:val="#Nav: PaymentReceipt/50112"/>
-                          <w:id w:val="1313445558"/>
+                          <w:id w:val="1502464620"/>
                           <w:placeholder>
                             <w:docPart w:val="DefaultPlaceholder_-1854013440"/>
                           </w:placeholder>
-                          <w:dataBinding w:prefixMappings="xmlns:ns0='urn:microsoft-dynamics-nav/reports/PaymentReceipt/50112/'" w:xpath="/ns0:NavWordReportXmlPart[1]/ns0:Payment_Schedule2[1]/ns0:Pay_S[1]" w:storeItemID="{072A5C88-FD1B-4274-ACD9-2C46D19524E4}"/>
+                          <w:dataBinding w:prefixMappings="xmlns:ns0='urn:microsoft-dynamics-nav/reports/PaymentReceipt/50112/'" w:xpath="/ns0:NavWordReportXmlPart[1]/ns0:Payment_Mode2[1]/ns0:Payment_Schedule2[1]/ns0:Pay_S[1]" w:storeItemID="{072A5C88-FD1B-4274-ACD9-2C46D19524E4}"/>
                           <w:text/>
                         </w:sdtPr>
                         <w:sdtContent>
                           <w:tc>
                             <w:tcPr>
-                              <w:tcW w:w="1021" w:type="dxa"/>
+                              <w:tcW w:w="1026" w:type="dxa"/>
                             </w:tcPr>
                             <w:p>
-                              <w:pPr>
-                                <w:rPr>
-                                  <w:b/>
-                                  <w:bCs/>
-                                </w:rPr>
-                              </w:pPr>
-                              <w:proofErr w:type="spellStart"/>
                               <w:r>
                                 <w:t>Pay_S</w:t>
                               </w:r>
-                              <w:proofErr w:type="spellEnd"/>
                             </w:p>
                           </w:tc>
                         </w:sdtContent>
                       </w:sdt>
                       <w:sdt>
                         <w:sdtPr>
-                          <w:alias w:val="#Nav: /Payment_Schedule2/Invoice_ID"/>
+                          <w:alias w:val="#Nav: /Payment_Mode2/Payment_Schedule2/I_ID"/>
                           <w:tag w:val="#Nav: PaymentReceipt/50112"/>
-                          <w:id w:val="-1471284709"/>
+                          <w:id w:val="2024972826"/>
                           <w:placeholder>
                             <w:docPart w:val="DefaultPlaceholder_-1854013440"/>
                           </w:placeholder>
-                          <w:dataBinding w:prefixMappings="xmlns:ns0='urn:microsoft-dynamics-nav/reports/PaymentReceipt/50112/'" w:xpath="/ns0:NavWordReportXmlPart[1]/ns0:Payment_Schedule2[1]/ns0:Invoice_ID[1]" w:storeItemID="{072A5C88-FD1B-4274-ACD9-2C46D19524E4}"/>
+                          <w:dataBinding w:prefixMappings="xmlns:ns0='urn:microsoft-dynamics-nav/reports/PaymentReceipt/50112/'" w:xpath="/ns0:NavWordReportXmlPart[1]/ns0:Payment_Mode2[1]/ns0:Payment_Schedule2[1]/ns0:I_ID[1]" w:storeItemID="{072A5C88-FD1B-4274-ACD9-2C46D19524E4}"/>
                           <w:text/>
                         </w:sdtPr>
                         <w:sdtContent>
                           <w:tc>
                             <w:tcPr>
-                              <w:tcW w:w="1242" w:type="dxa"/>
+                              <w:tcW w:w="1160" w:type="dxa"/>
                             </w:tcPr>
                             <w:p>
-                              <w:proofErr w:type="spellStart"/>
                               <w:r>
-                                <w:t>Invoice_ID</w:t>
+                                <w:t>I_ID</w:t>
                               </w:r>
-                              <w:proofErr w:type="spellEnd"/>
                             </w:p>
                           </w:tc>
                         </w:sdtContent>
                       </w:sdt>
                       <w:sdt>
                         <w:sdtPr>
-                          <w:alias w:val="#Nav: /Payment_Schedule2/Secondary_Item_Type"/>
+                          <w:alias w:val="#Nav: /Payment_Mode2/Payment_Schedule2/Secondary_Item_Type"/>
                           <w:tag w:val="#Nav: PaymentReceipt/50112"/>
-                          <w:id w:val="-1781252184"/>
+                          <w:id w:val="1294326642"/>
                           <w:placeholder>
                             <w:docPart w:val="DefaultPlaceholder_-1854013440"/>
                           </w:placeholder>
-                          <w:dataBinding w:prefixMappings="xmlns:ns0='urn:microsoft-dynamics-nav/reports/PaymentReceipt/50112/'" w:xpath="/ns0:NavWordReportXmlPart[1]/ns0:Payment_Schedule2[1]/ns0:Secondary_Item_Type[1]" w:storeItemID="{072A5C88-FD1B-4274-ACD9-2C46D19524E4}"/>
+                          <w:dataBinding w:prefixMappings="xmlns:ns0='urn:microsoft-dynamics-nav/reports/PaymentReceipt/50112/'" w:xpath="/ns0:NavWordReportXmlPart[1]/ns0:Payment_Mode2[1]/ns0:Payment_Schedule2[1]/ns0:Secondary_Item_Type[1]" w:storeItemID="{072A5C88-FD1B-4274-ACD9-2C46D19524E4}"/>
                           <w:text/>
                         </w:sdtPr>
                         <w:sdtContent>
                           <w:tc>
                             <w:tcPr>
-                              <w:tcW w:w="2410" w:type="dxa"/>
+                              <w:tcW w:w="2209" w:type="dxa"/>
                             </w:tcPr>
                             <w:p>
-                              <w:proofErr w:type="spellStart"/>
                               <w:r>
                                 <w:t>Secondary_Item_Type</w:t>
                               </w:r>
-                              <w:proofErr w:type="spellEnd"/>
                             </w:p>
                           </w:tc>
                         </w:sdtContent>
                       </w:sdt>
-                      <w:tc>
-                        <w:tcPr>
-                          <w:tcW w:w="1985" w:type="dxa"/>
-                          <w:gridSpan w:val="2"/>
-                        </w:tcPr>
-                        <w:p>
-                          <w:pPr>
-                            <w:rPr>
-                              <w:b/>
-                              <w:bCs/>
-                            </w:rPr>
-                          </w:pPr>
-                        </w:p>
-                      </w:tc>
-                      <w:tc>
-                        <w:tcPr>
-                          <w:tcW w:w="1275" w:type="dxa"/>
-                        </w:tcPr>
-                        <w:p>
-                          <w:pPr>
-                            <w:rPr>
-                              <w:b/>
-                              <w:bCs/>
-                            </w:rPr>
-                          </w:pPr>
-                        </w:p>
-                      </w:tc>
                       <w:sdt>
                         <w:sdtPr>
-                          <w:alias w:val="#Nav: /Payment_Schedule2/Amount"/>
+                          <w:alias w:val="#Nav: /Payment_Mode2/Payment_Schedule2/Pay_M"/>
                           <w:tag w:val="#Nav: PaymentReceipt/50112"/>
-                          <w:id w:val="1180173093"/>
+                          <w:id w:val="2059120581"/>
                           <w:placeholder>
                             <w:docPart w:val="DefaultPlaceholder_-1854013440"/>
                           </w:placeholder>
-                          <w:dataBinding w:prefixMappings="xmlns:ns0='urn:microsoft-dynamics-nav/reports/PaymentReceipt/50112/'" w:xpath="/ns0:NavWordReportXmlPart[1]/ns0:Payment_Schedule2[1]/ns0:Amount[1]" w:storeItemID="{072A5C88-FD1B-4274-ACD9-2C46D19524E4}"/>
+                          <w:dataBinding w:prefixMappings="xmlns:ns0='urn:microsoft-dynamics-nav/reports/PaymentReceipt/50112/'" w:xpath="/ns0:NavWordReportXmlPart[1]/ns0:Payment_Mode2[1]/ns0:Payment_Schedule2[1]/ns0:Pay_M[1]" w:storeItemID="{072A5C88-FD1B-4274-ACD9-2C46D19524E4}"/>
                           <w:text/>
                         </w:sdtPr>
                         <w:sdtContent>
                           <w:tc>
                             <w:tcPr>
-                              <w:tcW w:w="957" w:type="dxa"/>
+                              <w:tcW w:w="1842" w:type="dxa"/>
+                              <w:gridSpan w:val="2"/>
+                            </w:tcPr>
+                            <w:p>
+                              <w:r>
+                                <w:t>Pay_M</w:t>
+                              </w:r>
+                            </w:p>
+                          </w:tc>
+                        </w:sdtContent>
+                      </w:sdt>
+                      <w:sdt>
+                        <w:sdtPr>
+                          <w:alias w:val="#Nav: /Payment_Mode2/Payment_Schedule2/Che_N"/>
+                          <w:tag w:val="#Nav: PaymentReceipt/50112"/>
+                          <w:id w:val="-2016597163"/>
+                          <w:placeholder>
+                            <w:docPart w:val="DefaultPlaceholder_-1854013440"/>
+                          </w:placeholder>
+                          <w:dataBinding w:prefixMappings="xmlns:ns0='urn:microsoft-dynamics-nav/reports/PaymentReceipt/50112/'" w:xpath="/ns0:NavWordReportXmlPart[1]/ns0:Payment_Mode2[1]/ns0:Payment_Schedule2[1]/ns0:Che_N[1]" w:storeItemID="{072A5C88-FD1B-4274-ACD9-2C46D19524E4}"/>
+                          <w:text/>
+                        </w:sdtPr>
+                        <w:sdtContent>
+                          <w:tc>
+                            <w:tcPr>
+                              <w:tcW w:w="1276" w:type="dxa"/>
+                            </w:tcPr>
+                            <w:p>
+                              <w:r>
+                                <w:t>Che_N</w:t>
+                              </w:r>
+                            </w:p>
+                          </w:tc>
+                        </w:sdtContent>
+                      </w:sdt>
+                      <w:sdt>
+                        <w:sdtPr>
+                          <w:alias w:val="#Nav: /Payment_Mode2/Payment_Schedule2/Amount"/>
+                          <w:tag w:val="#Nav: PaymentReceipt/50112"/>
+                          <w:id w:val="-1542742277"/>
+                          <w:placeholder>
+                            <w:docPart w:val="DefaultPlaceholder_-1854013440"/>
+                          </w:placeholder>
+                          <w:dataBinding w:prefixMappings="xmlns:ns0='urn:microsoft-dynamics-nav/reports/PaymentReceipt/50112/'" w:xpath="/ns0:NavWordReportXmlPart[1]/ns0:Payment_Mode2[1]/ns0:Payment_Schedule2[1]/ns0:Amount[1]" w:storeItemID="{072A5C88-FD1B-4274-ACD9-2C46D19524E4}"/>
+                          <w:text/>
+                        </w:sdtPr>
+                        <w:sdtContent>
+                          <w:tc>
+                            <w:tcPr>
+                              <w:tcW w:w="1186" w:type="dxa"/>
                             </w:tcPr>
                             <w:p>
                               <w:pPr>
@@ -1276,26 +1259,26 @@
                       </w:sdt>
                       <w:sdt>
                         <w:sdtPr>
-                          <w:alias w:val="#Nav: /Payment_Schedule2/T_A"/>
+                          <w:alias w:val="#Nav: /Payment_Mode2/Payment_Schedule2/V_A"/>
                           <w:tag w:val="#Nav: PaymentReceipt/50112"/>
-                          <w:id w:val="108629179"/>
+                          <w:id w:val="-196334"/>
                           <w:placeholder>
                             <w:docPart w:val="DefaultPlaceholder_-1854013440"/>
                           </w:placeholder>
-                          <w:dataBinding w:prefixMappings="xmlns:ns0='urn:microsoft-dynamics-nav/reports/PaymentReceipt/50112/'" w:xpath="/ns0:NavWordReportXmlPart[1]/ns0:Payment_Schedule2[1]/ns0:T_A[1]" w:storeItemID="{072A5C88-FD1B-4274-ACD9-2C46D19524E4}"/>
+                          <w:dataBinding w:prefixMappings="xmlns:ns0='urn:microsoft-dynamics-nav/reports/PaymentReceipt/50112/'" w:xpath="/ns0:NavWordReportXmlPart[1]/ns0:Payment_Mode2[1]/ns0:Payment_Schedule2[1]/ns0:V_A[1]" w:storeItemID="{072A5C88-FD1B-4274-ACD9-2C46D19524E4}"/>
                           <w:text/>
                         </w:sdtPr>
                         <w:sdtContent>
                           <w:tc>
                             <w:tcPr>
-                              <w:tcW w:w="1028" w:type="dxa"/>
+                              <w:tcW w:w="1224" w:type="dxa"/>
                             </w:tcPr>
                             <w:p>
                               <w:pPr>
                                 <w:jc w:val="right"/>
                               </w:pPr>
                               <w:r>
-                                <w:t>T_A</w:t>
+                                <w:t>V_A</w:t>
                               </w:r>
                             </w:p>
                           </w:tc>
@@ -1303,30 +1286,26 @@
                       </w:sdt>
                       <w:sdt>
                         <w:sdtPr>
-                          <w:alias w:val="#Nav: /Payment_Schedule2/AIV"/>
+                          <w:alias w:val="#Nav: /Payment_Mode2/Payment_Schedule2/A_I_V"/>
                           <w:tag w:val="#Nav: PaymentReceipt/50112"/>
-                          <w:id w:val="1056592429"/>
+                          <w:id w:val="901331724"/>
                           <w:placeholder>
                             <w:docPart w:val="DefaultPlaceholder_-1854013440"/>
                           </w:placeholder>
-                          <w:dataBinding w:prefixMappings="xmlns:ns0='urn:microsoft-dynamics-nav/reports/PaymentReceipt/50112/'" w:xpath="/ns0:NavWordReportXmlPart[1]/ns0:Payment_Schedule2[1]/ns0:AIV[1]" w:storeItemID="{072A5C88-FD1B-4274-ACD9-2C46D19524E4}"/>
+                          <w:dataBinding w:prefixMappings="xmlns:ns0='urn:microsoft-dynamics-nav/reports/PaymentReceipt/50112/'" w:xpath="/ns0:NavWordReportXmlPart[1]/ns0:Payment_Mode2[1]/ns0:Payment_Schedule2[1]/ns0:A_I_V[1]" w:storeItemID="{072A5C88-FD1B-4274-ACD9-2C46D19524E4}"/>
                           <w:text/>
                         </w:sdtPr>
                         <w:sdtContent>
                           <w:tc>
                             <w:tcPr>
-                              <w:tcW w:w="956" w:type="dxa"/>
+                              <w:tcW w:w="1271" w:type="dxa"/>
                             </w:tcPr>
                             <w:p>
                               <w:pPr>
                                 <w:jc w:val="right"/>
-                                <w:rPr>
-                                  <w:b/>
-                                  <w:bCs/>
-                                </w:rPr>
                               </w:pPr>
                               <w:r>
-                                <w:t>AIV</w:t>
+                                <w:t>A_I_V</w:t>
                               </w:r>
                             </w:p>
                           </w:tc>
@@ -1343,7 +1322,7 @@
               </w:trPr>
               <w:tc>
                 <w:tcPr>
-                  <w:tcW w:w="1021" w:type="dxa"/>
+                  <w:tcW w:w="1026" w:type="dxa"/>
                 </w:tcPr>
                 <w:p>
                   <w:pPr>
@@ -1356,7 +1335,7 @@
               </w:tc>
               <w:tc>
                 <w:tcPr>
-                  <w:tcW w:w="1242" w:type="dxa"/>
+                  <w:tcW w:w="1160" w:type="dxa"/>
                 </w:tcPr>
                 <w:p>
                   <w:pPr>
@@ -1369,7 +1348,7 @@
               </w:tc>
               <w:tc>
                 <w:tcPr>
-                  <w:tcW w:w="2410" w:type="dxa"/>
+                  <w:tcW w:w="2209" w:type="dxa"/>
                 </w:tcPr>
                 <w:p>
                   <w:pPr>
@@ -1389,7 +1368,7 @@
               </w:tc>
               <w:tc>
                 <w:tcPr>
-                  <w:tcW w:w="1985" w:type="dxa"/>
+                  <w:tcW w:w="1842" w:type="dxa"/>
                   <w:gridSpan w:val="2"/>
                 </w:tcPr>
                 <w:p>
@@ -1403,7 +1382,7 @@
               </w:tc>
               <w:tc>
                 <w:tcPr>
-                  <w:tcW w:w="1275" w:type="dxa"/>
+                  <w:tcW w:w="1276" w:type="dxa"/>
                 </w:tcPr>
                 <w:p>
                   <w:pPr>
@@ -1415,48 +1394,123 @@
                   </w:pPr>
                 </w:p>
               </w:tc>
-              <w:tc>
-                <w:tcPr>
-                  <w:tcW w:w="957" w:type="dxa"/>
-                </w:tcPr>
-                <w:p>
-                  <w:pPr>
-                    <w:jc w:val="right"/>
-                    <w:rPr>
-                      <w:b/>
-                      <w:bCs/>
-                    </w:rPr>
-                  </w:pPr>
-                </w:p>
-              </w:tc>
-              <w:tc>
-                <w:tcPr>
-                  <w:tcW w:w="1028" w:type="dxa"/>
-                </w:tcPr>
-                <w:p>
-                  <w:pPr>
-                    <w:jc w:val="right"/>
-                    <w:rPr>
-                      <w:b/>
-                      <w:bCs/>
-                    </w:rPr>
-                  </w:pPr>
-                </w:p>
-              </w:tc>
-              <w:tc>
-                <w:tcPr>
-                  <w:tcW w:w="956" w:type="dxa"/>
-                </w:tcPr>
-                <w:p>
-                  <w:pPr>
-                    <w:jc w:val="right"/>
-                    <w:rPr>
-                      <w:b/>
-                      <w:bCs/>
-                    </w:rPr>
-                  </w:pPr>
-                </w:p>
-              </w:tc>
+              <w:sdt>
+                <w:sdtPr>
+                  <w:rPr>
+                    <w:b/>
+                    <w:bCs/>
+                  </w:rPr>
+                  <w:alias w:val="#Nav: /Payment_Mode2/TotalSection/T_A"/>
+                  <w:tag w:val="#Nav: PaymentReceipt/50112"/>
+                  <w:id w:val="-294147463"/>
+                  <w:placeholder>
+                    <w:docPart w:val="DefaultPlaceholder_-1854013440"/>
+                  </w:placeholder>
+                  <w:dataBinding w:prefixMappings="xmlns:ns0='urn:microsoft-dynamics-nav/reports/PaymentReceipt/50112/'" w:xpath="/ns0:NavWordReportXmlPart[1]/ns0:Payment_Mode2[1]/ns0:TotalSection[1]/ns0:T_A[1]" w:storeItemID="{072A5C88-FD1B-4274-ACD9-2C46D19524E4}"/>
+                  <w:text/>
+                </w:sdtPr>
+                <w:sdtContent>
+                  <w:tc>
+                    <w:tcPr>
+                      <w:tcW w:w="1186" w:type="dxa"/>
+                    </w:tcPr>
+                    <w:p>
+                      <w:pPr>
+                        <w:jc w:val="right"/>
+                        <w:rPr>
+                          <w:b/>
+                          <w:bCs/>
+                        </w:rPr>
+                      </w:pPr>
+                      <w:r>
+                        <w:rPr>
+                          <w:b/>
+                          <w:bCs/>
+                        </w:rPr>
+                        <w:t>T_A</w:t>
+                      </w:r>
+                    </w:p>
+                  </w:tc>
+                </w:sdtContent>
+              </w:sdt>
+              <w:sdt>
+                <w:sdtPr>
+                  <w:rPr>
+                    <w:b/>
+                    <w:bCs/>
+                  </w:rPr>
+                  <w:alias w:val="#Nav: /Payment_Mode2/TotalSection/T_V_A"/>
+                  <w:tag w:val="#Nav: PaymentReceipt/50112"/>
+                  <w:id w:val="-1357878401"/>
+                  <w:placeholder>
+                    <w:docPart w:val="DefaultPlaceholder_-1854013440"/>
+                  </w:placeholder>
+                  <w:dataBinding w:prefixMappings="xmlns:ns0='urn:microsoft-dynamics-nav/reports/PaymentReceipt/50112/'" w:xpath="/ns0:NavWordReportXmlPart[1]/ns0:Payment_Mode2[1]/ns0:TotalSection[1]/ns0:T_V_A[1]" w:storeItemID="{072A5C88-FD1B-4274-ACD9-2C46D19524E4}"/>
+                  <w:text/>
+                </w:sdtPr>
+                <w:sdtContent>
+                  <w:tc>
+                    <w:tcPr>
+                      <w:tcW w:w="1224" w:type="dxa"/>
+                    </w:tcPr>
+                    <w:p>
+                      <w:pPr>
+                        <w:jc w:val="right"/>
+                        <w:rPr>
+                          <w:b/>
+                          <w:bCs/>
+                        </w:rPr>
+                      </w:pPr>
+                      <w:r>
+                        <w:rPr>
+                          <w:b/>
+                          <w:bCs/>
+                        </w:rPr>
+                        <w:t>T_V_A</w:t>
+                      </w:r>
+                    </w:p>
+                  </w:tc>
+                </w:sdtContent>
+              </w:sdt>
+              <w:sdt>
+                <w:sdtPr>
+                  <w:rPr>
+                    <w:b/>
+                    <w:bCs/>
+                  </w:rPr>
+                  <w:alias w:val="#Nav: /Payment_Mode2/TotalSection/T_AIV"/>
+                  <w:tag w:val="#Nav: PaymentReceipt/50112"/>
+                  <w:id w:val="-61257385"/>
+                  <w:placeholder>
+                    <w:docPart w:val="DefaultPlaceholder_-1854013440"/>
+                  </w:placeholder>
+                  <w:dataBinding w:prefixMappings="xmlns:ns0='urn:microsoft-dynamics-nav/reports/PaymentReceipt/50112/'" w:xpath="/ns0:NavWordReportXmlPart[1]/ns0:Payment_Mode2[1]/ns0:TotalSection[1]/ns0:T_AIV[1]" w:storeItemID="{072A5C88-FD1B-4274-ACD9-2C46D19524E4}"/>
+                  <w:text/>
+                </w:sdtPr>
+                <w:sdtContent>
+                  <w:tc>
+                    <w:tcPr>
+                      <w:tcW w:w="1271" w:type="dxa"/>
+                    </w:tcPr>
+                    <w:p>
+                      <w:pPr>
+                        <w:jc w:val="right"/>
+                        <w:rPr>
+                          <w:b/>
+                          <w:bCs/>
+                        </w:rPr>
+                      </w:pPr>
+                      <w:r>
+                        <w:rPr>
+                          <w:b/>
+                          <w:bCs/>
+                        </w:rPr>
+                        <w:t>T_AIV</w:t>
+                      </w:r>
+                    </w:p>
+                  </w:tc>
+                </w:sdtContent>
+              </w:sdt>
             </w:tr>
             <w:tr>
               <w:trPr>
@@ -1464,10 +1518,10 @@
               </w:trPr>
               <w:tc>
                 <w:tcPr>
-                  <w:tcW w:w="10874" w:type="dxa"/>
+                  <w:tcW w:w="11194" w:type="dxa"/>
                   <w:gridSpan w:val="9"/>
                   <w:tcBorders>
-                    <w:bottom w:val="single" w:sz="4" w:space="0" w:color="auto"/>
+                    <w:bottom w:val="single" w:color="auto" w:sz="4" w:space="0"/>
                   </w:tcBorders>
                 </w:tcPr>
                 <w:p>
@@ -1485,14 +1539,31 @@
                     <w:t>Total (In words)</w:t>
                   </w:r>
                 </w:p>
-                <w:p>
-                  <w:pPr>
-                    <w:rPr>
-                      <w:b/>
-                      <w:bCs/>
-                    </w:rPr>
-                  </w:pPr>
-                </w:p>
+                <w:sdt>
+                  <w:sdtPr>
+                    <w:alias w:val="#Nav: /Payment_Mode2/TotalSection/AmountInWords"/>
+                    <w:tag w:val="#Nav: PaymentReceipt/50112"/>
+                    <w:id w:val="-853423224"/>
+                    <w:placeholder>
+                      <w:docPart w:val="DefaultPlaceholder_-1854013440"/>
+                    </w:placeholder>
+                    <w:dataBinding w:prefixMappings="xmlns:ns0='urn:microsoft-dynamics-nav/reports/PaymentReceipt/50112/'" w:xpath="/ns0:NavWordReportXmlPart[1]/ns0:Payment_Mode2[1]/ns0:TotalSection[1]/ns0:AmountInWords[1]" w:storeItemID="{072A5C88-FD1B-4274-ACD9-2C46D19524E4}"/>
+                    <w:text/>
+                  </w:sdtPr>
+                  <w:sdtContent>
+                    <w:p>
+                      <w:pPr>
+                        <w:rPr>
+                          <w:b/>
+                          <w:bCs/>
+                        </w:rPr>
+                      </w:pPr>
+                      <w:r>
+                        <w:t>AmountInWords</w:t>
+                      </w:r>
+                    </w:p>
+                  </w:sdtContent>
+                </w:sdt>
               </w:tc>
             </w:tr>
           </w:tbl>
@@ -1581,7 +1652,7 @@
 </file>
 
 <file path=word/header1.xml><?xml version="1.0" encoding="utf-8"?>
-<w:hdr xmlns:wpc="http://schemas.microsoft.com/office/word/2010/wordprocessingCanvas" xmlns:cx="http://schemas.microsoft.com/office/drawing/2014/chartex" xmlns:cx1="http://schemas.microsoft.com/office/drawing/2015/9/8/chartex" xmlns:cx2="http://schemas.microsoft.com/office/drawing/2015/10/21/chartex" xmlns:cx3="http://schemas.microsoft.com/office/drawing/2016/5/9/chartex" xmlns:cx4="http://schemas.microsoft.com/office/drawing/2016/5/10/chartex" xmlns:cx5="http://schemas.microsoft.com/office/drawing/2016/5/11/chartex" xmlns:cx6="http://schemas.microsoft.com/office/drawing/2016/5/12/chartex" xmlns:cx7="http://schemas.microsoft.com/office/drawing/2016/5/13/chartex" xmlns:cx8="http://schemas.microsoft.com/office/drawing/2016/5/14/chartex" xmlns:mc="http://schemas.openxmlformats.org/markup-compatibility/2006" xmlns:aink="http://schemas.microsoft.com/office/drawing/2016/ink" xmlns:am3d="http://schemas.microsoft.com/office/drawing/2017/model3d" xmlns:o="urn:schemas-microsoft-com:office:office" xmlns:oel="http://schemas.microsoft.com/office/2019/extlst" xmlns:r="http://schemas.openxmlformats.org/officeDocument/2006/relationships" xmlns:m="http://schemas.openxmlformats.org/officeDocument/2006/math" xmlns:v="urn:schemas-microsoft-com:vml" xmlns:wp14="http://schemas.microsoft.com/office/word/2010/wordprocessingDrawing" xmlns:wp="http://schemas.openxmlformats.org/drawingml/2006/wordprocessingDrawing" xmlns:w10="urn:schemas-microsoft-com:office:word" xmlns:w="http://schemas.openxmlformats.org/wordprocessingml/2006/main" xmlns:w14="http://schemas.microsoft.com/office/word/2010/wordml" xmlns:w15="http://schemas.microsoft.com/office/word/2012/wordml" xmlns:w16cex="http://schemas.microsoft.com/office/word/2018/wordml/cex" xmlns:w16cid="http://schemas.microsoft.com/office/word/2016/wordml/cid" xmlns:w16="http://schemas.microsoft.com/office/word/2018/wordml" xmlns:w16du="http://schemas.microsoft.com/office/word/2023/wordml/word16du" xmlns:w16sdtdh="http://schemas.microsoft.com/office/word/2020/wordml/sdtdatahash" xmlns:w16se="http://schemas.microsoft.com/office/word/2015/wordml/symex" xmlns:wpg="http://schemas.microsoft.com/office/word/2010/wordprocessingGroup" xmlns:wpi="http://schemas.microsoft.com/office/word/2010/wordprocessingInk" xmlns:wne="http://schemas.microsoft.com/office/word/2006/wordml" xmlns:wps="http://schemas.microsoft.com/office/word/2010/wordprocessingShape" mc:Ignorable="w14 w15 w16se w16cid w16 w16cex w16sdtdh w16du wp14">
+<w:hdr xmlns:a="http://schemas.openxmlformats.org/drawingml/2006/main" xmlns:wpc="http://schemas.microsoft.com/office/word/2010/wordprocessingCanvas" xmlns:cx="http://schemas.microsoft.com/office/drawing/2014/chartex" xmlns:cx1="http://schemas.microsoft.com/office/drawing/2015/9/8/chartex" xmlns:cx2="http://schemas.microsoft.com/office/drawing/2015/10/21/chartex" xmlns:cx3="http://schemas.microsoft.com/office/drawing/2016/5/9/chartex" xmlns:cx4="http://schemas.microsoft.com/office/drawing/2016/5/10/chartex" xmlns:cx5="http://schemas.microsoft.com/office/drawing/2016/5/11/chartex" xmlns:cx6="http://schemas.microsoft.com/office/drawing/2016/5/12/chartex" xmlns:cx7="http://schemas.microsoft.com/office/drawing/2016/5/13/chartex" xmlns:cx8="http://schemas.microsoft.com/office/drawing/2016/5/14/chartex" xmlns:mc="http://schemas.openxmlformats.org/markup-compatibility/2006" xmlns:aink="http://schemas.microsoft.com/office/drawing/2016/ink" xmlns:am3d="http://schemas.microsoft.com/office/drawing/2017/model3d" xmlns:o="urn:schemas-microsoft-com:office:office" xmlns:oel="http://schemas.microsoft.com/office/2019/extlst" xmlns:r="http://schemas.openxmlformats.org/officeDocument/2006/relationships" xmlns:m="http://schemas.openxmlformats.org/officeDocument/2006/math" xmlns:v="urn:schemas-microsoft-com:vml" xmlns:wp14="http://schemas.microsoft.com/office/word/2010/wordprocessingDrawing" xmlns:wp="http://schemas.openxmlformats.org/drawingml/2006/wordprocessingDrawing" xmlns:w10="urn:schemas-microsoft-com:office:word" xmlns:w="http://schemas.openxmlformats.org/wordprocessingml/2006/main" xmlns:w14="http://schemas.microsoft.com/office/word/2010/wordml" xmlns:w15="http://schemas.microsoft.com/office/word/2012/wordml" xmlns:w16cex="http://schemas.microsoft.com/office/word/2018/wordml/cex" xmlns:w16cid="http://schemas.microsoft.com/office/word/2016/wordml/cid" xmlns:w16="http://schemas.microsoft.com/office/word/2018/wordml" xmlns:w16du="http://schemas.microsoft.com/office/word/2023/wordml/word16du" xmlns:w16sdtdh="http://schemas.microsoft.com/office/word/2020/wordml/sdtdatahash" xmlns:w16se="http://schemas.microsoft.com/office/word/2015/wordml/symex" xmlns:wpg="http://schemas.microsoft.com/office/word/2010/wordprocessingGroup" xmlns:wpi="http://schemas.microsoft.com/office/word/2010/wordprocessingInk" xmlns:wne="http://schemas.microsoft.com/office/word/2006/wordml" xmlns:wps="http://schemas.microsoft.com/office/word/2010/wordprocessingShape" mc:Ignorable="w14 w15 w16se w16cid w16 w16cex w16sdtdh w16du wp14">
   <w:p>
     <w:pPr>
       <w:pStyle w:val="Header"/>
@@ -1594,7 +1665,7 @@
       <mc:AlternateContent>
         <mc:Choice Requires="wps">
           <w:drawing>
-            <wp:anchor distT="45720" distB="45720" distL="114300" distR="114300" simplePos="0" relativeHeight="251659264" behindDoc="0" locked="0" layoutInCell="1" allowOverlap="1" wp14:anchorId="0AC04D7A" wp14:editId="0A6B93C2">
+            <wp:anchor distT="45720" distB="45720" distL="114300" distR="114300" simplePos="0" relativeHeight="251659264" behindDoc="0" locked="0" layoutInCell="1" allowOverlap="1" wp14:editId="0A6B93C2" wp14:anchorId="0AC04D7A">
               <wp:simplePos x="0" y="0"/>
               <wp:positionH relativeFrom="column">
                 <wp:posOffset>3729990</wp:posOffset>
@@ -1655,11 +1726,11 @@
         </mc:Choice>
         <mc:Fallback>
           <w:pict>
-            <v:shapetype w14:anchorId="0AC04D7A" id="_x0000_t202" coordsize="21600,21600" o:spt="202" path="m,l,21600r21600,l21600,xe">
+            <v:shapetype id="_x0000_t202" coordsize="21600,21600" o:spt="202" path="m,l,21600r21600,l21600,xe" w14:anchorId="0AC04D7A">
               <v:stroke joinstyle="miter"/>
               <v:path gradientshapeok="t" o:connecttype="rect"/>
             </v:shapetype>
-            <v:shape id="Text Box 2" o:spid="_x0000_s1026" type="#_x0000_t202" style="position:absolute;left:0;text-align:left;margin-left:293.7pt;margin-top:-18pt;width:237pt;height:58.8pt;z-index:251659264;visibility:visible;mso-wrap-style:square;mso-width-percent:0;mso-height-percent:0;mso-wrap-distance-left:9pt;mso-wrap-distance-top:3.6pt;mso-wrap-distance-right:9pt;mso-wrap-distance-bottom:3.6pt;mso-position-horizontal:absolute;mso-position-horizontal-relative:text;mso-position-vertical:absolute;mso-position-vertical-relative:text;mso-width-percent:0;mso-height-percent:0;mso-width-relative:margin;mso-height-relative:margin;v-text-anchor:top" o:gfxdata="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" stroked="f">
+            <v:shape id="Text Box 2" style="position:absolute;left:0;text-align:left;margin-left:293.7pt;margin-top:-18pt;width:237pt;height:58.8pt;z-index:251659264;visibility:visible;mso-wrap-style:square;mso-width-percent:0;mso-height-percent:0;mso-wrap-distance-left:9pt;mso-wrap-distance-top:3.6pt;mso-wrap-distance-right:9pt;mso-wrap-distance-bottom:3.6pt;mso-position-horizontal:absolute;mso-position-horizontal-relative:text;mso-position-vertical:absolute;mso-position-vertical-relative:text;mso-width-percent:0;mso-height-percent:0;mso-width-relative:margin;mso-height-relative:margin;v-text-anchor:top" o:spid="_x0000_s1026" stroked="f" type="#_x0000_t202" o:gfxdata="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">
               <v:textbox>
                 <w:txbxContent>
                   <w:p/>
@@ -2085,7 +2156,6 @@
   <w:style w:type="character" w:default="1" w:styleId="DefaultParagraphFont">
     <w:name w:val="Default Paragraph Font"/>
     <w:uiPriority w:val="1"/>
-    <w:semiHidden/>
     <w:unhideWhenUsed/>
   </w:style>
   <w:style w:type="table" w:default="1" w:styleId="TableNormal">
@@ -2227,7 +2297,7 @@
         <w:behaviors>
           <w:behavior w:val="content"/>
         </w:behaviors>
-        <w:guid w:val="{21AE90F4-F71E-4201-901B-08FBCD1A247F}"/>
+        <w:guid w:val="{0C04B150-5ACF-4560-BFC6-FD07C98F184F}"/>
       </w:docPartPr>
       <w:docPartBody>
         <w:p>
@@ -2287,39 +2357,120 @@
   <w:rsids>
     <w:rsidRoot w:val="0082134E"/>
     <w:rsid w:val="0001070E"/>
+    <w:rsid w:val="00020009"/>
+    <w:rsid w:val="000210AD"/>
+    <w:rsid w:val="00025579"/>
     <w:rsid w:val="0007544D"/>
+    <w:rsid w:val="000810CE"/>
+    <w:rsid w:val="000A06FE"/>
+    <w:rsid w:val="0010202D"/>
+    <w:rsid w:val="001332D2"/>
     <w:rsid w:val="00134D7D"/>
+    <w:rsid w:val="001910FA"/>
     <w:rsid w:val="00195EA3"/>
+    <w:rsid w:val="001A0803"/>
+    <w:rsid w:val="001B2AC4"/>
+    <w:rsid w:val="001B3532"/>
+    <w:rsid w:val="001F566A"/>
+    <w:rsid w:val="0025510D"/>
+    <w:rsid w:val="00263F70"/>
     <w:rsid w:val="002E3756"/>
     <w:rsid w:val="002E6337"/>
+    <w:rsid w:val="002E7782"/>
+    <w:rsid w:val="00336C38"/>
+    <w:rsid w:val="0037100D"/>
+    <w:rsid w:val="003D7289"/>
     <w:rsid w:val="003F6C20"/>
+    <w:rsid w:val="004066E1"/>
     <w:rsid w:val="004603B6"/>
+    <w:rsid w:val="004802DA"/>
     <w:rsid w:val="004825E1"/>
+    <w:rsid w:val="00483E82"/>
     <w:rsid w:val="004B1E0A"/>
+    <w:rsid w:val="004D4050"/>
+    <w:rsid w:val="00500103"/>
+    <w:rsid w:val="005213F0"/>
+    <w:rsid w:val="00540911"/>
+    <w:rsid w:val="0054559F"/>
     <w:rsid w:val="00563D2B"/>
+    <w:rsid w:val="0056688B"/>
+    <w:rsid w:val="00581A01"/>
+    <w:rsid w:val="005853FF"/>
+    <w:rsid w:val="005C7192"/>
+    <w:rsid w:val="005D6158"/>
+    <w:rsid w:val="005E2F7C"/>
+    <w:rsid w:val="005F29D8"/>
+    <w:rsid w:val="006118DC"/>
+    <w:rsid w:val="00644320"/>
     <w:rsid w:val="00652715"/>
+    <w:rsid w:val="0069184C"/>
+    <w:rsid w:val="006D391B"/>
     <w:rsid w:val="006E0205"/>
+    <w:rsid w:val="00702E7E"/>
     <w:rsid w:val="007258F3"/>
+    <w:rsid w:val="007260D7"/>
+    <w:rsid w:val="00733406"/>
+    <w:rsid w:val="00755EFF"/>
+    <w:rsid w:val="00762902"/>
+    <w:rsid w:val="00783817"/>
+    <w:rsid w:val="00792BD7"/>
+    <w:rsid w:val="0081511A"/>
     <w:rsid w:val="0082134E"/>
+    <w:rsid w:val="00821B9C"/>
     <w:rsid w:val="00852B42"/>
     <w:rsid w:val="00874C9B"/>
+    <w:rsid w:val="00885055"/>
+    <w:rsid w:val="00890DC8"/>
     <w:rsid w:val="008928B5"/>
     <w:rsid w:val="008D21AB"/>
+    <w:rsid w:val="008E2A40"/>
     <w:rsid w:val="008E558E"/>
     <w:rsid w:val="008E6806"/>
+    <w:rsid w:val="00915EFB"/>
+    <w:rsid w:val="00945EDD"/>
     <w:rsid w:val="00947FBA"/>
+    <w:rsid w:val="009B0BD0"/>
+    <w:rsid w:val="009C4C5B"/>
     <w:rsid w:val="009F2EE6"/>
+    <w:rsid w:val="00A240F9"/>
     <w:rsid w:val="00A30B8A"/>
+    <w:rsid w:val="00A71A39"/>
+    <w:rsid w:val="00AD7302"/>
+    <w:rsid w:val="00B04172"/>
+    <w:rsid w:val="00B12D2D"/>
+    <w:rsid w:val="00B35B86"/>
+    <w:rsid w:val="00B551A5"/>
     <w:rsid w:val="00B557C2"/>
+    <w:rsid w:val="00B71BB4"/>
+    <w:rsid w:val="00B7249E"/>
     <w:rsid w:val="00BA4513"/>
     <w:rsid w:val="00BB4AF8"/>
     <w:rsid w:val="00BC1156"/>
+    <w:rsid w:val="00BF0DE8"/>
     <w:rsid w:val="00BF3AE9"/>
     <w:rsid w:val="00C02B33"/>
+    <w:rsid w:val="00C17656"/>
+    <w:rsid w:val="00C374E3"/>
+    <w:rsid w:val="00C55314"/>
+    <w:rsid w:val="00C77BAC"/>
     <w:rsid w:val="00CE70BE"/>
+    <w:rsid w:val="00D1285F"/>
     <w:rsid w:val="00D20B7E"/>
+    <w:rsid w:val="00D352FA"/>
     <w:rsid w:val="00D42304"/>
+    <w:rsid w:val="00DA5563"/>
+    <w:rsid w:val="00DE7F2B"/>
+    <w:rsid w:val="00E02C89"/>
+    <w:rsid w:val="00E0302F"/>
+    <w:rsid w:val="00E0608F"/>
+    <w:rsid w:val="00E17379"/>
+    <w:rsid w:val="00E81339"/>
+    <w:rsid w:val="00E877FE"/>
+    <w:rsid w:val="00E925B0"/>
+    <w:rsid w:val="00F66BB6"/>
     <w:rsid w:val="00F73AC3"/>
+    <w:rsid w:val="00F91A80"/>
+    <w:rsid w:val="00FB0009"/>
     <w:rsid w:val="00FC59D2"/>
     <w:rsid w:val="00FE0C58"/>
   </w:rsids>
@@ -2777,7 +2928,7 @@
     <w:basedOn w:val="DefaultParagraphFont"/>
     <w:uiPriority w:val="99"/>
     <w:semiHidden/>
-    <w:rsid w:val="004B1E0A"/>
+    <w:rsid w:val="00025579"/>
     <w:rPr>
       <w:color w:val="666666"/>
     </w:rPr>
@@ -3089,11 +3240,7 @@
 
 <file path=customXml/item1.xml>��< ? x m l   v e r s i o n = " 1 . 0 "   e n c o d i n g = " u t f - 1 6 " ? > < N a v W o r d R e p o r t X m l P a r t   x m l n s = " u r n : m i c r o s o f t - d y n a m i c s - n a v / r e p o r t s / P a y m e n t R e c e i p t / 5 0 1 1 2 / " >   
-     < P a y m e n t _ S c h e d u l e 2 > - 
-         < A I V > A I V < / A I V > - 
-         < A m o u n t > A m o u n t < / A m o u n t > +     < P a y m e n t _ M o d e 2 >   
          < C o m p a n y A d d r e s s > C o m p a n y A d d r e s s < / C o m p a n y A d d r e s s >   
@@ -3115,22 +3262,46 @@
  
          < C u r r e n t D a t e > C u r r e n t D a t e < / C u r r e n t D a t e >   
-         < I n v o i c e _ I D > I n v o i c e _ I D < / I n v o i c e _ I D > - 
-         < P a y _ S > P a y _ S < / P a y _ S > - 
-         < S e c o n d a r y _ I t e m _ T y p e > S e c o n d a r y _ I t e m _ T y p e < / S e c o n d a r y _ I t e m _ T y p e > - 
-         < T _ A > T _ A < / T _ A > +         < T e n a n t _ E m a i l > T e n a n t _ E m a i l < / T e n a n t _ E m a i l > + 
+         < T e n a n t _ N a m e > T e n a n t _ N a m e < / T e n a n t _ N a m e > + 
+         < P a y m e n t _ S c h e d u l e 2 > + 
+             < A m o u n t > A m o u n t < / A m o u n t > + 
+             < A _ I _ V > A _ I _ V < / A _ I _ V > + 
+             < C h e _ N > C h e _ N < / C h e _ N > + 
+             < I _ I D > I _ I D < / I _ I D > + 
+             < P a y _ M > P a y _ M < / P a y _ M > + 
+             < P a y _ S > P a y _ S < / P a y _ S > + 
+             < S e c o n d a r y _ I t e m _ T y p e > S e c o n d a r y _ I t e m _ T y p e < / S e c o n d a r y _ I t e m _ T y p e > + 
+             < V _ A > V _ A < / V _ A > + 
+         < / P a y m e n t _ S c h e d u l e 2 > + 
+         < T o t a l S e c t i o n > + 
+             < A m o u n t I n W o r d s > A m o u n t I n W o r d s < / A m o u n t I n W o r d s > + 
+             < T _ A > T _ A < / T _ A > + 
+             < T _ A I V > T _ A I V < / T _ A I V > + 
+             < T _ V _ A > T _ V _ A < / T _ V _ A > + 
+         < / T o t a l S e c t i o n >   
          < C u s t o m e r >   
              < A d d r e s s > A d d r e s s < / A d d r e s s >   
-             < E _ M a i l > E _ M a i l < / E _ M a i l > - 
-             < N a m e > N a m e < / N a m e > - 
              < P h o n e _ N o _ > P h o n e _ N o _ < / P h o n e _ N o _ >   
          < / C u s t o m e r > @@ -3145,7 +3316,7 @@
  
          < / T e n a n c y _ C o n t r a c t >   
-     < / P a y m e n t _ S c h e d u l e 2 > +     < / P a y m e n t _ M o d e 2 >   
  < / N a v W o r d R e p o r t X m l P a r t > 
 </file>

</xml_diff>

<commit_message>
Create a termination template and added a some changes in payment receipt
</commit_message>
<xml_diff>
--- a/PaymentReceipt.docx
+++ b/PaymentReceipt.docx
@@ -5,21 +5,21 @@
     <w:tbl>
       <w:tblPr>
         <w:tblStyle w:val="TableGrid"/>
-        <w:tblW w:w="11625" w:type="dxa"/>
-        <w:tblInd w:w="-1008" w:type="dxa"/>
+        <w:tblW w:w="13466" w:type="dxa"/>
+        <w:tblInd w:w="127" w:type="dxa"/>
         <w:tblLayout w:type="fixed"/>
         <w:tblLook w:val="04A0" w:firstRow="1" w:lastRow="0" w:firstColumn="1" w:lastColumn="0" w:noHBand="0" w:noVBand="1"/>
       </w:tblPr>
       <w:tblGrid>
-        <w:gridCol w:w="11625"/>
+        <w:gridCol w:w="13466"/>
       </w:tblGrid>
       <w:tr>
         <w:trPr>
-          <w:trHeight w:val="5738"/>
+          <w:trHeight w:val="8901"/>
         </w:trPr>
         <w:tc>
           <w:tcPr>
-            <w:tcW w:w="11625" w:type="dxa"/>
+            <w:tcW w:w="13466" w:type="dxa"/>
             <w:tcBorders>
               <w:top w:val="single" w:color="auto" w:sz="12" w:space="0"/>
               <w:left w:val="single" w:color="auto" w:sz="12" w:space="0"/>
@@ -30,22 +30,21 @@
           <w:tbl>
             <w:tblPr>
               <w:tblStyle w:val="TableGrid"/>
-              <w:tblpPr w:leftFromText="180" w:rightFromText="180" w:vertAnchor="page" w:horzAnchor="margin" w:tblpX="132" w:tblpY="295"/>
+              <w:tblpPr w:leftFromText="180" w:rightFromText="180" w:vertAnchor="page" w:horzAnchor="margin" w:tblpX="127" w:tblpY="295"/>
               <w:tblOverlap w:val="never"/>
               <w:tblW w:w="0" w:type="auto"/>
               <w:tblLayout w:type="fixed"/>
               <w:tblLook w:val="04A0" w:firstRow="1" w:lastRow="0" w:firstColumn="1" w:lastColumn="0" w:noHBand="0" w:noVBand="1"/>
             </w:tblPr>
             <w:tblGrid>
-              <w:gridCol w:w="1026"/>
-              <w:gridCol w:w="1160"/>
-              <w:gridCol w:w="2209"/>
-              <w:gridCol w:w="185"/>
-              <w:gridCol w:w="1657"/>
+              <w:gridCol w:w="1020"/>
+              <w:gridCol w:w="1810"/>
+              <w:gridCol w:w="3402"/>
+              <w:gridCol w:w="1843"/>
               <w:gridCol w:w="1276"/>
-              <w:gridCol w:w="1186"/>
-              <w:gridCol w:w="1224"/>
-              <w:gridCol w:w="1271"/>
+              <w:gridCol w:w="1134"/>
+              <w:gridCol w:w="1417"/>
+              <w:gridCol w:w="1134"/>
             </w:tblGrid>
             <w:tr>
               <w:trPr>
@@ -71,14 +70,15 @@
                 <w:sdtContent>
                   <w:tc>
                     <w:tcPr>
-                      <w:tcW w:w="4580" w:type="dxa"/>
-                      <w:gridSpan w:val="4"/>
+                      <w:tcW w:w="6232" w:type="dxa"/>
+                      <w:gridSpan w:val="3"/>
                       <w:tcBorders>
                         <w:bottom w:val="nil"/>
                         <w:right w:val="nil"/>
                       </w:tcBorders>
                     </w:tcPr>
                     <w:p>
+                      <w:proofErr w:type="spellStart"/>
                       <w:r>
                         <w:rPr>
                           <w:b/>
@@ -88,13 +88,14 @@
                         </w:rPr>
                         <w:t>CompanyName</w:t>
                       </w:r>
+                      <w:proofErr w:type="spellEnd"/>
                     </w:p>
                   </w:tc>
                 </w:sdtContent>
               </w:sdt>
               <w:tc>
                 <w:tcPr>
-                  <w:tcW w:w="6614" w:type="dxa"/>
+                  <w:tcW w:w="6804" w:type="dxa"/>
                   <w:gridSpan w:val="5"/>
                   <w:tcBorders>
                     <w:left w:val="nil"/>
@@ -103,7 +104,7 @@
                 </w:tcPr>
                 <w:p>
                   <w:pPr>
-                    <w:jc w:val="center"/>
+                    <w:jc w:val="right"/>
                     <w:rPr>
                       <w:b/>
                       <w:bCs/>
@@ -138,8 +139,8 @@
                 <w:sdtContent>
                   <w:tc>
                     <w:tcPr>
-                      <w:tcW w:w="4580" w:type="dxa"/>
-                      <w:gridSpan w:val="4"/>
+                      <w:tcW w:w="6232" w:type="dxa"/>
+                      <w:gridSpan w:val="3"/>
                       <w:tcBorders>
                         <w:top w:val="nil"/>
                         <w:bottom w:val="nil"/>
@@ -147,9 +148,11 @@
                       </w:tcBorders>
                     </w:tcPr>
                     <w:p>
+                      <w:proofErr w:type="spellStart"/>
                       <w:r>
                         <w:t>CompanyAddress</w:t>
                       </w:r>
+                      <w:proofErr w:type="spellEnd"/>
                     </w:p>
                   </w:tc>
                 </w:sdtContent>
@@ -165,7 +168,7 @@
                 <w:sdtContent>
                   <w:tc>
                     <w:tcPr>
-                      <w:tcW w:w="6614" w:type="dxa"/>
+                      <w:tcW w:w="6804" w:type="dxa"/>
                       <w:gridSpan w:val="5"/>
                       <w:vMerge w:val="restart"/>
                       <w:tcBorders>
@@ -177,15 +180,15 @@
                     </w:tcPr>
                     <w:p>
                       <w:pPr>
-                        <w:jc w:val="center"/>
+                        <w:jc w:val="right"/>
                       </w:pPr>
                       <w:r>
                         <w:rPr>
                           <w:noProof/>
                         </w:rPr>
                         <w:drawing>
-                          <wp:inline distT="0" distB="0" distL="0" distR="0" wp14:anchorId="1339894C" wp14:editId="101453E6">
-                            <wp:extent cx="3467100" cy="944880"/>
+                          <wp:inline distT="0" distB="0" distL="0" distR="0" wp14:anchorId="1339894C" wp14:editId="1AC06175">
+                            <wp:extent cx="1600200" cy="944880"/>
                             <wp:effectExtent l="0" t="0" r="0" b="7620"/>
                             <wp:docPr id="1481787238" name="Picture 1"/>
                             <wp:cNvGraphicFramePr>
@@ -209,7 +212,7 @@
                                   <pic:spPr bwMode="auto">
                                     <a:xfrm>
                                       <a:off x="0" y="0"/>
-                                      <a:ext cx="3467100" cy="944880"/>
+                                      <a:ext cx="1600200" cy="944880"/>
                                     </a:xfrm>
                                     <a:prstGeom prst="rect">
                                       <a:avLst/>
@@ -233,8 +236,8 @@
             <w:tr>
               <w:tc>
                 <w:tcPr>
-                  <w:tcW w:w="4580" w:type="dxa"/>
-                  <w:gridSpan w:val="4"/>
+                  <w:tcW w:w="6232" w:type="dxa"/>
+                  <w:gridSpan w:val="3"/>
                   <w:tcBorders>
                     <w:top w:val="nil"/>
                     <w:bottom w:val="nil"/>
@@ -254,6 +257,7 @@
                       <w:text/>
                     </w:sdtPr>
                     <w:sdtContent>
+                      <w:proofErr w:type="spellStart"/>
                       <w:r>
                         <w:t>CompanyCity</w:t>
                       </w:r>
@@ -277,6 +281,7 @@
                       <w:r>
                         <w:t>CompanyPostcode</w:t>
                       </w:r>
+                      <w:proofErr w:type="spellEnd"/>
                     </w:sdtContent>
                   </w:sdt>
                   <w:r>
@@ -285,6 +290,7 @@
                   <w:r>
                     <w:t>,</w:t>
                   </w:r>
+                  <w:proofErr w:type="spellStart"/>
                   <w:sdt>
                     <w:sdtPr>
                       <w:alias w:val="#Nav: /Payment_Mode2/CompanyCountry"/>
@@ -300,13 +306,14 @@
                       <w:r>
                         <w:t>CompanyCountry</w:t>
                       </w:r>
+                      <w:proofErr w:type="spellEnd"/>
                     </w:sdtContent>
                   </w:sdt>
                 </w:p>
               </w:tc>
               <w:tc>
                 <w:tcPr>
-                  <w:tcW w:w="6614" w:type="dxa"/>
+                  <w:tcW w:w="6804" w:type="dxa"/>
                   <w:gridSpan w:val="5"/>
                   <w:vMerge/>
                   <w:tcBorders>
@@ -322,8 +329,8 @@
             <w:tr>
               <w:tc>
                 <w:tcPr>
-                  <w:tcW w:w="4580" w:type="dxa"/>
-                  <w:gridSpan w:val="4"/>
+                  <w:tcW w:w="6232" w:type="dxa"/>
+                  <w:gridSpan w:val="3"/>
                   <w:tcBorders>
                     <w:top w:val="nil"/>
                     <w:bottom w:val="nil"/>
@@ -346,16 +353,18 @@
                       <w:text/>
                     </w:sdtPr>
                     <w:sdtContent>
+                      <w:proofErr w:type="spellStart"/>
                       <w:r>
                         <w:t>CompanyPhone</w:t>
                       </w:r>
+                      <w:proofErr w:type="spellEnd"/>
                     </w:sdtContent>
                   </w:sdt>
                 </w:p>
               </w:tc>
               <w:tc>
                 <w:tcPr>
-                  <w:tcW w:w="6614" w:type="dxa"/>
+                  <w:tcW w:w="6804" w:type="dxa"/>
                   <w:gridSpan w:val="5"/>
                   <w:vMerge/>
                   <w:tcBorders>
@@ -371,8 +380,8 @@
             <w:tr>
               <w:tc>
                 <w:tcPr>
-                  <w:tcW w:w="4580" w:type="dxa"/>
-                  <w:gridSpan w:val="4"/>
+                  <w:tcW w:w="6232" w:type="dxa"/>
+                  <w:gridSpan w:val="3"/>
                   <w:tcBorders>
                     <w:top w:val="nil"/>
                     <w:bottom w:val="nil"/>
@@ -395,16 +404,18 @@
                       <w:text/>
                     </w:sdtPr>
                     <w:sdtContent>
+                      <w:proofErr w:type="spellStart"/>
                       <w:r>
                         <w:t>CompanyEmail</w:t>
                       </w:r>
+                      <w:proofErr w:type="spellEnd"/>
                     </w:sdtContent>
                   </w:sdt>
                 </w:p>
               </w:tc>
               <w:tc>
                 <w:tcPr>
-                  <w:tcW w:w="6614" w:type="dxa"/>
+                  <w:tcW w:w="6804" w:type="dxa"/>
                   <w:gridSpan w:val="5"/>
                   <w:vMerge/>
                   <w:tcBorders>
@@ -420,8 +431,8 @@
             <w:tr>
               <w:tc>
                 <w:tcPr>
-                  <w:tcW w:w="4580" w:type="dxa"/>
-                  <w:gridSpan w:val="4"/>
+                  <w:tcW w:w="6232" w:type="dxa"/>
+                  <w:gridSpan w:val="3"/>
                   <w:tcBorders>
                     <w:top w:val="nil"/>
                     <w:bottom w:val="nil"/>
@@ -436,7 +447,7 @@
               </w:tc>
               <w:tc>
                 <w:tcPr>
-                  <w:tcW w:w="6614" w:type="dxa"/>
+                  <w:tcW w:w="6804" w:type="dxa"/>
                   <w:gridSpan w:val="5"/>
                   <w:vMerge/>
                   <w:tcBorders>
@@ -452,8 +463,8 @@
             <w:tr>
               <w:tc>
                 <w:tcPr>
-                  <w:tcW w:w="11194" w:type="dxa"/>
-                  <w:gridSpan w:val="9"/>
+                  <w:tcW w:w="13036" w:type="dxa"/>
+                  <w:gridSpan w:val="8"/>
                   <w:tcBorders>
                     <w:top w:val="nil"/>
                   </w:tcBorders>
@@ -464,8 +475,8 @@
             <w:tr>
               <w:tc>
                 <w:tcPr>
-                  <w:tcW w:w="11194" w:type="dxa"/>
-                  <w:gridSpan w:val="9"/>
+                  <w:tcW w:w="13036" w:type="dxa"/>
+                  <w:gridSpan w:val="8"/>
                   <w:tcBorders>
                     <w:bottom w:val="nil"/>
                   </w:tcBorders>
@@ -483,8 +494,8 @@
             <w:tr>
               <w:tc>
                 <w:tcPr>
-                  <w:tcW w:w="11194" w:type="dxa"/>
-                  <w:gridSpan w:val="9"/>
+                  <w:tcW w:w="13036" w:type="dxa"/>
+                  <w:gridSpan w:val="8"/>
                   <w:tcBorders>
                     <w:top w:val="nil"/>
                     <w:bottom w:val="single" w:color="auto" w:sz="4" w:space="0"/>
@@ -511,9 +522,11 @@
                       <w:text/>
                     </w:sdtPr>
                     <w:sdtContent>
+                      <w:proofErr w:type="spellStart"/>
                       <w:r>
                         <w:t>CurrentDate</w:t>
                       </w:r>
+                      <w:proofErr w:type="spellEnd"/>
                     </w:sdtContent>
                   </w:sdt>
                 </w:p>
@@ -522,8 +535,8 @@
             <w:tr>
               <w:tc>
                 <w:tcPr>
-                  <w:tcW w:w="11194" w:type="dxa"/>
-                  <w:gridSpan w:val="9"/>
+                  <w:tcW w:w="13036" w:type="dxa"/>
+                  <w:gridSpan w:val="8"/>
                   <w:tcBorders>
                     <w:left w:val="nil"/>
                     <w:right w:val="nil"/>
@@ -535,8 +548,8 @@
             <w:tr>
               <w:tc>
                 <w:tcPr>
-                  <w:tcW w:w="11194" w:type="dxa"/>
-                  <w:gridSpan w:val="9"/>
+                  <w:tcW w:w="13036" w:type="dxa"/>
+                  <w:gridSpan w:val="8"/>
                   <w:shd w:val="clear" w:color="auto" w:fill="00B0F0"/>
                 </w:tcPr>
                 <w:p>
@@ -595,23 +608,25 @@
                 <w:sdtContent>
                   <w:tc>
                     <w:tcPr>
-                      <w:tcW w:w="4580" w:type="dxa"/>
-                      <w:gridSpan w:val="4"/>
+                      <w:tcW w:w="6232" w:type="dxa"/>
+                      <w:gridSpan w:val="3"/>
                       <w:tcBorders>
                         <w:bottom w:val="nil"/>
                       </w:tcBorders>
                     </w:tcPr>
                     <w:p>
+                      <w:proofErr w:type="spellStart"/>
                       <w:r>
                         <w:t>Tenant_Name</w:t>
                       </w:r>
+                      <w:proofErr w:type="spellEnd"/>
                     </w:p>
                   </w:tc>
                 </w:sdtContent>
               </w:sdt>
               <w:tc>
                 <w:tcPr>
-                  <w:tcW w:w="6614" w:type="dxa"/>
+                  <w:tcW w:w="6804" w:type="dxa"/>
                   <w:gridSpan w:val="5"/>
                   <w:tcBorders>
                     <w:bottom w:val="nil"/>
@@ -633,9 +648,11 @@
                       <w:text/>
                     </w:sdtPr>
                     <w:sdtContent>
+                      <w:proofErr w:type="spellStart"/>
                       <w:r>
                         <w:t>Contract_ID</w:t>
                       </w:r>
+                      <w:proofErr w:type="spellEnd"/>
                     </w:sdtContent>
                   </w:sdt>
                 </w:p>
@@ -659,8 +676,8 @@
                 <w:sdtContent>
                   <w:tc>
                     <w:tcPr>
-                      <w:tcW w:w="4580" w:type="dxa"/>
-                      <w:gridSpan w:val="4"/>
+                      <w:tcW w:w="6232" w:type="dxa"/>
+                      <w:gridSpan w:val="3"/>
                       <w:tcBorders>
                         <w:top w:val="nil"/>
                         <w:bottom w:val="nil"/>
@@ -676,7 +693,7 @@
               </w:sdt>
               <w:tc>
                 <w:tcPr>
-                  <w:tcW w:w="6614" w:type="dxa"/>
+                  <w:tcW w:w="6804" w:type="dxa"/>
                   <w:gridSpan w:val="5"/>
                   <w:tcBorders>
                     <w:top w:val="nil"/>
@@ -699,9 +716,11 @@
                       <w:text/>
                     </w:sdtPr>
                     <w:sdtContent>
+                      <w:proofErr w:type="spellStart"/>
                       <w:r>
                         <w:t>Property_Name</w:t>
                       </w:r>
+                      <w:proofErr w:type="spellEnd"/>
                     </w:sdtContent>
                   </w:sdt>
                 </w:p>
@@ -713,8 +732,8 @@
               </w:trPr>
               <w:tc>
                 <w:tcPr>
-                  <w:tcW w:w="4580" w:type="dxa"/>
-                  <w:gridSpan w:val="4"/>
+                  <w:tcW w:w="6232" w:type="dxa"/>
+                  <w:gridSpan w:val="3"/>
                   <w:tcBorders>
                     <w:top w:val="nil"/>
                     <w:bottom w:val="nil"/>
@@ -736,8 +755,13 @@
                       <w:text/>
                     </w:sdtPr>
                     <w:sdtContent>
+                      <w:proofErr w:type="spellStart"/>
                       <w:r>
-                        <w:t>Phone_No_</w:t>
+                        <w:t>Phone_No</w:t>
+                      </w:r>
+                      <w:proofErr w:type="spellEnd"/>
+                      <w:r>
+                        <w:t>_</w:t>
                       </w:r>
                     </w:sdtContent>
                   </w:sdt>
@@ -745,7 +769,7 @@
               </w:tc>
               <w:tc>
                 <w:tcPr>
-                  <w:tcW w:w="6614" w:type="dxa"/>
+                  <w:tcW w:w="6804" w:type="dxa"/>
                   <w:gridSpan w:val="5"/>
                   <w:tcBorders>
                     <w:top w:val="nil"/>
@@ -768,9 +792,11 @@
                       <w:text/>
                     </w:sdtPr>
                     <w:sdtContent>
+                      <w:proofErr w:type="spellStart"/>
                       <w:r>
                         <w:t>Unit_Name</w:t>
                       </w:r>
+                      <w:proofErr w:type="spellEnd"/>
                     </w:sdtContent>
                   </w:sdt>
                 </w:p>
@@ -782,8 +808,8 @@
               </w:trPr>
               <w:tc>
                 <w:tcPr>
-                  <w:tcW w:w="4580" w:type="dxa"/>
-                  <w:gridSpan w:val="4"/>
+                  <w:tcW w:w="6232" w:type="dxa"/>
+                  <w:gridSpan w:val="3"/>
                   <w:tcBorders>
                     <w:top w:val="nil"/>
                     <w:bottom w:val="nil"/>
@@ -805,16 +831,18 @@
                       <w:text/>
                     </w:sdtPr>
                     <w:sdtContent>
+                      <w:proofErr w:type="spellStart"/>
                       <w:r>
                         <w:t>Tenant_Email</w:t>
                       </w:r>
+                      <w:proofErr w:type="spellEnd"/>
                     </w:sdtContent>
                   </w:sdt>
                 </w:p>
               </w:tc>
               <w:tc>
                 <w:tcPr>
-                  <w:tcW w:w="6614" w:type="dxa"/>
+                  <w:tcW w:w="6804" w:type="dxa"/>
                   <w:gridSpan w:val="5"/>
                   <w:tcBorders>
                     <w:top w:val="nil"/>
@@ -825,6 +853,47 @@
                   <w:r>
                     <w:t xml:space="preserve">Contract Period: </w:t>
                   </w:r>
+                  <w:sdt>
+                    <w:sdtPr>
+                      <w:alias w:val="#Nav: /Payment_Mode2/Tenancy_Contract/Contract_Start_Date"/>
+                      <w:tag w:val="#Nav: PaymentReceipt/50112"/>
+                      <w:id w:val="363254955"/>
+                      <w:placeholder>
+                        <w:docPart w:val="DefaultPlaceholder_-1854013440"/>
+                      </w:placeholder>
+                      <w:dataBinding w:prefixMappings="xmlns:ns0='urn:microsoft-dynamics-nav/reports/PaymentReceipt/50112/'" w:xpath="/ns0:NavWordReportXmlPart[1]/ns0:Payment_Mode2[1]/ns0:Tenancy_Contract[1]/ns0:Contract_Start_Date[1]" w:storeItemID="{072A5C88-FD1B-4274-ACD9-2C46D19524E4}"/>
+                      <w:text/>
+                    </w:sdtPr>
+                    <w:sdtContent>
+                      <w:proofErr w:type="spellStart"/>
+                      <w:r>
+                        <w:t>Contract_Start_Date</w:t>
+                      </w:r>
+                      <w:proofErr w:type="spellEnd"/>
+                    </w:sdtContent>
+                  </w:sdt>
+                  <w:r>
+                    <w:t xml:space="preserve"> To </w:t>
+                  </w:r>
+                  <w:sdt>
+                    <w:sdtPr>
+                      <w:alias w:val="#Nav: /Payment_Mode2/Tenancy_Contract/Contract_End_Date"/>
+                      <w:tag w:val="#Nav: PaymentReceipt/50112"/>
+                      <w:id w:val="1667978131"/>
+                      <w:placeholder>
+                        <w:docPart w:val="DefaultPlaceholder_-1854013440"/>
+                      </w:placeholder>
+                      <w:dataBinding w:prefixMappings="xmlns:ns0='urn:microsoft-dynamics-nav/reports/PaymentReceipt/50112/'" w:xpath="/ns0:NavWordReportXmlPart[1]/ns0:Payment_Mode2[1]/ns0:Tenancy_Contract[1]/ns0:Contract_End_Date[1]" w:storeItemID="{072A5C88-FD1B-4274-ACD9-2C46D19524E4}"/>
+                      <w:text/>
+                    </w:sdtPr>
+                    <w:sdtContent>
+                      <w:proofErr w:type="spellStart"/>
+                      <w:r>
+                        <w:t>Contract_End_Date</w:t>
+                      </w:r>
+                      <w:proofErr w:type="spellEnd"/>
+                    </w:sdtContent>
+                  </w:sdt>
                 </w:p>
               </w:tc>
             </w:tr>
@@ -834,8 +903,8 @@
               </w:trPr>
               <w:tc>
                 <w:tcPr>
-                  <w:tcW w:w="4580" w:type="dxa"/>
-                  <w:gridSpan w:val="4"/>
+                  <w:tcW w:w="6232" w:type="dxa"/>
+                  <w:gridSpan w:val="3"/>
                   <w:tcBorders>
                     <w:top w:val="nil"/>
                   </w:tcBorders>
@@ -848,7 +917,7 @@
               </w:tc>
               <w:tc>
                 <w:tcPr>
-                  <w:tcW w:w="6614" w:type="dxa"/>
+                  <w:tcW w:w="6804" w:type="dxa"/>
                   <w:gridSpan w:val="5"/>
                   <w:tcBorders>
                     <w:top w:val="nil"/>
@@ -870,9 +939,11 @@
                       <w:text/>
                     </w:sdtPr>
                     <w:sdtContent>
+                      <w:proofErr w:type="spellStart"/>
                       <w:r>
                         <w:t>Contract_Tenor</w:t>
                       </w:r>
+                      <w:proofErr w:type="spellEnd"/>
                     </w:sdtContent>
                   </w:sdt>
                 </w:p>
@@ -884,8 +955,8 @@
               </w:trPr>
               <w:tc>
                 <w:tcPr>
-                  <w:tcW w:w="11194" w:type="dxa"/>
-                  <w:gridSpan w:val="9"/>
+                  <w:tcW w:w="13036" w:type="dxa"/>
+                  <w:gridSpan w:val="8"/>
                 </w:tcPr>
                 <w:p>
                   <w:pPr>
@@ -911,7 +982,7 @@
               </w:trPr>
               <w:tc>
                 <w:tcPr>
-                  <w:tcW w:w="1026" w:type="dxa"/>
+                  <w:tcW w:w="1020" w:type="dxa"/>
                   <w:shd w:val="clear" w:color="auto" w:fill="00B0F0"/>
                 </w:tcPr>
                 <w:p>
@@ -932,11 +1003,12 @@
               </w:tc>
               <w:tc>
                 <w:tcPr>
-                  <w:tcW w:w="1160" w:type="dxa"/>
+                  <w:tcW w:w="1810" w:type="dxa"/>
                   <w:shd w:val="clear" w:color="auto" w:fill="00B0F0"/>
                 </w:tcPr>
                 <w:p>
                   <w:pPr>
+                    <w:spacing w:before="120"/>
                     <w:rPr>
                       <w:b/>
                       <w:bCs/>
@@ -953,7 +1025,7 @@
               </w:tc>
               <w:tc>
                 <w:tcPr>
-                  <w:tcW w:w="2209" w:type="dxa"/>
+                  <w:tcW w:w="3402" w:type="dxa"/>
                   <w:shd w:val="clear" w:color="auto" w:fill="00B0F0"/>
                 </w:tcPr>
                 <w:p>
@@ -975,8 +1047,7 @@
               </w:tc>
               <w:tc>
                 <w:tcPr>
-                  <w:tcW w:w="1842" w:type="dxa"/>
-                  <w:gridSpan w:val="2"/>
+                  <w:tcW w:w="1843" w:type="dxa"/>
                   <w:shd w:val="clear" w:color="auto" w:fill="00B0F0"/>
                 </w:tcPr>
                 <w:p>
@@ -1020,7 +1091,7 @@
               </w:tc>
               <w:tc>
                 <w:tcPr>
-                  <w:tcW w:w="1186" w:type="dxa"/>
+                  <w:tcW w:w="1134" w:type="dxa"/>
                   <w:shd w:val="clear" w:color="auto" w:fill="00B0F0"/>
                 </w:tcPr>
                 <w:p>
@@ -1043,11 +1114,12 @@
               </w:tc>
               <w:tc>
                 <w:tcPr>
-                  <w:tcW w:w="1224" w:type="dxa"/>
+                  <w:tcW w:w="1417" w:type="dxa"/>
                   <w:shd w:val="clear" w:color="auto" w:fill="00B0F0"/>
                 </w:tcPr>
                 <w:p>
                   <w:pPr>
+                    <w:spacing w:before="120"/>
                     <w:jc w:val="center"/>
                     <w:rPr>
                       <w:b/>
@@ -1065,7 +1137,7 @@
               </w:tc>
               <w:tc>
                 <w:tcPr>
-                  <w:tcW w:w="1271" w:type="dxa"/>
+                  <w:tcW w:w="1134" w:type="dxa"/>
                   <w:shd w:val="clear" w:color="auto" w:fill="00B0F0"/>
                 </w:tcPr>
                 <w:p>
@@ -1123,12 +1195,14 @@
                         <w:sdtContent>
                           <w:tc>
                             <w:tcPr>
-                              <w:tcW w:w="1026" w:type="dxa"/>
+                              <w:tcW w:w="1020" w:type="dxa"/>
                             </w:tcPr>
                             <w:p>
+                              <w:proofErr w:type="spellStart"/>
                               <w:r>
                                 <w:t>Pay_S</w:t>
                               </w:r>
+                              <w:proofErr w:type="spellEnd"/>
                             </w:p>
                           </w:tc>
                         </w:sdtContent>
@@ -1147,7 +1221,7 @@
                         <w:sdtContent>
                           <w:tc>
                             <w:tcPr>
-                              <w:tcW w:w="1160" w:type="dxa"/>
+                              <w:tcW w:w="1810" w:type="dxa"/>
                             </w:tcPr>
                             <w:p>
                               <w:r>
@@ -1171,12 +1245,14 @@
                         <w:sdtContent>
                           <w:tc>
                             <w:tcPr>
-                              <w:tcW w:w="2209" w:type="dxa"/>
+                              <w:tcW w:w="3402" w:type="dxa"/>
                             </w:tcPr>
                             <w:p>
+                              <w:proofErr w:type="spellStart"/>
                               <w:r>
                                 <w:t>Secondary_Item_Type</w:t>
                               </w:r>
+                              <w:proofErr w:type="spellEnd"/>
                             </w:p>
                           </w:tc>
                         </w:sdtContent>
@@ -1195,13 +1271,14 @@
                         <w:sdtContent>
                           <w:tc>
                             <w:tcPr>
-                              <w:tcW w:w="1842" w:type="dxa"/>
-                              <w:gridSpan w:val="2"/>
+                              <w:tcW w:w="1843" w:type="dxa"/>
                             </w:tcPr>
                             <w:p>
+                              <w:proofErr w:type="spellStart"/>
                               <w:r>
                                 <w:t>Pay_M</w:t>
                               </w:r>
+                              <w:proofErr w:type="spellEnd"/>
                             </w:p>
                           </w:tc>
                         </w:sdtContent>
@@ -1223,9 +1300,11 @@
                               <w:tcW w:w="1276" w:type="dxa"/>
                             </w:tcPr>
                             <w:p>
+                              <w:proofErr w:type="spellStart"/>
                               <w:r>
                                 <w:t>Che_N</w:t>
                               </w:r>
+                              <w:proofErr w:type="spellEnd"/>
                             </w:p>
                           </w:tc>
                         </w:sdtContent>
@@ -1244,7 +1323,7 @@
                         <w:sdtContent>
                           <w:tc>
                             <w:tcPr>
-                              <w:tcW w:w="1186" w:type="dxa"/>
+                              <w:tcW w:w="1134" w:type="dxa"/>
                             </w:tcPr>
                             <w:p>
                               <w:pPr>
@@ -1271,7 +1350,7 @@
                         <w:sdtContent>
                           <w:tc>
                             <w:tcPr>
-                              <w:tcW w:w="1224" w:type="dxa"/>
+                              <w:tcW w:w="1417" w:type="dxa"/>
                             </w:tcPr>
                             <w:p>
                               <w:pPr>
@@ -1298,7 +1377,7 @@
                         <w:sdtContent>
                           <w:tc>
                             <w:tcPr>
-                              <w:tcW w:w="1271" w:type="dxa"/>
+                              <w:tcW w:w="1134" w:type="dxa"/>
                             </w:tcPr>
                             <w:p>
                               <w:pPr>
@@ -1322,7 +1401,7 @@
               </w:trPr>
               <w:tc>
                 <w:tcPr>
-                  <w:tcW w:w="1026" w:type="dxa"/>
+                  <w:tcW w:w="1020" w:type="dxa"/>
                 </w:tcPr>
                 <w:p>
                   <w:pPr>
@@ -1335,7 +1414,7 @@
               </w:tc>
               <w:tc>
                 <w:tcPr>
-                  <w:tcW w:w="1160" w:type="dxa"/>
+                  <w:tcW w:w="1810" w:type="dxa"/>
                 </w:tcPr>
                 <w:p>
                   <w:pPr>
@@ -1348,7 +1427,7 @@
               </w:tc>
               <w:tc>
                 <w:tcPr>
-                  <w:tcW w:w="2209" w:type="dxa"/>
+                  <w:tcW w:w="3402" w:type="dxa"/>
                 </w:tcPr>
                 <w:p>
                   <w:pPr>
@@ -1368,8 +1447,7 @@
               </w:tc>
               <w:tc>
                 <w:tcPr>
-                  <w:tcW w:w="1842" w:type="dxa"/>
-                  <w:gridSpan w:val="2"/>
+                  <w:tcW w:w="1843" w:type="dxa"/>
                 </w:tcPr>
                 <w:p>
                   <w:pPr>
@@ -1412,7 +1490,7 @@
                 <w:sdtContent>
                   <w:tc>
                     <w:tcPr>
-                      <w:tcW w:w="1186" w:type="dxa"/>
+                      <w:tcW w:w="1134" w:type="dxa"/>
                     </w:tcPr>
                     <w:p>
                       <w:pPr>
@@ -1451,7 +1529,7 @@
                 <w:sdtContent>
                   <w:tc>
                     <w:tcPr>
-                      <w:tcW w:w="1224" w:type="dxa"/>
+                      <w:tcW w:w="1417" w:type="dxa"/>
                     </w:tcPr>
                     <w:p>
                       <w:pPr>
@@ -1490,7 +1568,7 @@
                 <w:sdtContent>
                   <w:tc>
                     <w:tcPr>
-                      <w:tcW w:w="1271" w:type="dxa"/>
+                      <w:tcW w:w="1134" w:type="dxa"/>
                     </w:tcPr>
                     <w:p>
                       <w:pPr>
@@ -1514,12 +1592,12 @@
             </w:tr>
             <w:tr>
               <w:trPr>
-                <w:trHeight w:val="250"/>
+                <w:trHeight w:val="645"/>
               </w:trPr>
               <w:tc>
                 <w:tcPr>
-                  <w:tcW w:w="11194" w:type="dxa"/>
-                  <w:gridSpan w:val="9"/>
+                  <w:tcW w:w="13036" w:type="dxa"/>
+                  <w:gridSpan w:val="8"/>
                   <w:tcBorders>
                     <w:bottom w:val="single" w:color="auto" w:sz="4" w:space="0"/>
                   </w:tcBorders>
@@ -1558,9 +1636,11 @@
                           <w:bCs/>
                         </w:rPr>
                       </w:pPr>
+                      <w:proofErr w:type="spellStart"/>
                       <w:r>
                         <w:t>AmountInWords</w:t>
                       </w:r>
+                      <w:proofErr w:type="spellEnd"/>
                     </w:p>
                   </w:sdtContent>
                 </w:sdt>
@@ -1592,7 +1672,7 @@
     <w:p/>
     <w:sectPr>
       <w:headerReference w:type="default" r:id="rId9"/>
-      <w:pgSz w:w="11906" w:h="16838" w:code="9"/>
+      <w:pgSz w:w="15840" w:h="24480" w:code="3"/>
       <w:pgMar w:top="1701" w:right="1134" w:bottom="1701" w:left="1134" w:header="708" w:footer="708" w:gutter="0"/>
       <w:cols w:space="708"/>
       <w:docGrid w:linePitch="360"/>
@@ -2156,6 +2236,7 @@
   <w:style w:type="character" w:default="1" w:styleId="DefaultParagraphFont">
     <w:name w:val="Default Paragraph Font"/>
     <w:uiPriority w:val="1"/>
+    <w:semiHidden/>
     <w:unhideWhenUsed/>
   </w:style>
   <w:style w:type="table" w:default="1" w:styleId="TableNormal">
@@ -2364,8 +2445,10 @@
     <w:rsid w:val="000810CE"/>
     <w:rsid w:val="000A06FE"/>
     <w:rsid w:val="0010202D"/>
+    <w:rsid w:val="00121C55"/>
     <w:rsid w:val="001332D2"/>
     <w:rsid w:val="00134D7D"/>
+    <w:rsid w:val="0018784D"/>
     <w:rsid w:val="001910FA"/>
     <w:rsid w:val="00195EA3"/>
     <w:rsid w:val="001A0803"/>
@@ -2374,6 +2457,7 @@
     <w:rsid w:val="001F566A"/>
     <w:rsid w:val="0025510D"/>
     <w:rsid w:val="00263F70"/>
+    <w:rsid w:val="002B75E2"/>
     <w:rsid w:val="002E3756"/>
     <w:rsid w:val="002E6337"/>
     <w:rsid w:val="002E7782"/>
@@ -2401,6 +2485,8 @@
     <w:rsid w:val="005E2F7C"/>
     <w:rsid w:val="005F29D8"/>
     <w:rsid w:val="006118DC"/>
+    <w:rsid w:val="00613C84"/>
+    <w:rsid w:val="006267C1"/>
     <w:rsid w:val="00644320"/>
     <w:rsid w:val="00652715"/>
     <w:rsid w:val="0069184C"/>
@@ -2414,6 +2500,7 @@
     <w:rsid w:val="00762902"/>
     <w:rsid w:val="00783817"/>
     <w:rsid w:val="00792BD7"/>
+    <w:rsid w:val="007B5BAF"/>
     <w:rsid w:val="0081511A"/>
     <w:rsid w:val="0082134E"/>
     <w:rsid w:val="00821B9C"/>
@@ -3308,6 +3395,10 @@
  
          < T e n a n c y _ C o n t r a c t >   
+             < C o n t r a c t _ E n d _ D a t e > C o n t r a c t _ E n d _ D a t e < / C o n t r a c t _ E n d _ D a t e > + 
+             < C o n t r a c t _ S t a r t _ D a t e > C o n t r a c t _ S t a r t _ D a t e < / C o n t r a c t _ S t a r t _ D a t e > + 
              < C o n t r a c t _ T e n o r > C o n t r a c t _ T e n o r < / C o n t r a c t _ T e n o r >   
              < P r o p e r t y _ N a m e > P r o p e r t y _ N a m e < / P r o p e r t y _ N a m e > 
</xml_diff>

<commit_message>
Added a changes in final calculation and settlement
</commit_message>
<xml_diff>
--- a/PaymentReceipt.docx
+++ b/PaymentReceipt.docx
@@ -187,9 +187,9 @@
                           <w:noProof/>
                         </w:rPr>
                         <w:drawing>
-                          <wp:inline distT="0" distB="0" distL="0" distR="0" wp14:anchorId="1339894C" wp14:editId="1AC06175">
-                            <wp:extent cx="1600200" cy="944880"/>
-                            <wp:effectExtent l="0" t="0" r="0" b="7620"/>
+                          <wp:inline distT="0" distB="0" distL="0" distR="0" wp14:anchorId="1339894C" wp14:editId="3733C26C">
+                            <wp:extent cx="944880" cy="944880"/>
+                            <wp:effectExtent l="0" t="0" r="7620" b="7620"/>
                             <wp:docPr id="1481787238" name="Picture 1"/>
                             <wp:cNvGraphicFramePr>
                               <a:graphicFrameLocks xmlns:a="http://schemas.openxmlformats.org/drawingml/2006/main" noChangeAspect="1"/>
@@ -212,7 +212,7 @@
                                   <pic:spPr bwMode="auto">
                                     <a:xfrm>
                                       <a:off x="0" y="0"/>
-                                      <a:ext cx="1600200" cy="944880"/>
+                                      <a:ext cx="944880" cy="944880"/>
                                     </a:xfrm>
                                     <a:prstGeom prst="rect">
                                       <a:avLst/>
@@ -443,6 +443,28 @@
                   <w:r>
                     <w:t>TRN:</w:t>
                   </w:r>
+                  <w:r>
+                    <w:t xml:space="preserve"> </w:t>
+                  </w:r>
+                  <w:sdt>
+                    <w:sdtPr>
+                      <w:alias w:val="#Nav: /Payment_Mode2/CompanyTRN"/>
+                      <w:tag w:val="#Nav: PaymentReceipt/50112"/>
+                      <w:id w:val="-1205018513"/>
+                      <w:placeholder>
+                        <w:docPart w:val="DefaultPlaceholder_-1854013440"/>
+                      </w:placeholder>
+                      <w:dataBinding w:prefixMappings="xmlns:ns0='urn:microsoft-dynamics-nav/reports/PaymentReceipt/50112/'" w:xpath="/ns0:NavWordReportXmlPart[1]/ns0:Payment_Mode2[1]/ns0:CompanyTRN[1]" w:storeItemID="{072A5C88-FD1B-4274-ACD9-2C46D19524E4}"/>
+                      <w:text/>
+                    </w:sdtPr>
+                    <w:sdtContent>
+                      <w:proofErr w:type="spellStart"/>
+                      <w:r>
+                        <w:t>CompanyTRN</w:t>
+                      </w:r>
+                      <w:proofErr w:type="spellEnd"/>
+                    </w:sdtContent>
+                  </w:sdt>
                 </w:p>
               </w:tc>
               <w:tc>
@@ -913,6 +935,25 @@
                   <w:r>
                     <w:t xml:space="preserve">TRN: </w:t>
                   </w:r>
+                  <w:sdt>
+                    <w:sdtPr>
+                      <w:id w:val="2008099593"/>
+                      <w:placeholder>
+                        <w:docPart w:val="DefaultPlaceholder_-1854013440"/>
+                      </w:placeholder>
+                      <w:dataBinding w:prefixMappings="xmlns:ns0='urn:microsoft-dynamics-nav/reports/PaymentReceipt/50112/'" w:xpath="/ns0:NavWordReportXmlPart[1]/ns0:Payment_Mode2[1]/ns0:Customer[1]/ns0:Cus_TRN[1]" w:storeItemID="{072A5C88-FD1B-4274-ACD9-2C46D19524E4}"/>
+                      <w:text/>
+                      <w:alias w:val="#Nav: /Payment_Mode2/Customer/Cus_TRN"/>
+                      <w:tag w:val="#Nav: PaymentReceipt/50112"/>
+                    </w:sdtPr>
+                    <w:sdtContent>
+                      <w:proofErr w:type="spellStart"/>
+                      <w:r>
+                        <w:t>Cus_TRN</w:t>
+                      </w:r>
+                      <w:proofErr w:type="spellEnd"/>
+                    </w:sdtContent>
+                  </w:sdt>
                 </w:p>
               </w:tc>
               <w:tc>
@@ -2461,7 +2502,9 @@
     <w:rsid w:val="002E3756"/>
     <w:rsid w:val="002E6337"/>
     <w:rsid w:val="002E7782"/>
+    <w:rsid w:val="00323BBB"/>
     <w:rsid w:val="00336C38"/>
+    <w:rsid w:val="00361477"/>
     <w:rsid w:val="0037100D"/>
     <w:rsid w:val="003D7289"/>
     <w:rsid w:val="003F6C20"/>
@@ -2514,6 +2557,7 @@
     <w:rsid w:val="008E558E"/>
     <w:rsid w:val="008E6806"/>
     <w:rsid w:val="00915EFB"/>
+    <w:rsid w:val="0092048B"/>
     <w:rsid w:val="00945EDD"/>
     <w:rsid w:val="00947FBA"/>
     <w:rsid w:val="009B0BD0"/>
@@ -2540,6 +2584,7 @@
     <w:rsid w:val="00C374E3"/>
     <w:rsid w:val="00C55314"/>
     <w:rsid w:val="00C77BAC"/>
+    <w:rsid w:val="00CC46D9"/>
     <w:rsid w:val="00CE70BE"/>
     <w:rsid w:val="00D1285F"/>
     <w:rsid w:val="00D20B7E"/>
@@ -3345,6 +3390,8 @@
  
          < C o m p a n y P o s t c o d e > C o m p a n y P o s t c o d e < / C o m p a n y P o s t c o d e >   
+         < C o m p a n y T R N > C o m p a n y T R N < / C o m p a n y T R N > + 
          < C o n t r a c t _ I D > C o n t r a c t _ I D < / C o n t r a c t _ I D >   
          < C u r r e n t D a t e > C u r r e n t D a t e < / C u r r e n t D a t e > @@ -3388,6 +3435,8 @@
          < C u s t o m e r >   
              < A d d r e s s > A d d r e s s < / A d d r e s s > + 
+             < C u s _ T R N > C u s _ T R N < / C u s _ T R N >   
              < P h o n e _ N o _ > P h o n e _ N o _ < / P h o n e _ N o _ >   

</xml_diff>